<commit_message>
feet: ajustes en la creacion de documentos
</commit_message>
<xml_diff>
--- a/public/plantillas/requisicionbienesmayor.docx
+++ b/public/plantillas/requisicionbienesmayor.docx
@@ -104,7 +104,25 @@
                 <w:sz w:val="16"/>
                 <w:szCs w:val="16"/>
               </w:rPr>
-              <w:t>{unidadSolicitante}</w:t>
+              <w:t>{</w:t>
+            </w:r>
+            <w:proofErr w:type="spellStart"/>
+            <w:r>
+              <w:rPr>
+                <w:rFonts w:ascii="Arial" w:hAnsi="Arial" w:cs="Arial"/>
+                <w:sz w:val="16"/>
+                <w:szCs w:val="16"/>
+              </w:rPr>
+              <w:t>unidadSolicitante</w:t>
+            </w:r>
+            <w:proofErr w:type="spellEnd"/>
+            <w:r>
+              <w:rPr>
+                <w:rFonts w:ascii="Arial" w:hAnsi="Arial" w:cs="Arial"/>
+                <w:sz w:val="16"/>
+                <w:szCs w:val="16"/>
+              </w:rPr>
+              <w:t>}</w:t>
             </w:r>
           </w:p>
         </w:tc>
@@ -194,7 +212,25 @@
                 <w:sz w:val="16"/>
                 <w:szCs w:val="16"/>
               </w:rPr>
-              <w:t>{nombreSolicitante}</w:t>
+              <w:t>{</w:t>
+            </w:r>
+            <w:proofErr w:type="spellStart"/>
+            <w:r>
+              <w:rPr>
+                <w:rFonts w:ascii="Arial" w:hAnsi="Arial" w:cs="Arial"/>
+                <w:sz w:val="16"/>
+                <w:szCs w:val="16"/>
+              </w:rPr>
+              <w:t>nombreSolicitante</w:t>
+            </w:r>
+            <w:proofErr w:type="spellEnd"/>
+            <w:r>
+              <w:rPr>
+                <w:rFonts w:ascii="Arial" w:hAnsi="Arial" w:cs="Arial"/>
+                <w:sz w:val="16"/>
+                <w:szCs w:val="16"/>
+              </w:rPr>
+              <w:t>}</w:t>
             </w:r>
           </w:p>
         </w:tc>
@@ -259,7 +295,25 @@
                 <w:sz w:val="16"/>
                 <w:szCs w:val="16"/>
               </w:rPr>
-              <w:t>{cargoSolicitante}</w:t>
+              <w:t>{</w:t>
+            </w:r>
+            <w:proofErr w:type="spellStart"/>
+            <w:r>
+              <w:rPr>
+                <w:rFonts w:ascii="Arial" w:hAnsi="Arial" w:cs="Arial"/>
+                <w:sz w:val="16"/>
+                <w:szCs w:val="16"/>
+              </w:rPr>
+              <w:t>cargoSolicitante</w:t>
+            </w:r>
+            <w:proofErr w:type="spellEnd"/>
+            <w:r>
+              <w:rPr>
+                <w:rFonts w:ascii="Arial" w:hAnsi="Arial" w:cs="Arial"/>
+                <w:sz w:val="16"/>
+                <w:szCs w:val="16"/>
+              </w:rPr>
+              <w:t>}</w:t>
             </w:r>
           </w:p>
         </w:tc>
@@ -324,7 +378,25 @@
                 <w:sz w:val="16"/>
                 <w:szCs w:val="16"/>
               </w:rPr>
-              <w:t>{fechaSolicitud}</w:t>
+              <w:t>{</w:t>
+            </w:r>
+            <w:proofErr w:type="spellStart"/>
+            <w:r>
+              <w:rPr>
+                <w:rFonts w:ascii="Arial" w:hAnsi="Arial" w:cs="Arial"/>
+                <w:sz w:val="16"/>
+                <w:szCs w:val="16"/>
+              </w:rPr>
+              <w:t>fechaSolicitud</w:t>
+            </w:r>
+            <w:proofErr w:type="spellEnd"/>
+            <w:r>
+              <w:rPr>
+                <w:rFonts w:ascii="Arial" w:hAnsi="Arial" w:cs="Arial"/>
+                <w:sz w:val="16"/>
+                <w:szCs w:val="16"/>
+              </w:rPr>
+              <w:t>}</w:t>
             </w:r>
           </w:p>
         </w:tc>
@@ -416,6 +488,7 @@
               </w:rPr>
               <w:t>{</w:t>
             </w:r>
+            <w:proofErr w:type="spellStart"/>
             <w:r>
               <w:rPr>
                 <w:rFonts w:ascii="Arial" w:eastAsia="Arial" w:hAnsi="Arial" w:cs="Arial"/>
@@ -424,6 +497,7 @@
               </w:rPr>
               <w:t>caracterProcedimiento</w:t>
             </w:r>
+            <w:proofErr w:type="spellEnd"/>
             <w:r>
               <w:rPr>
                 <w:rFonts w:ascii="Arial" w:eastAsia="Arial" w:hAnsi="Arial" w:cs="Arial"/>
@@ -522,6 +596,7 @@
               </w:rPr>
               <w:t>{</w:t>
             </w:r>
+            <w:proofErr w:type="spellStart"/>
             <w:r>
               <w:rPr>
                 <w:rFonts w:ascii="Arial" w:eastAsia="Arial" w:hAnsi="Arial" w:cs="Arial"/>
@@ -530,6 +605,7 @@
               </w:rPr>
               <w:t>modalidadContratacion</w:t>
             </w:r>
+            <w:proofErr w:type="spellEnd"/>
             <w:r>
               <w:rPr>
                 <w:rFonts w:ascii="Arial" w:eastAsia="Arial" w:hAnsi="Arial" w:cs="Arial"/>
@@ -603,6 +679,7 @@
               </w:rPr>
               <w:t>{</w:t>
             </w:r>
+            <w:proofErr w:type="spellStart"/>
             <w:r>
               <w:rPr>
                 <w:rFonts w:ascii="Arial" w:eastAsia="Arial" w:hAnsi="Arial" w:cs="Arial"/>
@@ -611,6 +688,7 @@
               </w:rPr>
               <w:t>presupuestoAutorizado</w:t>
             </w:r>
+            <w:proofErr w:type="spellEnd"/>
             <w:r>
               <w:rPr>
                 <w:rFonts w:ascii="Arial" w:eastAsia="Arial" w:hAnsi="Arial" w:cs="Arial"/>
@@ -707,7 +785,16 @@
                 <w:sz w:val="16"/>
                 <w:szCs w:val="16"/>
               </w:rPr>
-              <w:t>{c</w:t>
+              <w:t>{</w:t>
+            </w:r>
+            <w:proofErr w:type="spellStart"/>
+            <w:r>
+              <w:rPr>
+                <w:rFonts w:ascii="Arial" w:eastAsia="Arial" w:hAnsi="Arial" w:cs="Arial"/>
+                <w:sz w:val="16"/>
+                <w:szCs w:val="16"/>
+              </w:rPr>
+              <w:t>c</w:t>
             </w:r>
             <w:r>
               <w:rPr>
@@ -723,7 +810,16 @@
                 <w:sz w:val="16"/>
                 <w:szCs w:val="16"/>
               </w:rPr>
-              <w:t>l}</w:t>
+              <w:t>l</w:t>
+            </w:r>
+            <w:proofErr w:type="spellEnd"/>
+            <w:r>
+              <w:rPr>
+                <w:rFonts w:ascii="Arial" w:eastAsia="Arial" w:hAnsi="Arial" w:cs="Arial"/>
+                <w:sz w:val="16"/>
+                <w:szCs w:val="16"/>
+              </w:rPr>
+              <w:t>}</w:t>
             </w:r>
           </w:p>
         </w:tc>
@@ -788,7 +884,16 @@
                 <w:sz w:val="16"/>
                 <w:szCs w:val="16"/>
               </w:rPr>
-              <w:t>{o</w:t>
+              <w:t>{</w:t>
+            </w:r>
+            <w:proofErr w:type="spellStart"/>
+            <w:r>
+              <w:rPr>
+                <w:rFonts w:ascii="Arial" w:eastAsia="Arial" w:hAnsi="Arial" w:cs="Arial"/>
+                <w:sz w:val="16"/>
+                <w:szCs w:val="16"/>
+              </w:rPr>
+              <w:t>o</w:t>
             </w:r>
             <w:r>
               <w:rPr>
@@ -798,6 +903,7 @@
               </w:rPr>
               <w:t>rigenRecurso</w:t>
             </w:r>
+            <w:proofErr w:type="spellEnd"/>
             <w:r>
               <w:rPr>
                 <w:rFonts w:ascii="Arial" w:eastAsia="Arial" w:hAnsi="Arial" w:cs="Arial"/>
@@ -1031,7 +1137,16 @@
                 <w:sz w:val="16"/>
                 <w:szCs w:val="16"/>
               </w:rPr>
-              <w:t>{t</w:t>
+              <w:t>{</w:t>
+            </w:r>
+            <w:proofErr w:type="spellStart"/>
+            <w:r>
+              <w:rPr>
+                <w:rFonts w:ascii="Arial" w:eastAsia="Arial" w:hAnsi="Arial" w:cs="Arial"/>
+                <w:sz w:val="16"/>
+                <w:szCs w:val="16"/>
+              </w:rPr>
+              <w:t>t</w:t>
             </w:r>
             <w:r>
               <w:rPr>
@@ -1041,6 +1156,7 @@
               </w:rPr>
               <w:t>ipoPrograma</w:t>
             </w:r>
+            <w:proofErr w:type="spellEnd"/>
             <w:r>
               <w:rPr>
                 <w:rFonts w:ascii="Arial" w:eastAsia="Arial" w:hAnsi="Arial" w:cs="Arial"/>
@@ -1114,6 +1230,7 @@
               </w:rPr>
               <w:t>{</w:t>
             </w:r>
+            <w:proofErr w:type="spellStart"/>
             <w:r>
               <w:rPr>
                 <w:rFonts w:ascii="Arial" w:eastAsia="Arial" w:hAnsi="Arial" w:cs="Arial"/>
@@ -1122,6 +1239,7 @@
               </w:rPr>
               <w:t>tipoProcedimiento</w:t>
             </w:r>
+            <w:proofErr w:type="spellEnd"/>
             <w:r>
               <w:rPr>
                 <w:rFonts w:ascii="Arial" w:eastAsia="Arial" w:hAnsi="Arial" w:cs="Arial"/>
@@ -1195,6 +1313,7 @@
               </w:rPr>
               <w:t>{</w:t>
             </w:r>
+            <w:proofErr w:type="spellStart"/>
             <w:r>
               <w:rPr>
                 <w:rFonts w:ascii="Arial" w:eastAsia="Arial" w:hAnsi="Arial" w:cs="Arial"/>
@@ -1203,6 +1322,7 @@
               </w:rPr>
               <w:t>descripcionGeneral</w:t>
             </w:r>
+            <w:proofErr w:type="spellEnd"/>
             <w:r>
               <w:rPr>
                 <w:rFonts w:ascii="Arial" w:eastAsia="Arial" w:hAnsi="Arial" w:cs="Arial"/>
@@ -1276,6 +1396,7 @@
               </w:rPr>
               <w:t>{</w:t>
             </w:r>
+            <w:proofErr w:type="spellStart"/>
             <w:r>
               <w:rPr>
                 <w:rFonts w:ascii="Arial" w:eastAsia="Arial" w:hAnsi="Arial" w:cs="Arial"/>
@@ -1284,6 +1405,7 @@
               </w:rPr>
               <w:t>periodoGarantia</w:t>
             </w:r>
+            <w:proofErr w:type="spellEnd"/>
             <w:r>
               <w:rPr>
                 <w:rFonts w:ascii="Arial" w:eastAsia="Arial" w:hAnsi="Arial" w:cs="Arial"/>
@@ -1357,6 +1479,7 @@
               </w:rPr>
               <w:t>{</w:t>
             </w:r>
+            <w:proofErr w:type="spellStart"/>
             <w:r>
               <w:rPr>
                 <w:rFonts w:ascii="Arial" w:eastAsia="Arial" w:hAnsi="Arial" w:cs="Arial"/>
@@ -1365,6 +1488,7 @@
               </w:rPr>
               <w:t>justificacionGasto</w:t>
             </w:r>
+            <w:proofErr w:type="spellEnd"/>
             <w:r>
               <w:rPr>
                 <w:rFonts w:ascii="Arial" w:eastAsia="Arial" w:hAnsi="Arial" w:cs="Arial"/>
@@ -1590,7 +1714,29 @@
                 <w:sz w:val="16"/>
                 <w:szCs w:val="16"/>
               </w:rPr>
-              <w:t>{numeroPartida}</w:t>
+              <w:t>{</w:t>
+            </w:r>
+            <w:proofErr w:type="spellStart"/>
+            <w:r>
+              <w:rPr>
+                <w:rFonts w:ascii="Arial" w:eastAsia="Arial" w:hAnsi="Arial" w:cs="Arial"/>
+                <w:b/>
+                <w:bCs/>
+                <w:sz w:val="16"/>
+                <w:szCs w:val="16"/>
+              </w:rPr>
+              <w:t>numeroPartida</w:t>
+            </w:r>
+            <w:proofErr w:type="spellEnd"/>
+            <w:r>
+              <w:rPr>
+                <w:rFonts w:ascii="Arial" w:eastAsia="Arial" w:hAnsi="Arial" w:cs="Arial"/>
+                <w:b/>
+                <w:bCs/>
+                <w:sz w:val="16"/>
+                <w:szCs w:val="16"/>
+              </w:rPr>
+              <w:t>}</w:t>
             </w:r>
           </w:p>
         </w:tc>
@@ -1621,7 +1767,29 @@
                 <w:sz w:val="16"/>
                 <w:szCs w:val="16"/>
               </w:rPr>
-              <w:t>{descripcion}</w:t>
+              <w:t>{</w:t>
+            </w:r>
+            <w:proofErr w:type="spellStart"/>
+            <w:r>
+              <w:rPr>
+                <w:rFonts w:ascii="Arial" w:eastAsia="Arial" w:hAnsi="Arial" w:cs="Arial"/>
+                <w:b/>
+                <w:bCs/>
+                <w:sz w:val="16"/>
+                <w:szCs w:val="16"/>
+              </w:rPr>
+              <w:t>descripcion</w:t>
+            </w:r>
+            <w:proofErr w:type="spellEnd"/>
+            <w:r>
+              <w:rPr>
+                <w:rFonts w:ascii="Arial" w:eastAsia="Arial" w:hAnsi="Arial" w:cs="Arial"/>
+                <w:b/>
+                <w:bCs/>
+                <w:sz w:val="16"/>
+                <w:szCs w:val="16"/>
+              </w:rPr>
+              <w:t>}</w:t>
             </w:r>
           </w:p>
         </w:tc>
@@ -1650,7 +1818,25 @@
                 <w:sz w:val="16"/>
                 <w:szCs w:val="16"/>
               </w:rPr>
-              <w:t>{unidadMedida}</w:t>
+              <w:t>{</w:t>
+            </w:r>
+            <w:proofErr w:type="spellStart"/>
+            <w:r>
+              <w:rPr>
+                <w:rFonts w:ascii="Arial" w:eastAsia="Arial" w:hAnsi="Arial" w:cs="Arial"/>
+                <w:sz w:val="16"/>
+                <w:szCs w:val="16"/>
+              </w:rPr>
+              <w:t>unidadMedida</w:t>
+            </w:r>
+            <w:proofErr w:type="spellEnd"/>
+            <w:r>
+              <w:rPr>
+                <w:rFonts w:ascii="Arial" w:eastAsia="Arial" w:hAnsi="Arial" w:cs="Arial"/>
+                <w:sz w:val="16"/>
+                <w:szCs w:val="16"/>
+              </w:rPr>
+              <w:t>}</w:t>
             </w:r>
           </w:p>
         </w:tc>
@@ -1771,6 +1957,7 @@
               </w:rPr>
               <w:t>{</w:t>
             </w:r>
+            <w:proofErr w:type="spellStart"/>
             <w:r>
               <w:rPr>
                 <w:rFonts w:ascii="Arial" w:eastAsia="Arial" w:hAnsi="Arial" w:cs="Arial"/>
@@ -1779,6 +1966,7 @@
               </w:rPr>
               <w:t>aniosExperienciaLicitante</w:t>
             </w:r>
+            <w:proofErr w:type="spellEnd"/>
             <w:r>
               <w:rPr>
                 <w:rFonts w:ascii="Arial" w:eastAsia="Arial" w:hAnsi="Arial" w:cs="Arial"/>
@@ -2371,6 +2559,7 @@
               </w:rPr>
               <w:t>{</w:t>
             </w:r>
+            <w:proofErr w:type="spellStart"/>
             <w:r>
               <w:rPr>
                 <w:rFonts w:ascii="Arial" w:eastAsia="Arial" w:hAnsi="Arial" w:cs="Arial"/>
@@ -2379,6 +2568,7 @@
               </w:rPr>
               <w:t>diasEntrega</w:t>
             </w:r>
+            <w:proofErr w:type="spellEnd"/>
             <w:r>
               <w:rPr>
                 <w:rFonts w:ascii="Arial" w:eastAsia="Arial" w:hAnsi="Arial" w:cs="Arial"/>
@@ -3502,6 +3692,7 @@
               </w:rPr>
               <w:t>{</w:t>
             </w:r>
+            <w:proofErr w:type="spellStart"/>
             <w:r>
               <w:rPr>
                 <w:rFonts w:ascii="Arial" w:eastAsia="Arial" w:hAnsi="Arial" w:cs="Arial"/>
@@ -3510,6 +3701,7 @@
               </w:rPr>
               <w:t>pagosSeRealizaran</w:t>
             </w:r>
+            <w:proofErr w:type="spellEnd"/>
             <w:r>
               <w:rPr>
                 <w:rFonts w:ascii="Arial" w:eastAsia="Arial" w:hAnsi="Arial" w:cs="Arial"/>
@@ -3904,7 +4096,25 @@
                 <w:sz w:val="16"/>
                 <w:szCs w:val="16"/>
               </w:rPr>
-              <w:t>[adquisicionMedianteContrato]</w:t>
+              <w:t>{</w:t>
+            </w:r>
+            <w:proofErr w:type="spellStart"/>
+            <w:r>
+              <w:rPr>
+                <w:rFonts w:ascii="Arial" w:eastAsia="Arial" w:hAnsi="Arial" w:cs="Arial"/>
+                <w:sz w:val="16"/>
+                <w:szCs w:val="16"/>
+              </w:rPr>
+              <w:t>adquisicionMedianteContrato</w:t>
+            </w:r>
+            <w:proofErr w:type="spellEnd"/>
+            <w:r>
+              <w:rPr>
+                <w:rFonts w:ascii="Arial" w:eastAsia="Arial" w:hAnsi="Arial" w:cs="Arial"/>
+                <w:sz w:val="16"/>
+                <w:szCs w:val="16"/>
+              </w:rPr>
+              <w:t>}</w:t>
             </w:r>
             <w:r>
               <w:rPr>
@@ -3921,7 +4131,25 @@
                 <w:sz w:val="16"/>
                 <w:szCs w:val="16"/>
               </w:rPr>
-              <w:t>[articulo]</w:t>
+              <w:t>{</w:t>
+            </w:r>
+            <w:proofErr w:type="spellStart"/>
+            <w:r>
+              <w:rPr>
+                <w:rFonts w:ascii="Arial" w:eastAsia="Arial" w:hAnsi="Arial" w:cs="Arial"/>
+                <w:sz w:val="16"/>
+                <w:szCs w:val="16"/>
+              </w:rPr>
+              <w:t>conformidadArticulo</w:t>
+            </w:r>
+            <w:proofErr w:type="spellEnd"/>
+            <w:r>
+              <w:rPr>
+                <w:rFonts w:ascii="Arial" w:eastAsia="Arial" w:hAnsi="Arial" w:cs="Arial"/>
+                <w:sz w:val="16"/>
+                <w:szCs w:val="16"/>
+              </w:rPr>
+              <w:t>}</w:t>
             </w:r>
             <w:r>
               <w:rPr>
@@ -3965,32 +4193,16 @@
                 <w:sz w:val="16"/>
                 <w:szCs w:val="16"/>
               </w:rPr>
-              <w:t>3. Los bienes adjudicados deberán entregarse en _______</w:t>
-            </w:r>
-            <w:r>
-              <w:rPr>
-                <w:rFonts w:ascii="Arial" w:eastAsia="Arial" w:hAnsi="Arial" w:cs="Arial"/>
-                <w:sz w:val="16"/>
-                <w:szCs w:val="16"/>
-              </w:rPr>
-              <w:t>D</w:t>
-            </w:r>
-            <w:r>
-              <w:rPr>
-                <w:rFonts w:ascii="Arial" w:eastAsia="Arial" w:hAnsi="Arial" w:cs="Arial"/>
-                <w:color w:val="000000"/>
-                <w:sz w:val="16"/>
-                <w:szCs w:val="16"/>
-              </w:rPr>
-              <w:t>omicilio pa</w:t>
-            </w:r>
-            <w:r>
-              <w:rPr>
-                <w:rFonts w:ascii="Arial" w:eastAsia="Arial" w:hAnsi="Arial" w:cs="Arial"/>
-                <w:sz w:val="16"/>
-                <w:szCs w:val="16"/>
-              </w:rPr>
-              <w:t>ra entrega</w:t>
+              <w:t>3. Los bienes adjudicados deberán entregarse en</w:t>
+            </w:r>
+            <w:r>
+              <w:rPr>
+                <w:rFonts w:ascii="Arial" w:eastAsia="Arial" w:hAnsi="Arial" w:cs="Arial"/>
+                <w:color w:val="000000"/>
+                <w:sz w:val="16"/>
+                <w:szCs w:val="16"/>
+              </w:rPr>
+              <w:t xml:space="preserve"> </w:t>
             </w:r>
             <w:r>
               <w:rPr>
@@ -4010,6 +4222,7 @@
               </w:rPr>
               <w:t>{</w:t>
             </w:r>
+            <w:proofErr w:type="spellStart"/>
             <w:r>
               <w:rPr>
                 <w:rFonts w:ascii="Arial" w:eastAsia="Arial" w:hAnsi="Arial" w:cs="Arial"/>
@@ -4019,6 +4232,7 @@
               </w:rPr>
               <w:t>lugarEntrega</w:t>
             </w:r>
+            <w:proofErr w:type="spellEnd"/>
             <w:r>
               <w:rPr>
                 <w:rFonts w:ascii="Arial" w:eastAsia="Arial" w:hAnsi="Arial" w:cs="Arial"/>
@@ -4043,24 +4257,72 @@
                 <w:sz w:val="16"/>
                 <w:szCs w:val="16"/>
               </w:rPr>
-              <w:t>Nombre de la dependencia</w:t>
-            </w:r>
-            <w:r>
-              <w:rPr>
-                <w:rFonts w:ascii="Arial" w:eastAsia="Arial" w:hAnsi="Arial" w:cs="Arial"/>
-                <w:color w:val="000000"/>
-                <w:sz w:val="16"/>
-                <w:szCs w:val="16"/>
-              </w:rPr>
-              <w:t>__, en el número ____</w:t>
-            </w:r>
-            <w:r>
-              <w:rPr>
-                <w:rFonts w:ascii="Arial" w:eastAsia="Arial" w:hAnsi="Arial" w:cs="Arial"/>
-                <w:sz w:val="16"/>
-                <w:szCs w:val="16"/>
-              </w:rPr>
-              <w:t>Teléfono</w:t>
+              <w:t>{</w:t>
+            </w:r>
+            <w:proofErr w:type="spellStart"/>
+            <w:r>
+              <w:rPr>
+                <w:rFonts w:ascii="Arial" w:eastAsia="Arial" w:hAnsi="Arial" w:cs="Arial"/>
+                <w:sz w:val="16"/>
+                <w:szCs w:val="16"/>
+              </w:rPr>
+              <w:t>nombreDependenciaEntrega</w:t>
+            </w:r>
+            <w:proofErr w:type="spellEnd"/>
+            <w:r>
+              <w:rPr>
+                <w:rFonts w:ascii="Arial" w:eastAsia="Arial" w:hAnsi="Arial" w:cs="Arial"/>
+                <w:sz w:val="16"/>
+                <w:szCs w:val="16"/>
+              </w:rPr>
+              <w:t>}</w:t>
+            </w:r>
+            <w:r>
+              <w:rPr>
+                <w:rFonts w:ascii="Arial" w:eastAsia="Arial" w:hAnsi="Arial" w:cs="Arial"/>
+                <w:color w:val="000000"/>
+                <w:sz w:val="16"/>
+                <w:szCs w:val="16"/>
+              </w:rPr>
+              <w:t>__, en el número _</w:t>
+            </w:r>
+            <w:r>
+              <w:rPr>
+                <w:rFonts w:ascii="Arial" w:eastAsia="Arial" w:hAnsi="Arial" w:cs="Arial"/>
+                <w:color w:val="000000"/>
+                <w:sz w:val="16"/>
+                <w:szCs w:val="16"/>
+              </w:rPr>
+              <w:t>{</w:t>
+            </w:r>
+            <w:proofErr w:type="spellStart"/>
+            <w:r>
+              <w:rPr>
+                <w:rFonts w:ascii="Arial" w:eastAsia="Arial" w:hAnsi="Arial" w:cs="Arial"/>
+                <w:color w:val="000000"/>
+                <w:sz w:val="16"/>
+                <w:szCs w:val="16"/>
+              </w:rPr>
+              <w:t>telefonoEntrega</w:t>
+            </w:r>
+            <w:proofErr w:type="spellEnd"/>
+            <w:r>
+              <w:rPr>
+                <w:rFonts w:ascii="Arial" w:eastAsia="Arial" w:hAnsi="Arial" w:cs="Arial"/>
+                <w:color w:val="000000"/>
+                <w:sz w:val="16"/>
+                <w:szCs w:val="16"/>
+              </w:rPr>
+              <w:t>},</w:t>
+            </w:r>
+            <w:r>
+              <w:rPr>
+                <w:rFonts w:ascii="Arial" w:eastAsia="Arial" w:hAnsi="Arial" w:cs="Arial"/>
+                <w:color w:val="000000"/>
+                <w:sz w:val="16"/>
+                <w:szCs w:val="16"/>
+              </w:rPr>
+              <w:t xml:space="preserve"> </w:t>
             </w:r>
             <w:r>
               <w:rPr>
@@ -4077,7 +4339,50 @@
                 <w:sz w:val="16"/>
                 <w:szCs w:val="16"/>
               </w:rPr>
-              <w:t>Extensión</w:t>
+              <w:t>{</w:t>
+            </w:r>
+            <w:proofErr w:type="spellStart"/>
+            <w:r>
+              <w:rPr>
+                <w:rFonts w:ascii="Arial" w:eastAsia="Arial" w:hAnsi="Arial" w:cs="Arial"/>
+                <w:sz w:val="16"/>
+                <w:szCs w:val="16"/>
+              </w:rPr>
+              <w:t>extencionTelefonoEntre</w:t>
+            </w:r>
+            <w:r>
+              <w:rPr>
+                <w:rFonts w:ascii="Arial" w:eastAsia="Arial" w:hAnsi="Arial" w:cs="Arial"/>
+                <w:sz w:val="16"/>
+                <w:szCs w:val="16"/>
+              </w:rPr>
+              <w:t>g</w:t>
+            </w:r>
+            <w:r>
+              <w:rPr>
+                <w:rFonts w:ascii="Arial" w:eastAsia="Arial" w:hAnsi="Arial" w:cs="Arial"/>
+                <w:sz w:val="16"/>
+                <w:szCs w:val="16"/>
+              </w:rPr>
+              <w:t>a</w:t>
+            </w:r>
+            <w:proofErr w:type="spellEnd"/>
+            <w:r>
+              <w:rPr>
+                <w:rFonts w:ascii="Arial" w:eastAsia="Arial" w:hAnsi="Arial" w:cs="Arial"/>
+                <w:sz w:val="16"/>
+                <w:szCs w:val="16"/>
+              </w:rPr>
+              <w:t>}</w:t>
+            </w:r>
+            <w:r>
+              <w:rPr>
+                <w:rFonts w:ascii="Arial" w:eastAsia="Arial" w:hAnsi="Arial" w:cs="Arial"/>
+                <w:color w:val="000000"/>
+                <w:sz w:val="16"/>
+                <w:szCs w:val="16"/>
+              </w:rPr>
+              <w:t xml:space="preserve"> </w:t>
             </w:r>
             <w:r>
               <w:rPr>
@@ -4144,6 +4449,7 @@
               </w:rPr>
               <w:t>{</w:t>
             </w:r>
+            <w:proofErr w:type="spellStart"/>
             <w:r>
               <w:rPr>
                 <w:rFonts w:ascii="Arial" w:eastAsia="Arial" w:hAnsi="Arial" w:cs="Arial"/>
@@ -4153,6 +4459,7 @@
               </w:rPr>
               <w:t>diasEntrega</w:t>
             </w:r>
+            <w:proofErr w:type="spellEnd"/>
             <w:r>
               <w:rPr>
                 <w:rFonts w:ascii="Arial" w:eastAsia="Arial" w:hAnsi="Arial" w:cs="Arial"/>
@@ -4815,6 +5122,7 @@
               </w:rPr>
               <w:t>{</w:t>
             </w:r>
+            <w:proofErr w:type="spellStart"/>
             <w:r>
               <w:rPr>
                 <w:rFonts w:ascii="Arial" w:eastAsia="Arial" w:hAnsi="Arial" w:cs="Arial"/>
@@ -4823,6 +5131,7 @@
               </w:rPr>
               <w:t>nombreRepresentante</w:t>
             </w:r>
+            <w:proofErr w:type="spellEnd"/>
             <w:r>
               <w:rPr>
                 <w:rFonts w:ascii="Arial" w:eastAsia="Arial" w:hAnsi="Arial" w:cs="Arial"/>
@@ -4881,6 +5190,7 @@
               </w:rPr>
               <w:t>{</w:t>
             </w:r>
+            <w:proofErr w:type="spellStart"/>
             <w:r>
               <w:rPr>
                 <w:rFonts w:ascii="Arial" w:eastAsia="Arial" w:hAnsi="Arial" w:cs="Arial"/>
@@ -4889,6 +5199,7 @@
               </w:rPr>
               <w:t>cargoRepresentante</w:t>
             </w:r>
+            <w:proofErr w:type="spellEnd"/>
             <w:r>
               <w:rPr>
                 <w:rFonts w:ascii="Arial" w:eastAsia="Arial" w:hAnsi="Arial" w:cs="Arial"/>
@@ -4947,6 +5258,7 @@
               </w:rPr>
               <w:t>{</w:t>
             </w:r>
+            <w:proofErr w:type="spellStart"/>
             <w:r>
               <w:rPr>
                 <w:rFonts w:ascii="Arial" w:eastAsia="Arial" w:hAnsi="Arial" w:cs="Arial"/>
@@ -4955,6 +5267,7 @@
               </w:rPr>
               <w:t>correoRepresentante</w:t>
             </w:r>
+            <w:proofErr w:type="spellEnd"/>
             <w:r>
               <w:rPr>
                 <w:rFonts w:ascii="Arial" w:eastAsia="Arial" w:hAnsi="Arial" w:cs="Arial"/>
@@ -5013,6 +5326,7 @@
               </w:rPr>
               <w:t>{</w:t>
             </w:r>
+            <w:proofErr w:type="spellStart"/>
             <w:r>
               <w:rPr>
                 <w:rFonts w:ascii="Arial" w:eastAsia="Arial" w:hAnsi="Arial" w:cs="Arial"/>
@@ -5021,6 +5335,7 @@
               </w:rPr>
               <w:t>telefonoRepresentante</w:t>
             </w:r>
+            <w:proofErr w:type="spellEnd"/>
             <w:r>
               <w:rPr>
                 <w:rFonts w:ascii="Arial" w:eastAsia="Arial" w:hAnsi="Arial" w:cs="Arial"/>
@@ -5155,6 +5470,7 @@
               </w:rPr>
               <w:t>{</w:t>
             </w:r>
+            <w:proofErr w:type="spellStart"/>
             <w:r>
               <w:rPr>
                 <w:rFonts w:ascii="Arial" w:eastAsia="Arial" w:hAnsi="Arial" w:cs="Arial"/>
@@ -5163,6 +5479,7 @@
               </w:rPr>
               <w:t>nombreAdministradorContrato</w:t>
             </w:r>
+            <w:proofErr w:type="spellEnd"/>
             <w:r>
               <w:rPr>
                 <w:rFonts w:ascii="Arial" w:eastAsia="Arial" w:hAnsi="Arial" w:cs="Arial"/>
@@ -5221,6 +5538,7 @@
               </w:rPr>
               <w:t>{</w:t>
             </w:r>
+            <w:proofErr w:type="spellStart"/>
             <w:r>
               <w:rPr>
                 <w:rFonts w:ascii="Arial" w:eastAsia="Arial" w:hAnsi="Arial" w:cs="Arial"/>
@@ -5229,6 +5547,7 @@
               </w:rPr>
               <w:t>cargoAdministradorContrato</w:t>
             </w:r>
+            <w:proofErr w:type="spellEnd"/>
             <w:r>
               <w:rPr>
                 <w:rFonts w:ascii="Arial" w:eastAsia="Arial" w:hAnsi="Arial" w:cs="Arial"/>
@@ -5287,6 +5606,7 @@
               </w:rPr>
               <w:t>{</w:t>
             </w:r>
+            <w:proofErr w:type="spellStart"/>
             <w:r>
               <w:rPr>
                 <w:rFonts w:ascii="Arial" w:eastAsia="Arial" w:hAnsi="Arial" w:cs="Arial"/>
@@ -5295,6 +5615,7 @@
               </w:rPr>
               <w:t>correoAdministradorContrato</w:t>
             </w:r>
+            <w:proofErr w:type="spellEnd"/>
             <w:r>
               <w:rPr>
                 <w:rFonts w:ascii="Arial" w:eastAsia="Arial" w:hAnsi="Arial" w:cs="Arial"/>
@@ -5353,6 +5674,7 @@
               </w:rPr>
               <w:t>{</w:t>
             </w:r>
+            <w:proofErr w:type="spellStart"/>
             <w:r>
               <w:rPr>
                 <w:rFonts w:ascii="Arial" w:eastAsia="Arial" w:hAnsi="Arial" w:cs="Arial"/>
@@ -5361,6 +5683,7 @@
               </w:rPr>
               <w:t>telefonoAdministradorContrato</w:t>
             </w:r>
+            <w:proofErr w:type="spellEnd"/>
             <w:r>
               <w:rPr>
                 <w:rFonts w:ascii="Arial" w:eastAsia="Arial" w:hAnsi="Arial" w:cs="Arial"/>

</xml_diff>

<commit_message>
feet: Ajustes generales para subir a produccion
</commit_message>
<xml_diff>
--- a/public/plantillas/requisicionbienesmayor.docx
+++ b/public/plantillas/requisicionbienesmayor.docx
@@ -1,6 +1,6 @@
 
 <file path=word/document.xml><?xml version="1.0" encoding="utf-8"?>
-<w:document xmlns:wpc="http://schemas.microsoft.com/office/word/2010/wordprocessingCanvas" xmlns:cx="http://schemas.microsoft.com/office/drawing/2014/chartex" xmlns:cx1="http://schemas.microsoft.com/office/drawing/2015/9/8/chartex" xmlns:cx2="http://schemas.microsoft.com/office/drawing/2015/10/21/chartex" xmlns:cx3="http://schemas.microsoft.com/office/drawing/2016/5/9/chartex" xmlns:cx4="http://schemas.microsoft.com/office/drawing/2016/5/10/chartex" xmlns:cx5="http://schemas.microsoft.com/office/drawing/2016/5/11/chartex" xmlns:cx6="http://schemas.microsoft.com/office/drawing/2016/5/12/chartex" xmlns:cx7="http://schemas.microsoft.com/office/drawing/2016/5/13/chartex" xmlns:cx8="http://schemas.microsoft.com/office/drawing/2016/5/14/chartex" xmlns:mc="http://schemas.openxmlformats.org/markup-compatibility/2006" xmlns:aink="http://schemas.microsoft.com/office/drawing/2016/ink" xmlns:am3d="http://schemas.microsoft.com/office/drawing/2017/model3d" xmlns:o="urn:schemas-microsoft-com:office:office" xmlns:oel="http://schemas.microsoft.com/office/2019/extlst" xmlns:r="http://schemas.openxmlformats.org/officeDocument/2006/relationships" xmlns:m="http://schemas.openxmlformats.org/officeDocument/2006/math" xmlns:v="urn:schemas-microsoft-com:vml" xmlns:wp14="http://schemas.microsoft.com/office/word/2010/wordprocessingDrawing" xmlns:wp="http://schemas.openxmlformats.org/drawingml/2006/wordprocessingDrawing" xmlns:w10="urn:schemas-microsoft-com:office:word" xmlns:w="http://schemas.openxmlformats.org/wordprocessingml/2006/main" xmlns:w14="http://schemas.microsoft.com/office/word/2010/wordml" xmlns:w15="http://schemas.microsoft.com/office/word/2012/wordml" xmlns:w16cex="http://schemas.microsoft.com/office/word/2018/wordml/cex" xmlns:w16cid="http://schemas.microsoft.com/office/word/2016/wordml/cid" xmlns:w16="http://schemas.microsoft.com/office/word/2018/wordml" xmlns:w16sdtdh="http://schemas.microsoft.com/office/word/2020/wordml/sdtdatahash" xmlns:w16se="http://schemas.microsoft.com/office/word/2015/wordml/symex" xmlns:wpg="http://schemas.microsoft.com/office/word/2010/wordprocessingGroup" xmlns:wpi="http://schemas.microsoft.com/office/word/2010/wordprocessingInk" xmlns:wne="http://schemas.microsoft.com/office/word/2006/wordml" xmlns:wps="http://schemas.microsoft.com/office/word/2010/wordprocessingShape" mc:Ignorable="w14 w15 w16se w16cid w16 w16cex w16sdtdh wp14">
+<w:document xmlns:wpc="http://schemas.microsoft.com/office/word/2010/wordprocessingCanvas" xmlns:cx="http://schemas.microsoft.com/office/drawing/2014/chartex" xmlns:cx1="http://schemas.microsoft.com/office/drawing/2015/9/8/chartex" xmlns:cx2="http://schemas.microsoft.com/office/drawing/2015/10/21/chartex" xmlns:cx3="http://schemas.microsoft.com/office/drawing/2016/5/9/chartex" xmlns:cx4="http://schemas.microsoft.com/office/drawing/2016/5/10/chartex" xmlns:cx5="http://schemas.microsoft.com/office/drawing/2016/5/11/chartex" xmlns:cx6="http://schemas.microsoft.com/office/drawing/2016/5/12/chartex" xmlns:cx7="http://schemas.microsoft.com/office/drawing/2016/5/13/chartex" xmlns:cx8="http://schemas.microsoft.com/office/drawing/2016/5/14/chartex" xmlns:mc="http://schemas.openxmlformats.org/markup-compatibility/2006" xmlns:aink="http://schemas.microsoft.com/office/drawing/2016/ink" xmlns:am3d="http://schemas.microsoft.com/office/drawing/2017/model3d" xmlns:o="urn:schemas-microsoft-com:office:office" xmlns:r="http://schemas.openxmlformats.org/officeDocument/2006/relationships" xmlns:m="http://schemas.openxmlformats.org/officeDocument/2006/math" xmlns:v="urn:schemas-microsoft-com:vml" xmlns:wp14="http://schemas.microsoft.com/office/word/2010/wordprocessingDrawing" xmlns:wp="http://schemas.openxmlformats.org/drawingml/2006/wordprocessingDrawing" xmlns:w10="urn:schemas-microsoft-com:office:word" xmlns:w="http://schemas.openxmlformats.org/wordprocessingml/2006/main" xmlns:w14="http://schemas.microsoft.com/office/word/2010/wordml" xmlns:w15="http://schemas.microsoft.com/office/word/2012/wordml" xmlns:w16cex="http://schemas.microsoft.com/office/word/2018/wordml/cex" xmlns:w16cid="http://schemas.microsoft.com/office/word/2016/wordml/cid" xmlns:w16="http://schemas.microsoft.com/office/word/2018/wordml" xmlns:w16se="http://schemas.microsoft.com/office/word/2015/wordml/symex" xmlns:wpg="http://schemas.microsoft.com/office/word/2010/wordprocessingGroup" xmlns:wpi="http://schemas.microsoft.com/office/word/2010/wordprocessingInk" xmlns:wne="http://schemas.microsoft.com/office/word/2006/wordml" xmlns:wps="http://schemas.microsoft.com/office/word/2010/wordprocessingShape" mc:Ignorable="w14 w15 w16se w16cid w16 w16cex wp14">
   <w:body>
     <w:p>
       <w:pPr>
@@ -1938,22 +1938,23 @@
                 <w:sz w:val="16"/>
                 <w:szCs w:val="16"/>
               </w:rPr>
-              <w:t xml:space="preserve">1.- Los licitantes deberán presentar currículo en hoja membretada debidamente firmada por la persona autorizada para ello y sellada, en el que indiquen su experiencia mínima de </w:t>
-            </w:r>
-            <w:r>
-              <w:rPr>
-                <w:rFonts w:ascii="Arial" w:eastAsia="Arial" w:hAnsi="Arial" w:cs="Arial"/>
-                <w:color w:val="000000"/>
-                <w:sz w:val="16"/>
-                <w:szCs w:val="16"/>
-              </w:rPr>
-              <w:t>__</w:t>
-            </w:r>
-            <w:r>
-              <w:rPr>
-                <w:rFonts w:ascii="Arial" w:eastAsia="Arial" w:hAnsi="Arial" w:cs="Arial"/>
-                <w:sz w:val="16"/>
-                <w:szCs w:val="16"/>
+              <w:t>1.- Los licitantes deberán presentar currículo en hoja membretada debidamente firmada por la persona autorizada para ello y sellada, en el que indiquen su experiencia mínima de</w:t>
+            </w:r>
+            <w:r>
+              <w:rPr>
+                <w:rFonts w:ascii="Arial" w:eastAsia="Arial" w:hAnsi="Arial" w:cs="Arial"/>
+                <w:color w:val="000000"/>
+                <w:sz w:val="16"/>
+                <w:szCs w:val="16"/>
+              </w:rPr>
+              <w:t xml:space="preserve"> </w:t>
+            </w:r>
+            <w:r>
+              <w:rPr>
+                <w:rFonts w:ascii="Arial" w:eastAsia="Arial" w:hAnsi="Arial" w:cs="Arial"/>
+                <w:sz w:val="16"/>
+                <w:szCs w:val="16"/>
+                <w:u w:val="single"/>
               </w:rPr>
               <w:t>{</w:t>
             </w:r>
@@ -1963,6 +1964,7 @@
                 <w:rFonts w:ascii="Arial" w:eastAsia="Arial" w:hAnsi="Arial" w:cs="Arial"/>
                 <w:sz w:val="16"/>
                 <w:szCs w:val="16"/>
+                <w:u w:val="single"/>
               </w:rPr>
               <w:t>aniosExperienciaLicitante</w:t>
             </w:r>
@@ -1972,6 +1974,7 @@
                 <w:rFonts w:ascii="Arial" w:eastAsia="Arial" w:hAnsi="Arial" w:cs="Arial"/>
                 <w:sz w:val="16"/>
                 <w:szCs w:val="16"/>
+                <w:u w:val="single"/>
               </w:rPr>
               <w:t>}</w:t>
             </w:r>
@@ -1982,15 +1985,6 @@
                 <w:sz w:val="16"/>
                 <w:szCs w:val="16"/>
               </w:rPr>
-              <w:t>_</w:t>
-            </w:r>
-            <w:r>
-              <w:rPr>
-                <w:rFonts w:ascii="Arial" w:eastAsia="Arial" w:hAnsi="Arial" w:cs="Arial"/>
-                <w:color w:val="000000"/>
-                <w:sz w:val="16"/>
-                <w:szCs w:val="16"/>
-              </w:rPr>
               <w:t xml:space="preserve"> años en contrataciones iguales o similares a la requerida en el cual se incluya:</w:t>
             </w:r>
           </w:p>
@@ -2026,7 +2020,16 @@
                 <w:sz w:val="16"/>
                 <w:szCs w:val="16"/>
               </w:rPr>
-              <w:t xml:space="preserve">a) Relación en formato libre de mínimo tres contrataciones iguales o similares, que hayan sido efectuados durante los últimos años, sin exceder de tres; la cual deberá contener: nombre, domicilio y teléfono del cliente, monto de la venta o comercialización, así como indicar el destino (público o privado). </w:t>
+              <w:t>a) Relación en formato libre de mínimo tres contrataciones iguales o similares, que hayan sido efectuados durante los últimos años, sin exceder de tres; la cual deberá conte</w:t>
+            </w:r>
+            <w:r>
+              <w:rPr>
+                <w:rFonts w:ascii="Arial" w:eastAsia="Arial" w:hAnsi="Arial" w:cs="Arial"/>
+                <w:color w:val="000000"/>
+                <w:sz w:val="16"/>
+                <w:szCs w:val="16"/>
+              </w:rPr>
+              <w:t xml:space="preserve">ner: nombre, domicilio y teléfono del cliente, monto de la venta o comercialización, así como indicar el destino (público o privado). </w:t>
             </w:r>
           </w:p>
           <w:p>
@@ -2096,7 +2099,16 @@
                 <w:sz w:val="16"/>
                 <w:szCs w:val="16"/>
               </w:rPr>
-              <w:t>2.- Los licitantes deberán presentar lo siguiente:</w:t>
+              <w:t>2.- Los licitantes deberán presentar</w:t>
+            </w:r>
+            <w:r>
+              <w:rPr>
+                <w:rFonts w:ascii="Arial" w:eastAsia="Arial" w:hAnsi="Arial" w:cs="Arial"/>
+                <w:color w:val="000000"/>
+                <w:sz w:val="16"/>
+                <w:szCs w:val="16"/>
+              </w:rPr>
+              <w:t xml:space="preserve"> lo siguiente:</w:t>
             </w:r>
           </w:p>
           <w:p>
@@ -2201,7 +2213,16 @@
                 <w:sz w:val="16"/>
                 <w:szCs w:val="16"/>
               </w:rPr>
-              <w:t>En caso de que el comprobante de domicilio no se encuentre a nombre del licitante, éste deberá presentar copia simple legible del contrato de arrendamiento, junto con copia simple legible de las identificaciones de los representantes legales que suscriban el contrato.</w:t>
+              <w:t>En caso de que el comprobante de domicilio no se encuentre a nombre del licitante, éste deberá presentar copia simple legible del contrato de arrendamiento, ju</w:t>
+            </w:r>
+            <w:r>
+              <w:rPr>
+                <w:rFonts w:ascii="Arial" w:eastAsia="Arial" w:hAnsi="Arial" w:cs="Arial"/>
+                <w:color w:val="000000"/>
+                <w:sz w:val="16"/>
+                <w:szCs w:val="16"/>
+              </w:rPr>
+              <w:t>nto con copia simple legible de las identificaciones de los representantes legales que suscriban el contrato.</w:t>
             </w:r>
           </w:p>
           <w:p>
@@ -2272,7 +2293,16 @@
                 <w:sz w:val="16"/>
                 <w:szCs w:val="16"/>
               </w:rPr>
-              <w:t>En caso de que no aplique marca, los licitantes deberán indicar NO APLICA. Conforme</w:t>
+              <w:t>En caso de que no apliq</w:t>
+            </w:r>
+            <w:r>
+              <w:rPr>
+                <w:rFonts w:ascii="Arial" w:eastAsia="Arial" w:hAnsi="Arial" w:cs="Arial"/>
+                <w:color w:val="000000"/>
+                <w:sz w:val="16"/>
+                <w:szCs w:val="16"/>
+              </w:rPr>
+              <w:t>ue marca, los licitantes deberán indicar NO APLICA. Conforme</w:t>
             </w:r>
             <w:r>
               <w:rPr>
@@ -2303,7 +2333,16 @@
                 <w:sz w:val="16"/>
                 <w:szCs w:val="16"/>
               </w:rPr>
-              <w:t>4.- Los licitantes deberán presentar carta bajo protesta de decir verdad, en hoja membretada debidamente firmada por la persona autorizada para ello y sellada, en la que se comprometa en caso de resultar adjudicado a lo siguiente:</w:t>
+              <w:t>4.- Los licitantes deberán presentar carta bajo protesta de decir verdad, en hoja membret</w:t>
+            </w:r>
+            <w:r>
+              <w:rPr>
+                <w:rFonts w:ascii="Arial" w:eastAsia="Arial" w:hAnsi="Arial" w:cs="Arial"/>
+                <w:color w:val="000000"/>
+                <w:sz w:val="16"/>
+                <w:szCs w:val="16"/>
+              </w:rPr>
+              <w:t>ada debidamente firmada por la persona autorizada para ello y sellada, en la que se comprometa en caso de resultar adjudicado a lo siguiente:</w:t>
             </w:r>
           </w:p>
           <w:p>
@@ -2373,7 +2412,25 @@
                 <w:sz w:val="16"/>
                 <w:szCs w:val="16"/>
               </w:rPr>
-              <w:t>b) A realizar el cambio al 100% de los bienes adjudicados que presenten vicios ocultos o que resulten dañados por defectos de empaque y/o transportación, a partir de su recepción en el almacén de la Contratante, estos le serán devueltos y deberán sustituirlos en un plazo no mayor a siete días naturales.</w:t>
+              <w:t xml:space="preserve">b) A realizar el cambio </w:t>
+            </w:r>
+            <w:r>
+              <w:rPr>
+                <w:rFonts w:ascii="Arial" w:eastAsia="Arial" w:hAnsi="Arial" w:cs="Arial"/>
+                <w:color w:val="000000"/>
+                <w:sz w:val="16"/>
+                <w:szCs w:val="16"/>
+              </w:rPr>
+              <w:t>al 100% de los bienes adjudicados que presenten vicios ocultos o que resulten dañados por defectos de empaque y/o transportación, a partir de su recepción en el almacén de la Contratante, estos le serán devueltos y deberán sustituirlos en un plazo no mayor</w:t>
+            </w:r>
+            <w:r>
+              <w:rPr>
+                <w:rFonts w:ascii="Arial" w:eastAsia="Arial" w:hAnsi="Arial" w:cs="Arial"/>
+                <w:color w:val="000000"/>
+                <w:sz w:val="16"/>
+                <w:szCs w:val="16"/>
+              </w:rPr>
+              <w:t xml:space="preserve"> a siete días naturales.</w:t>
             </w:r>
           </w:p>
           <w:p>
@@ -2443,7 +2500,16 @@
                 <w:sz w:val="16"/>
                 <w:szCs w:val="16"/>
               </w:rPr>
-              <w:t>c) A garantizar los bienes por un periodo mínimo de 1 año, contado a partir de la fecha de su recepción a entera satisfacción de la Contratante.</w:t>
+              <w:t>c) A garantizar los bienes por un periodo mínimo de 1 año, contado a partir de la fecha de su recepción a entera satisfacción de</w:t>
+            </w:r>
+            <w:r>
+              <w:rPr>
+                <w:rFonts w:ascii="Arial" w:eastAsia="Arial" w:hAnsi="Arial" w:cs="Arial"/>
+                <w:color w:val="000000"/>
+                <w:sz w:val="16"/>
+                <w:szCs w:val="16"/>
+              </w:rPr>
+              <w:t xml:space="preserve"> la Contratante.</w:t>
             </w:r>
           </w:p>
           <w:p>
@@ -2513,49 +2579,68 @@
                 <w:sz w:val="16"/>
                 <w:szCs w:val="16"/>
               </w:rPr>
-              <w:t>e) A asumir totalmente la responsabilidad legal, en el caso de que, al entregar los bienes, infrinja o viole las normas en materia de patentes, marcas, obligaciones fiscales, de comercio, registros, derechos de autor, constancia de calidad, certificados analíticos de producto terminado, así como el resto de los documentos inherentes a la entrega.</w:t>
-            </w:r>
-          </w:p>
-          <w:p>
-            <w:pPr>
-              <w:spacing w:after="0" w:line="276" w:lineRule="auto"/>
-              <w:ind w:left="170" w:right="170"/>
-              <w:jc w:val="both"/>
-              <w:rPr>
-                <w:rFonts w:ascii="Arial" w:eastAsia="Arial" w:hAnsi="Arial" w:cs="Arial"/>
-                <w:color w:val="000000"/>
-                <w:sz w:val="16"/>
-                <w:szCs w:val="16"/>
-              </w:rPr>
-            </w:pPr>
-          </w:p>
-          <w:p>
-            <w:pPr>
-              <w:spacing w:after="0" w:line="276" w:lineRule="auto"/>
-              <w:ind w:left="170" w:right="170"/>
-              <w:jc w:val="both"/>
-              <w:rPr>
-                <w:rFonts w:ascii="Arial" w:eastAsia="Arial" w:hAnsi="Arial" w:cs="Arial"/>
-                <w:color w:val="000000"/>
-                <w:sz w:val="16"/>
-                <w:szCs w:val="16"/>
-              </w:rPr>
-            </w:pPr>
-            <w:r>
-              <w:rPr>
-                <w:rFonts w:ascii="Arial" w:eastAsia="Arial" w:hAnsi="Arial" w:cs="Arial"/>
-                <w:color w:val="000000"/>
-                <w:sz w:val="16"/>
-                <w:szCs w:val="16"/>
-              </w:rPr>
-              <w:t>f) A garantizar la entrega de los bienes dentro de ____</w:t>
-            </w:r>
-            <w:r>
-              <w:rPr>
-                <w:rFonts w:ascii="Arial" w:eastAsia="Arial" w:hAnsi="Arial" w:cs="Arial"/>
-                <w:color w:val="000000"/>
-                <w:sz w:val="16"/>
-                <w:szCs w:val="16"/>
+              <w:t xml:space="preserve">e) A asumir totalmente la responsabilidad legal, en el caso de que, al entregar los </w:t>
+            </w:r>
+            <w:r>
+              <w:rPr>
+                <w:rFonts w:ascii="Arial" w:eastAsia="Arial" w:hAnsi="Arial" w:cs="Arial"/>
+                <w:color w:val="000000"/>
+                <w:sz w:val="16"/>
+                <w:szCs w:val="16"/>
+              </w:rPr>
+              <w:t xml:space="preserve">bienes, infrinja o viole las normas en materia de patentes, marcas, obligaciones fiscales, de comercio, registros, derechos de autor, constancia de calidad, certificados analíticos de producto terminado, así como el resto de los documentos inherentes a la </w:t>
+            </w:r>
+            <w:r>
+              <w:rPr>
+                <w:rFonts w:ascii="Arial" w:eastAsia="Arial" w:hAnsi="Arial" w:cs="Arial"/>
+                <w:color w:val="000000"/>
+                <w:sz w:val="16"/>
+                <w:szCs w:val="16"/>
+              </w:rPr>
+              <w:t>entrega.</w:t>
+            </w:r>
+          </w:p>
+          <w:p>
+            <w:pPr>
+              <w:spacing w:after="0" w:line="276" w:lineRule="auto"/>
+              <w:ind w:left="170" w:right="170"/>
+              <w:jc w:val="both"/>
+              <w:rPr>
+                <w:rFonts w:ascii="Arial" w:eastAsia="Arial" w:hAnsi="Arial" w:cs="Arial"/>
+                <w:color w:val="000000"/>
+                <w:sz w:val="16"/>
+                <w:szCs w:val="16"/>
+              </w:rPr>
+            </w:pPr>
+          </w:p>
+          <w:p>
+            <w:pPr>
+              <w:spacing w:after="0" w:line="276" w:lineRule="auto"/>
+              <w:ind w:left="170" w:right="170"/>
+              <w:jc w:val="both"/>
+              <w:rPr>
+                <w:rFonts w:ascii="Arial" w:eastAsia="Arial" w:hAnsi="Arial" w:cs="Arial"/>
+                <w:color w:val="000000"/>
+                <w:sz w:val="16"/>
+                <w:szCs w:val="16"/>
+              </w:rPr>
+            </w:pPr>
+            <w:r>
+              <w:rPr>
+                <w:rFonts w:ascii="Arial" w:eastAsia="Arial" w:hAnsi="Arial" w:cs="Arial"/>
+                <w:color w:val="000000"/>
+                <w:sz w:val="16"/>
+                <w:szCs w:val="16"/>
+              </w:rPr>
+              <w:t xml:space="preserve">f) A garantizar la entrega de los bienes dentro de </w:t>
+            </w:r>
+            <w:r>
+              <w:rPr>
+                <w:rFonts w:ascii="Arial" w:eastAsia="Arial" w:hAnsi="Arial" w:cs="Arial"/>
+                <w:color w:val="000000"/>
+                <w:sz w:val="16"/>
+                <w:szCs w:val="16"/>
+                <w:u w:val="single"/>
               </w:rPr>
               <w:t>{</w:t>
             </w:r>
@@ -2565,6 +2650,7 @@
                 <w:rFonts w:ascii="Arial" w:eastAsia="Arial" w:hAnsi="Arial" w:cs="Arial"/>
                 <w:sz w:val="16"/>
                 <w:szCs w:val="16"/>
+                <w:u w:val="single"/>
               </w:rPr>
               <w:t>diasEntrega</w:t>
             </w:r>
@@ -2574,6 +2660,7 @@
                 <w:rFonts w:ascii="Arial" w:eastAsia="Arial" w:hAnsi="Arial" w:cs="Arial"/>
                 <w:sz w:val="16"/>
                 <w:szCs w:val="16"/>
+                <w:u w:val="single"/>
               </w:rPr>
               <w:t>}</w:t>
             </w:r>
@@ -2584,51 +2671,69 @@
                 <w:sz w:val="16"/>
                 <w:szCs w:val="16"/>
               </w:rPr>
-              <w:t>___ días</w:t>
-            </w:r>
-            <w:r>
-              <w:rPr>
-                <w:rFonts w:ascii="Arial" w:eastAsia="Arial" w:hAnsi="Arial" w:cs="Arial"/>
-                <w:color w:val="000000"/>
-                <w:sz w:val="16"/>
-                <w:szCs w:val="16"/>
-              </w:rPr>
-              <w:t xml:space="preserve"> naturales, durante la vigencia del contrato; asimismo, en caso de desabasto en el mercado o cualquier otro motivo, notificar mediante el correo electrónico en un plazo no mayor de 3 días naturales posteriores a la remisión del pedido, y contará con 7 días naturales posteriores a la notificación para cubrir el faltante.</w:t>
-            </w:r>
-          </w:p>
-          <w:p>
-            <w:pPr>
-              <w:spacing w:after="0" w:line="276" w:lineRule="auto"/>
-              <w:ind w:left="170" w:right="170"/>
-              <w:jc w:val="both"/>
-              <w:rPr>
-                <w:rFonts w:ascii="Arial" w:eastAsia="Arial" w:hAnsi="Arial" w:cs="Arial"/>
-                <w:color w:val="000000"/>
-                <w:sz w:val="16"/>
-                <w:szCs w:val="16"/>
-              </w:rPr>
-            </w:pPr>
-          </w:p>
-          <w:p>
-            <w:pPr>
-              <w:spacing w:after="0" w:line="276" w:lineRule="auto"/>
-              <w:ind w:left="170" w:right="170"/>
-              <w:jc w:val="both"/>
-              <w:rPr>
-                <w:rFonts w:ascii="Arial" w:eastAsia="Arial" w:hAnsi="Arial" w:cs="Arial"/>
-                <w:color w:val="000000"/>
-                <w:sz w:val="16"/>
-                <w:szCs w:val="16"/>
-              </w:rPr>
-            </w:pPr>
-            <w:r>
-              <w:rPr>
-                <w:rFonts w:ascii="Arial" w:eastAsia="Arial" w:hAnsi="Arial" w:cs="Arial"/>
-                <w:color w:val="000000"/>
-                <w:sz w:val="16"/>
-                <w:szCs w:val="16"/>
-              </w:rPr>
-              <w:t>5.- Los licitantes deberán presentar carta bajo protesta de decir verdad en hoja membretada, debidamente firmada por la persona autorizada para ello y sellada, donde se comprometa en caso de resultar adjudicado a lo siguiente:</w:t>
+              <w:t xml:space="preserve"> días</w:t>
+            </w:r>
+            <w:r>
+              <w:rPr>
+                <w:rFonts w:ascii="Arial" w:eastAsia="Arial" w:hAnsi="Arial" w:cs="Arial"/>
+                <w:color w:val="000000"/>
+                <w:sz w:val="16"/>
+                <w:szCs w:val="16"/>
+              </w:rPr>
+              <w:t xml:space="preserve"> naturales, durante la vigencia del contrato; asimismo, en caso de desabasto en el mercado o cualquier otro motivo, notificar mediante el correo electrónico en un plazo no mayor de 3 días naturales posteriores a la remisión del pedido, y contará con 7 días</w:t>
+            </w:r>
+            <w:r>
+              <w:rPr>
+                <w:rFonts w:ascii="Arial" w:eastAsia="Arial" w:hAnsi="Arial" w:cs="Arial"/>
+                <w:color w:val="000000"/>
+                <w:sz w:val="16"/>
+                <w:szCs w:val="16"/>
+              </w:rPr>
+              <w:t xml:space="preserve"> naturales posteriores a la notificación para cubrir el faltante.</w:t>
+            </w:r>
+          </w:p>
+          <w:p>
+            <w:pPr>
+              <w:spacing w:after="0" w:line="276" w:lineRule="auto"/>
+              <w:ind w:left="170" w:right="170"/>
+              <w:jc w:val="both"/>
+              <w:rPr>
+                <w:rFonts w:ascii="Arial" w:eastAsia="Arial" w:hAnsi="Arial" w:cs="Arial"/>
+                <w:color w:val="000000"/>
+                <w:sz w:val="16"/>
+                <w:szCs w:val="16"/>
+              </w:rPr>
+            </w:pPr>
+          </w:p>
+          <w:p>
+            <w:pPr>
+              <w:spacing w:after="0" w:line="276" w:lineRule="auto"/>
+              <w:ind w:left="170" w:right="170"/>
+              <w:jc w:val="both"/>
+              <w:rPr>
+                <w:rFonts w:ascii="Arial" w:eastAsia="Arial" w:hAnsi="Arial" w:cs="Arial"/>
+                <w:color w:val="000000"/>
+                <w:sz w:val="16"/>
+                <w:szCs w:val="16"/>
+              </w:rPr>
+            </w:pPr>
+            <w:r>
+              <w:rPr>
+                <w:rFonts w:ascii="Arial" w:eastAsia="Arial" w:hAnsi="Arial" w:cs="Arial"/>
+                <w:color w:val="000000"/>
+                <w:sz w:val="16"/>
+                <w:szCs w:val="16"/>
+              </w:rPr>
+              <w:t>5.- Los licitantes deberán presentar carta bajo protesta de decir verdad en hoja membretada, debidamente firmada por la persona autorizada para ello y sellada, donde se comprometa en caso d</w:t>
+            </w:r>
+            <w:r>
+              <w:rPr>
+                <w:rFonts w:ascii="Arial" w:eastAsia="Arial" w:hAnsi="Arial" w:cs="Arial"/>
+                <w:color w:val="000000"/>
+                <w:sz w:val="16"/>
+                <w:szCs w:val="16"/>
+              </w:rPr>
+              <w:t>e resultar adjudicado a lo siguiente:</w:t>
             </w:r>
           </w:p>
           <w:p>
@@ -2673,7 +2778,43 @@
                 <w:szCs w:val="16"/>
               </w:rPr>
               <w:tab/>
-              <w:t>A que aceptan y reconocen que toda la información, datos o documentación, que le sea proporcionada por la contratante, así como aquella a la que llegase a tener acceso, será considerada como confidencial, por lo que se obliga a mantener absoluta discreción y confidencialidad respecto de cualquier tipo de información, datos o documentación, así como a obligar a sus trabajadores y/o empleados a mantener en los mismos términos de discreción tales aspectos confidenciales y a no revelar a terceros el secreto profesional, la información comercial referente a los productos, marcas, patentes y/o secreto industrial de los que tengan o lleguen a tener conocimiento con motivo de la celebración del presente instrumento; datos personales en Términos de la normatividad en materia de protección de datos personales; información patrimonial o de operación; misma que se considerará como confidencial en términos de lo dispuesto por los artículos 116 de la Ley General de Transparencia y Acceso a la Información Pública; 7 fracción XVII, 11 y 134 de la Ley de Transparencia y Acceso a la Información Pública del Estado de Puebla.</w:t>
+              <w:t>A que aceptan y reconocen que toda la información, datos o documentación, que le sea proporcionada por la contratante, así como aquella a la que llegase a tener acceso, será considerada como confidencial, por lo qu</w:t>
+            </w:r>
+            <w:r>
+              <w:rPr>
+                <w:rFonts w:ascii="Arial" w:eastAsia="Arial" w:hAnsi="Arial" w:cs="Arial"/>
+                <w:color w:val="000000"/>
+                <w:sz w:val="16"/>
+                <w:szCs w:val="16"/>
+              </w:rPr>
+              <w:t>e se obliga a mantener absoluta discreción y confidencialidad respecto de cualquier tipo de información, datos o documentación, así como a obligar a sus trabajadores y/o empleados a mantener en los mismos términos de discreción tales aspectos confidenciale</w:t>
+            </w:r>
+            <w:r>
+              <w:rPr>
+                <w:rFonts w:ascii="Arial" w:eastAsia="Arial" w:hAnsi="Arial" w:cs="Arial"/>
+                <w:color w:val="000000"/>
+                <w:sz w:val="16"/>
+                <w:szCs w:val="16"/>
+              </w:rPr>
+              <w:t>s y a no revelar a terceros el secreto profesional, la información comercial referente a los productos, marcas, patentes y/o secreto industrial de los que tengan o lleguen a tener conocimiento con motivo de la celebración del presente instrumento; datos pe</w:t>
+            </w:r>
+            <w:r>
+              <w:rPr>
+                <w:rFonts w:ascii="Arial" w:eastAsia="Arial" w:hAnsi="Arial" w:cs="Arial"/>
+                <w:color w:val="000000"/>
+                <w:sz w:val="16"/>
+                <w:szCs w:val="16"/>
+              </w:rPr>
+              <w:t xml:space="preserve">rsonales en Términos de la normatividad en materia de protección de datos personales; información patrimonial o de operación; misma que se considerará como confidencial en términos de lo dispuesto por los artículos 116 de la Ley General de Transparencia y </w:t>
+            </w:r>
+            <w:r>
+              <w:rPr>
+                <w:rFonts w:ascii="Arial" w:eastAsia="Arial" w:hAnsi="Arial" w:cs="Arial"/>
+                <w:color w:val="000000"/>
+                <w:sz w:val="16"/>
+                <w:szCs w:val="16"/>
+              </w:rPr>
+              <w:t>Acceso a la Información Pública; 7 fracción XVII, 11 y 134 de la Ley de Transparencia y Acceso a la Información Pública del Estado de Puebla.</w:t>
             </w:r>
           </w:p>
           <w:p>
@@ -2795,7 +2936,16 @@
                 <w:szCs w:val="16"/>
               </w:rPr>
               <w:tab/>
-              <w:t xml:space="preserve">La obligación de no usar la información confidencial para beneficio propio o de terceras personas, debiendo utilizarla exclusivamente con el propósito de cumplir con la entrega de los bienes encomendados. </w:t>
+              <w:t>La obligación de no usar la información confidencial para beneficio propio o de terceras personas, debiendo utilizarla</w:t>
+            </w:r>
+            <w:r>
+              <w:rPr>
+                <w:rFonts w:ascii="Arial" w:eastAsia="Arial" w:hAnsi="Arial" w:cs="Arial"/>
+                <w:color w:val="000000"/>
+                <w:sz w:val="16"/>
+                <w:szCs w:val="16"/>
+              </w:rPr>
+              <w:t xml:space="preserve"> exclusivamente con el propósito de cumplir con la entrega de los bienes encomendados. </w:t>
             </w:r>
           </w:p>
           <w:p>
@@ -2827,7 +2977,16 @@
                 <w:szCs w:val="16"/>
               </w:rPr>
               <w:tab/>
-              <w:t>La obligación de no llevar a cabo ninguna acción que pueda llegar a comprometer o poner en riesgo la información, datos o documentación, que le sea proporcionada por los trabajadores o por la contratante.</w:t>
+              <w:t>La obligación de no llevar a cabo ninguna acción que pueda llegar a comprometer o poner en riesgo la información, datos o documentación, que le sea proporcionada p</w:t>
+            </w:r>
+            <w:r>
+              <w:rPr>
+                <w:rFonts w:ascii="Arial" w:eastAsia="Arial" w:hAnsi="Arial" w:cs="Arial"/>
+                <w:color w:val="000000"/>
+                <w:sz w:val="16"/>
+                <w:szCs w:val="16"/>
+              </w:rPr>
+              <w:t>or los trabajadores o por la contratante.</w:t>
             </w:r>
           </w:p>
           <w:p>
@@ -2859,7 +3018,16 @@
                 <w:szCs w:val="16"/>
               </w:rPr>
               <w:tab/>
-              <w:t>La obligación permanente de abstenerme de utilizar la información a la que tenga acceso con motivo de la celebración del presente instrumento, así como aquella que se genere con motivo de la ejecución del contrato respectivo; en perjuicio de la contratante.</w:t>
+              <w:t>La obligación permanente de abstenerme de utilizar la información a la que tenga acceso con motivo de la celebración del presente instrumento, así como aquella que se genere con motivo de la ejecución del contr</w:t>
+            </w:r>
+            <w:r>
+              <w:rPr>
+                <w:rFonts w:ascii="Arial" w:eastAsia="Arial" w:hAnsi="Arial" w:cs="Arial"/>
+                <w:color w:val="000000"/>
+                <w:sz w:val="16"/>
+                <w:szCs w:val="16"/>
+              </w:rPr>
+              <w:t>ato respectivo; en perjuicio de la contratante.</w:t>
             </w:r>
           </w:p>
           <w:p>
@@ -2891,42 +3059,60 @@
                 <w:szCs w:val="16"/>
               </w:rPr>
               <w:tab/>
-              <w:t>La obligación de abstenerme durante la vigencia del contrato respectivo de generar por medios propios o a través de terceros, actos o acciones que en forma alguna perjudiquen, demeriten, difamen, calumnien u ofendan la imagen pública de la contratante.</w:t>
-            </w:r>
-          </w:p>
-          <w:p>
-            <w:pPr>
-              <w:spacing w:after="0" w:line="276" w:lineRule="auto"/>
-              <w:ind w:left="170" w:right="170"/>
-              <w:jc w:val="both"/>
-              <w:rPr>
-                <w:rFonts w:ascii="Arial" w:eastAsia="Arial" w:hAnsi="Arial" w:cs="Arial"/>
-                <w:color w:val="000000"/>
-                <w:sz w:val="16"/>
-                <w:szCs w:val="16"/>
-              </w:rPr>
-            </w:pPr>
-          </w:p>
-          <w:p>
-            <w:pPr>
-              <w:spacing w:after="0" w:line="276" w:lineRule="auto"/>
-              <w:ind w:left="170" w:right="170"/>
-              <w:jc w:val="both"/>
-              <w:rPr>
-                <w:rFonts w:ascii="Arial" w:eastAsia="Arial" w:hAnsi="Arial" w:cs="Arial"/>
-                <w:color w:val="000000"/>
-                <w:sz w:val="16"/>
-                <w:szCs w:val="16"/>
-              </w:rPr>
-            </w:pPr>
-            <w:r>
-              <w:rPr>
-                <w:rFonts w:ascii="Arial" w:eastAsia="Arial" w:hAnsi="Arial" w:cs="Arial"/>
-                <w:color w:val="000000"/>
-                <w:sz w:val="16"/>
-                <w:szCs w:val="16"/>
-              </w:rPr>
-              <w:t>El incumplimiento a lo dispuesto en la presente dará lugar a la rescisión inmediata del contrato; en el entendido de que los representantes legales, empleados, asesores y/o prestadores de servicios, únicamente podrán hacer uso de la información contenida en el instrumento jurídico para el cumplimiento de sus funciones, sin que ello se entienda como una violación a la confidencialidad.</w:t>
+              <w:t>La obligación de abstenerme durante la vigencia del contrato respectivo de generar por medios propios o a través de terceros, actos o acciones que en forma alguna perjudiquen, demeriten, difamen, calumnien</w:t>
+            </w:r>
+            <w:r>
+              <w:rPr>
+                <w:rFonts w:ascii="Arial" w:eastAsia="Arial" w:hAnsi="Arial" w:cs="Arial"/>
+                <w:color w:val="000000"/>
+                <w:sz w:val="16"/>
+                <w:szCs w:val="16"/>
+              </w:rPr>
+              <w:t xml:space="preserve"> u ofendan la imagen pública de la contratante.</w:t>
+            </w:r>
+          </w:p>
+          <w:p>
+            <w:pPr>
+              <w:spacing w:after="0" w:line="276" w:lineRule="auto"/>
+              <w:ind w:left="170" w:right="170"/>
+              <w:jc w:val="both"/>
+              <w:rPr>
+                <w:rFonts w:ascii="Arial" w:eastAsia="Arial" w:hAnsi="Arial" w:cs="Arial"/>
+                <w:color w:val="000000"/>
+                <w:sz w:val="16"/>
+                <w:szCs w:val="16"/>
+              </w:rPr>
+            </w:pPr>
+          </w:p>
+          <w:p>
+            <w:pPr>
+              <w:spacing w:after="0" w:line="276" w:lineRule="auto"/>
+              <w:ind w:left="170" w:right="170"/>
+              <w:jc w:val="both"/>
+              <w:rPr>
+                <w:rFonts w:ascii="Arial" w:eastAsia="Arial" w:hAnsi="Arial" w:cs="Arial"/>
+                <w:color w:val="000000"/>
+                <w:sz w:val="16"/>
+                <w:szCs w:val="16"/>
+              </w:rPr>
+            </w:pPr>
+            <w:r>
+              <w:rPr>
+                <w:rFonts w:ascii="Arial" w:eastAsia="Arial" w:hAnsi="Arial" w:cs="Arial"/>
+                <w:color w:val="000000"/>
+                <w:sz w:val="16"/>
+                <w:szCs w:val="16"/>
+              </w:rPr>
+              <w:t>El incumplimiento a lo dispuesto en la presente dará lugar a la rescisión inmediata del contrato; en el entendido de que los representantes legales, empleados, asesores y/o prestadores de servicios, únicamen</w:t>
+            </w:r>
+            <w:r>
+              <w:rPr>
+                <w:rFonts w:ascii="Arial" w:eastAsia="Arial" w:hAnsi="Arial" w:cs="Arial"/>
+                <w:color w:val="000000"/>
+                <w:sz w:val="16"/>
+                <w:szCs w:val="16"/>
+              </w:rPr>
+              <w:t>te podrán hacer uso de la información contenida en el instrumento jurídico para el cumplimiento de sus funciones, sin que ello se entienda como una violación a la confidencialidad.</w:t>
             </w:r>
           </w:p>
           <w:p>
@@ -2962,77 +3148,149 @@
                 <w:szCs w:val="16"/>
               </w:rPr>
               <w:lastRenderedPageBreak/>
-              <w:t xml:space="preserve">Para efectos de lo anterior, se considerará como información confidencial, toda aquella documentación e información de carácter industrial, comercial, operativa, contable, legal, financiera, corporativa, de mercadotecnia, de ventas, métodos, procesos, formas de distribución, comercialización, formulas, técnicas, productos, maquinarias, mejoras, diseños, descubrimientos, estudios, compilaciones, programas de software, hardware, folletos, gráficas, o cualquier otro tipo de información, propiedad de la contratante a la que tenga acceso el adjudicado misma que podrá constar en documentos, formulas, cintas magnéticas, documentos impresos, medios electrónicos de cualquier tipo, programas de computadora, disquetes, discos magnéticos, películas o cualquier otro material o instrumentos similares que retengan información técnica, financiera, de mercadotecnia, de análisis, compilaciones, estudios, gráficas, información contable, legal o de cualquier otro tipo. </w:t>
-            </w:r>
-          </w:p>
-          <w:p>
-            <w:pPr>
-              <w:spacing w:after="0" w:line="276" w:lineRule="auto"/>
-              <w:ind w:left="170" w:right="170"/>
-              <w:jc w:val="both"/>
-              <w:rPr>
-                <w:rFonts w:ascii="Arial" w:eastAsia="Arial" w:hAnsi="Arial" w:cs="Arial"/>
-                <w:color w:val="000000"/>
-                <w:sz w:val="16"/>
-                <w:szCs w:val="16"/>
-              </w:rPr>
-            </w:pPr>
-          </w:p>
-          <w:p>
-            <w:pPr>
-              <w:spacing w:after="0" w:line="276" w:lineRule="auto"/>
-              <w:ind w:left="170" w:right="170"/>
-              <w:jc w:val="both"/>
-              <w:rPr>
-                <w:rFonts w:ascii="Arial" w:eastAsia="Arial" w:hAnsi="Arial" w:cs="Arial"/>
-                <w:color w:val="000000"/>
-                <w:sz w:val="16"/>
-                <w:szCs w:val="16"/>
-              </w:rPr>
-            </w:pPr>
-            <w:r>
-              <w:rPr>
-                <w:rFonts w:ascii="Arial" w:eastAsia="Arial" w:hAnsi="Arial" w:cs="Arial"/>
-                <w:color w:val="000000"/>
-                <w:sz w:val="16"/>
-                <w:szCs w:val="16"/>
-              </w:rPr>
-              <w:t>6.- Los licitantes deberán incluir en su propuesta técnica, constancia de inscripción en el padrón de proveedores del Municipio de CUAUTLANCINGO Puebla, vigente; en caso de no contar con registro vigente, los licitantes deberán presentar carta bajo protesta de decir verdad que, en caso de resultar adjudicados se comprometen a inscribirse en dicho Padrón durante la vigencia del contrato. (copia simple legible).</w:t>
-            </w:r>
-          </w:p>
-          <w:p>
-            <w:pPr>
-              <w:spacing w:after="0" w:line="276" w:lineRule="auto"/>
-              <w:ind w:left="170" w:right="170"/>
-              <w:jc w:val="both"/>
-              <w:rPr>
-                <w:rFonts w:ascii="Arial" w:eastAsia="Arial" w:hAnsi="Arial" w:cs="Arial"/>
-                <w:color w:val="000000"/>
-                <w:sz w:val="16"/>
-                <w:szCs w:val="16"/>
-              </w:rPr>
-            </w:pPr>
-          </w:p>
-          <w:p>
-            <w:pPr>
-              <w:spacing w:after="0" w:line="276" w:lineRule="auto"/>
-              <w:ind w:left="170" w:right="170"/>
-              <w:jc w:val="both"/>
-              <w:rPr>
-                <w:rFonts w:ascii="Arial" w:eastAsia="Arial" w:hAnsi="Arial" w:cs="Arial"/>
-                <w:color w:val="000000"/>
-                <w:sz w:val="16"/>
-                <w:szCs w:val="16"/>
-              </w:rPr>
-            </w:pPr>
-            <w:r>
-              <w:rPr>
-                <w:rFonts w:ascii="Arial" w:eastAsia="Arial" w:hAnsi="Arial" w:cs="Arial"/>
-                <w:color w:val="000000"/>
-                <w:sz w:val="16"/>
-                <w:szCs w:val="16"/>
-              </w:rPr>
-              <w:t>7.- Declaración de no encontrarse en ninguno de los supuestos previstos por el artículo 77 de la Ley de Adquisiciones, Arrendamientos y Servicios del Sector Público Estatal y Municipal, mediante carta original en hoja membretada, dirigida a la a la Convocante, indicando el número de procedimiento, la cual deberá estar debidamente foliada, sellada (obligatorio en caso de ser persona moral), suscrita y firmada en original por el representante legal o persona autorizada para ello, en la que manifieste bajo protesta de decir verdad que:</w:t>
+              <w:t>Para efectos de lo anterior, se considerará como información confidencial,</w:t>
+            </w:r>
+            <w:r>
+              <w:rPr>
+                <w:rFonts w:ascii="Arial" w:eastAsia="Arial" w:hAnsi="Arial" w:cs="Arial"/>
+                <w:color w:val="000000"/>
+                <w:sz w:val="16"/>
+                <w:szCs w:val="16"/>
+              </w:rPr>
+              <w:t xml:space="preserve"> toda aquella documentación e información de carácter industrial, comercial, operativa, contable, legal, financiera, corporativa, de mercadotecnia, de ventas, métodos, procesos, formas de distribución, comercialización, formulas, técnicas, productos, maqui</w:t>
+            </w:r>
+            <w:r>
+              <w:rPr>
+                <w:rFonts w:ascii="Arial" w:eastAsia="Arial" w:hAnsi="Arial" w:cs="Arial"/>
+                <w:color w:val="000000"/>
+                <w:sz w:val="16"/>
+                <w:szCs w:val="16"/>
+              </w:rPr>
+              <w:t>narias, mejoras, diseños, descubrimientos, estudios, compilaciones, programas de software, hardware, folletos, gráficas, o cualquier otro tipo de información, propiedad de la contratante a la que tenga acceso el adjudicado misma que podrá constar en docume</w:t>
+            </w:r>
+            <w:r>
+              <w:rPr>
+                <w:rFonts w:ascii="Arial" w:eastAsia="Arial" w:hAnsi="Arial" w:cs="Arial"/>
+                <w:color w:val="000000"/>
+                <w:sz w:val="16"/>
+                <w:szCs w:val="16"/>
+              </w:rPr>
+              <w:t>ntos, formulas, cintas magnéticas, documentos impresos, medios electrónicos de cualquier tipo, programas de computadora, disquetes, discos magnéticos, películas o cualquier otro material o instrumentos similares que retengan información técnica, financiera</w:t>
+            </w:r>
+            <w:r>
+              <w:rPr>
+                <w:rFonts w:ascii="Arial" w:eastAsia="Arial" w:hAnsi="Arial" w:cs="Arial"/>
+                <w:color w:val="000000"/>
+                <w:sz w:val="16"/>
+                <w:szCs w:val="16"/>
+              </w:rPr>
+              <w:t xml:space="preserve">, de mercadotecnia, de análisis, compilaciones, estudios, gráficas, información contable, legal o de cualquier otro tipo. </w:t>
+            </w:r>
+          </w:p>
+          <w:p>
+            <w:pPr>
+              <w:spacing w:after="0" w:line="276" w:lineRule="auto"/>
+              <w:ind w:left="170" w:right="170"/>
+              <w:jc w:val="both"/>
+              <w:rPr>
+                <w:rFonts w:ascii="Arial" w:eastAsia="Arial" w:hAnsi="Arial" w:cs="Arial"/>
+                <w:color w:val="000000"/>
+                <w:sz w:val="16"/>
+                <w:szCs w:val="16"/>
+              </w:rPr>
+            </w:pPr>
+          </w:p>
+          <w:p>
+            <w:pPr>
+              <w:spacing w:after="0" w:line="276" w:lineRule="auto"/>
+              <w:ind w:left="170" w:right="170"/>
+              <w:jc w:val="both"/>
+              <w:rPr>
+                <w:rFonts w:ascii="Arial" w:eastAsia="Arial" w:hAnsi="Arial" w:cs="Arial"/>
+                <w:color w:val="000000"/>
+                <w:sz w:val="16"/>
+                <w:szCs w:val="16"/>
+              </w:rPr>
+            </w:pPr>
+            <w:r>
+              <w:rPr>
+                <w:rFonts w:ascii="Arial" w:eastAsia="Arial" w:hAnsi="Arial" w:cs="Arial"/>
+                <w:color w:val="000000"/>
+                <w:sz w:val="16"/>
+                <w:szCs w:val="16"/>
+              </w:rPr>
+              <w:t xml:space="preserve">6.- Los licitantes deberán incluir en su propuesta técnica, constancia de inscripción en el padrón de proveedores del </w:t>
+            </w:r>
+            <w:r>
+              <w:rPr>
+                <w:rFonts w:ascii="Arial" w:eastAsia="Arial" w:hAnsi="Arial" w:cs="Arial"/>
+                <w:color w:val="000000"/>
+                <w:sz w:val="16"/>
+                <w:szCs w:val="16"/>
+              </w:rPr>
+              <w:t>Municipio de CUAUTLANCINGO Puebla, vigente; en caso de no contar con registro vigente, los licitantes deberán presentar carta bajo protesta de decir verdad que, en caso de resultar adjudicados se comprometen a inscribirse en dicho Padrón durante la vigenci</w:t>
+            </w:r>
+            <w:r>
+              <w:rPr>
+                <w:rFonts w:ascii="Arial" w:eastAsia="Arial" w:hAnsi="Arial" w:cs="Arial"/>
+                <w:color w:val="000000"/>
+                <w:sz w:val="16"/>
+                <w:szCs w:val="16"/>
+              </w:rPr>
+              <w:t>a del contrato. (copia simple legible).</w:t>
+            </w:r>
+          </w:p>
+          <w:p>
+            <w:pPr>
+              <w:spacing w:after="0" w:line="276" w:lineRule="auto"/>
+              <w:ind w:left="170" w:right="170"/>
+              <w:jc w:val="both"/>
+              <w:rPr>
+                <w:rFonts w:ascii="Arial" w:eastAsia="Arial" w:hAnsi="Arial" w:cs="Arial"/>
+                <w:color w:val="000000"/>
+                <w:sz w:val="16"/>
+                <w:szCs w:val="16"/>
+              </w:rPr>
+            </w:pPr>
+          </w:p>
+          <w:p>
+            <w:pPr>
+              <w:spacing w:after="0" w:line="276" w:lineRule="auto"/>
+              <w:ind w:left="170" w:right="170"/>
+              <w:jc w:val="both"/>
+              <w:rPr>
+                <w:rFonts w:ascii="Arial" w:eastAsia="Arial" w:hAnsi="Arial" w:cs="Arial"/>
+                <w:color w:val="000000"/>
+                <w:sz w:val="16"/>
+                <w:szCs w:val="16"/>
+              </w:rPr>
+            </w:pPr>
+            <w:r>
+              <w:rPr>
+                <w:rFonts w:ascii="Arial" w:eastAsia="Arial" w:hAnsi="Arial" w:cs="Arial"/>
+                <w:color w:val="000000"/>
+                <w:sz w:val="16"/>
+                <w:szCs w:val="16"/>
+              </w:rPr>
+              <w:t>7.- Declaración de no encontrarse en ninguno de los supuestos previstos por el artículo 77 de la Ley de Adquisiciones, Arrendamientos y Servicios del Sector Público Estatal y Municipal, mediante carta original en ho</w:t>
+            </w:r>
+            <w:r>
+              <w:rPr>
+                <w:rFonts w:ascii="Arial" w:eastAsia="Arial" w:hAnsi="Arial" w:cs="Arial"/>
+                <w:color w:val="000000"/>
+                <w:sz w:val="16"/>
+                <w:szCs w:val="16"/>
+              </w:rPr>
+              <w:t>ja membretada, dirigida a la a la Convocante, indicando el número de procedimiento, la cual deberá estar debidamente foliada, sellada (obligatorio en caso de ser persona moral), suscrita y firmada en original por el representante legal o persona autorizada</w:t>
+            </w:r>
+            <w:r>
+              <w:rPr>
+                <w:rFonts w:ascii="Arial" w:eastAsia="Arial" w:hAnsi="Arial" w:cs="Arial"/>
+                <w:color w:val="000000"/>
+                <w:sz w:val="16"/>
+                <w:szCs w:val="16"/>
+              </w:rPr>
+              <w:t xml:space="preserve"> para ello, en la que manifieste bajo protesta de decir verdad que:</w:t>
             </w:r>
           </w:p>
           <w:p>
@@ -3113,7 +3371,16 @@
                 <w:sz w:val="16"/>
                 <w:szCs w:val="16"/>
               </w:rPr>
-              <w:t xml:space="preserve">Que no me encuentro en ninguno de los supuestos previstos por el artículo 77 de la Ley de Adquisiciones, Arrendamientos y Servicios del Sector Público Estatal y Municipal </w:t>
+              <w:t>Que no me encuentro en ninguno de los supuestos previstos por el artículo 77 de la Ley de Adquisiciones, Arrendamientos y Servicios del Sector Público Estatal y Muni</w:t>
+            </w:r>
+            <w:r>
+              <w:rPr>
+                <w:rFonts w:ascii="Arial" w:eastAsia="Arial" w:hAnsi="Arial" w:cs="Arial"/>
+                <w:color w:val="000000"/>
+                <w:sz w:val="16"/>
+                <w:szCs w:val="16"/>
+              </w:rPr>
+              <w:t xml:space="preserve">cipal </w:t>
             </w:r>
           </w:p>
           <w:p>
@@ -3179,7 +3446,16 @@
                 <w:sz w:val="16"/>
                 <w:szCs w:val="16"/>
               </w:rPr>
-              <w:t>Que no me encuentro suspendido, cancelado, o inhabilitado por resolución de la Contraloría Municipal, para formalizar contrato alguno derivado de procedimientos de adjudicación de bienes, arrendamientos o servicios.</w:t>
+              <w:t>Que no me encuentro suspendido, cancelado, o inhabilitado por resolución de la Contraloría Municipal,</w:t>
+            </w:r>
+            <w:r>
+              <w:rPr>
+                <w:rFonts w:ascii="Arial" w:eastAsia="Arial" w:hAnsi="Arial" w:cs="Arial"/>
+                <w:color w:val="000000"/>
+                <w:sz w:val="16"/>
+                <w:szCs w:val="16"/>
+              </w:rPr>
+              <w:t xml:space="preserve"> para formalizar contrato alguno derivado de procedimientos de adjudicación de bienes, arrendamientos o servicios.</w:t>
             </w:r>
           </w:p>
           <w:p>
@@ -3280,7 +3556,16 @@
                 <w:sz w:val="16"/>
                 <w:szCs w:val="16"/>
               </w:rPr>
-              <w:t>Cuento con facultades suficientes para suscribir a nombre de mi representada la propuesta correspondiente.</w:t>
+              <w:t xml:space="preserve">Cuento con </w:t>
+            </w:r>
+            <w:r>
+              <w:rPr>
+                <w:rFonts w:ascii="Arial" w:eastAsia="Arial" w:hAnsi="Arial" w:cs="Arial"/>
+                <w:color w:val="000000"/>
+                <w:sz w:val="16"/>
+                <w:szCs w:val="16"/>
+              </w:rPr>
+              <w:t>facultades suficientes para suscribir a nombre de mi representada la propuesta correspondiente.</w:t>
             </w:r>
           </w:p>
           <w:p>
@@ -3346,7 +3631,16 @@
                 <w:sz w:val="16"/>
                 <w:szCs w:val="16"/>
               </w:rPr>
-              <w:t xml:space="preserve">Que no me encuentro en ninguno de los supuestos previstos por el artículo 77 de la Ley de Adquisiciones, Arrendamientos y Servicios del Sector Público Estatal y Municipal. </w:t>
+              <w:t>Que no me encuentro en ninguno de los supuestos previstos</w:t>
+            </w:r>
+            <w:r>
+              <w:rPr>
+                <w:rFonts w:ascii="Arial" w:eastAsia="Arial" w:hAnsi="Arial" w:cs="Arial"/>
+                <w:color w:val="000000"/>
+                <w:sz w:val="16"/>
+                <w:szCs w:val="16"/>
+              </w:rPr>
+              <w:t xml:space="preserve"> por el artículo 77 de la Ley de Adquisiciones, Arrendamientos y Servicios del Sector Público Estatal y Municipal. </w:t>
             </w:r>
           </w:p>
           <w:p>
@@ -3379,7 +3673,16 @@
                 <w:sz w:val="16"/>
                 <w:szCs w:val="16"/>
               </w:rPr>
-              <w:t>Que conozco el contenido y los requisitos que establece la Ley de Adquisiciones, Arrendamientos y Servicios del Sector Público Estatal y Municipal.</w:t>
+              <w:t>Que conozco el contenido y los requisitos que establece la Ley de Adquisiciones, Arrendamientos y Servicios del Sector Público Estatal y Mun</w:t>
+            </w:r>
+            <w:r>
+              <w:rPr>
+                <w:rFonts w:ascii="Arial" w:eastAsia="Arial" w:hAnsi="Arial" w:cs="Arial"/>
+                <w:color w:val="000000"/>
+                <w:sz w:val="16"/>
+                <w:szCs w:val="16"/>
+              </w:rPr>
+              <w:t>icipal.</w:t>
             </w:r>
           </w:p>
           <w:p>
@@ -3445,7 +3748,16 @@
                 <w:sz w:val="16"/>
                 <w:szCs w:val="16"/>
               </w:rPr>
-              <w:t xml:space="preserve">Que mi representado conoce el contenido y alcances de la invitación que rige el presente procedimiento de adjudicación. </w:t>
+              <w:t>Que mi representado conoce el co</w:t>
+            </w:r>
+            <w:r>
+              <w:rPr>
+                <w:rFonts w:ascii="Arial" w:eastAsia="Arial" w:hAnsi="Arial" w:cs="Arial"/>
+                <w:color w:val="000000"/>
+                <w:sz w:val="16"/>
+                <w:szCs w:val="16"/>
+              </w:rPr>
+              <w:t xml:space="preserve">ntenido y alcances de la invitación que rige el presente procedimiento de adjudicación. </w:t>
             </w:r>
           </w:p>
         </w:tc>
@@ -3531,77 +3843,113 @@
                 <w:sz w:val="16"/>
                 <w:szCs w:val="16"/>
               </w:rPr>
-              <w:t>1. Los licitantes deberán presentar junto con su propuesta económica, copia simple legible de su última declaración anual presentada con su respectivo acuse de recibo de la Servicio de Administración Tributaria (SAT) con el sello o liga digital correspondiente, y la última declaración provisional presentada (ISR e IVA) del mes inmediato anterior a la presentación de la proposición.</w:t>
-            </w:r>
-          </w:p>
-          <w:p>
-            <w:pPr>
-              <w:spacing w:after="0" w:line="276" w:lineRule="auto"/>
-              <w:ind w:left="170" w:right="170"/>
-              <w:jc w:val="both"/>
-              <w:rPr>
-                <w:rFonts w:ascii="Arial" w:eastAsia="Arial" w:hAnsi="Arial" w:cs="Arial"/>
-                <w:color w:val="000000"/>
-                <w:sz w:val="16"/>
-                <w:szCs w:val="16"/>
-              </w:rPr>
-            </w:pPr>
-          </w:p>
-          <w:p>
-            <w:pPr>
-              <w:spacing w:after="0" w:line="276" w:lineRule="auto"/>
-              <w:ind w:left="170" w:right="170"/>
-              <w:jc w:val="both"/>
-              <w:rPr>
-                <w:rFonts w:ascii="Arial" w:eastAsia="Arial" w:hAnsi="Arial" w:cs="Arial"/>
-                <w:color w:val="000000"/>
-                <w:sz w:val="16"/>
-                <w:szCs w:val="16"/>
-              </w:rPr>
-            </w:pPr>
-            <w:r>
-              <w:rPr>
-                <w:rFonts w:ascii="Arial" w:eastAsia="Arial" w:hAnsi="Arial" w:cs="Arial"/>
-                <w:color w:val="000000"/>
-                <w:sz w:val="16"/>
-                <w:szCs w:val="16"/>
-              </w:rPr>
-              <w:t>2. Los licitantes deberán presentar junto con su propuesta económica copia simple legible de la Opinión de Cumplimiento de obligaciones fiscales en sentido positivo emitida por la Servicio de Administración Tributaria (SAT), con el sello o liga digital correspondiente, dicho documento deberá haber sido expedido dentro de los 30 días naturales previos a la presentación de la propuesta.</w:t>
-            </w:r>
-          </w:p>
-          <w:p>
-            <w:pPr>
-              <w:spacing w:after="0" w:line="276" w:lineRule="auto"/>
-              <w:ind w:left="170" w:right="170"/>
-              <w:jc w:val="both"/>
-              <w:rPr>
-                <w:rFonts w:ascii="Arial" w:eastAsia="Arial" w:hAnsi="Arial" w:cs="Arial"/>
-                <w:color w:val="000000"/>
-                <w:sz w:val="16"/>
-                <w:szCs w:val="16"/>
-              </w:rPr>
-            </w:pPr>
-          </w:p>
-          <w:p>
-            <w:pPr>
-              <w:spacing w:after="0" w:line="276" w:lineRule="auto"/>
-              <w:ind w:left="170" w:right="170"/>
-              <w:jc w:val="both"/>
-              <w:rPr>
-                <w:rFonts w:ascii="Arial" w:eastAsia="Arial" w:hAnsi="Arial" w:cs="Arial"/>
-                <w:color w:val="000000"/>
-                <w:sz w:val="16"/>
-                <w:szCs w:val="16"/>
-              </w:rPr>
-            </w:pPr>
-            <w:r>
-              <w:rPr>
-                <w:rFonts w:ascii="Arial" w:eastAsia="Arial" w:hAnsi="Arial" w:cs="Arial"/>
-                <w:color w:val="000000"/>
-                <w:sz w:val="16"/>
-                <w:szCs w:val="16"/>
-              </w:rPr>
-              <w:t>3. Los licitantes deberán presentar su propuesta económica, Conforme al Anexo que se establezca en las bases o invitación correspondiente para presentar su propuesta económica.</w:t>
+              <w:t xml:space="preserve">1. Los licitantes deberán presentar junto con su propuesta económica, copia simple legible de su última declaración anual presentada con su </w:t>
+            </w:r>
+            <w:r>
+              <w:rPr>
+                <w:rFonts w:ascii="Arial" w:eastAsia="Arial" w:hAnsi="Arial" w:cs="Arial"/>
+                <w:color w:val="000000"/>
+                <w:sz w:val="16"/>
+                <w:szCs w:val="16"/>
+              </w:rPr>
+              <w:t>respectivo acuse de recibo de la Servicio de Administración Tributaria (SAT) con el sello o liga digital correspondiente, y la última declaración provisional presentada (ISR e IVA) del mes inmediato anterior a la presentación de la proposición.</w:t>
+            </w:r>
+          </w:p>
+          <w:p>
+            <w:pPr>
+              <w:spacing w:after="0" w:line="276" w:lineRule="auto"/>
+              <w:ind w:left="170" w:right="170"/>
+              <w:jc w:val="both"/>
+              <w:rPr>
+                <w:rFonts w:ascii="Arial" w:eastAsia="Arial" w:hAnsi="Arial" w:cs="Arial"/>
+                <w:color w:val="000000"/>
+                <w:sz w:val="16"/>
+                <w:szCs w:val="16"/>
+              </w:rPr>
+            </w:pPr>
+          </w:p>
+          <w:p>
+            <w:pPr>
+              <w:spacing w:after="0" w:line="276" w:lineRule="auto"/>
+              <w:ind w:left="170" w:right="170"/>
+              <w:jc w:val="both"/>
+              <w:rPr>
+                <w:rFonts w:ascii="Arial" w:eastAsia="Arial" w:hAnsi="Arial" w:cs="Arial"/>
+                <w:color w:val="000000"/>
+                <w:sz w:val="16"/>
+                <w:szCs w:val="16"/>
+              </w:rPr>
+            </w:pPr>
+            <w:r>
+              <w:rPr>
+                <w:rFonts w:ascii="Arial" w:eastAsia="Arial" w:hAnsi="Arial" w:cs="Arial"/>
+                <w:color w:val="000000"/>
+                <w:sz w:val="16"/>
+                <w:szCs w:val="16"/>
+              </w:rPr>
+              <w:t>2. Los lic</w:t>
+            </w:r>
+            <w:r>
+              <w:rPr>
+                <w:rFonts w:ascii="Arial" w:eastAsia="Arial" w:hAnsi="Arial" w:cs="Arial"/>
+                <w:color w:val="000000"/>
+                <w:sz w:val="16"/>
+                <w:szCs w:val="16"/>
+              </w:rPr>
+              <w:t>itantes deberán presentar junto con su propuesta económica copia simple legible de la Opinión de Cumplimiento de obligaciones fiscales en sentido positivo emitida por la Servicio de Administración Tributaria (SAT), con el sello o liga digital correspondien</w:t>
+            </w:r>
+            <w:r>
+              <w:rPr>
+                <w:rFonts w:ascii="Arial" w:eastAsia="Arial" w:hAnsi="Arial" w:cs="Arial"/>
+                <w:color w:val="000000"/>
+                <w:sz w:val="16"/>
+                <w:szCs w:val="16"/>
+              </w:rPr>
+              <w:t>te, dicho documento deberá haber sido expedido dentro de los 30 días naturales previos a la presentación de la propuesta.</w:t>
+            </w:r>
+          </w:p>
+          <w:p>
+            <w:pPr>
+              <w:spacing w:after="0" w:line="276" w:lineRule="auto"/>
+              <w:ind w:left="170" w:right="170"/>
+              <w:jc w:val="both"/>
+              <w:rPr>
+                <w:rFonts w:ascii="Arial" w:eastAsia="Arial" w:hAnsi="Arial" w:cs="Arial"/>
+                <w:color w:val="000000"/>
+                <w:sz w:val="16"/>
+                <w:szCs w:val="16"/>
+              </w:rPr>
+            </w:pPr>
+          </w:p>
+          <w:p>
+            <w:pPr>
+              <w:spacing w:after="0" w:line="276" w:lineRule="auto"/>
+              <w:ind w:left="170" w:right="170"/>
+              <w:jc w:val="both"/>
+              <w:rPr>
+                <w:rFonts w:ascii="Arial" w:eastAsia="Arial" w:hAnsi="Arial" w:cs="Arial"/>
+                <w:color w:val="000000"/>
+                <w:sz w:val="16"/>
+                <w:szCs w:val="16"/>
+              </w:rPr>
+            </w:pPr>
+            <w:r>
+              <w:rPr>
+                <w:rFonts w:ascii="Arial" w:eastAsia="Arial" w:hAnsi="Arial" w:cs="Arial"/>
+                <w:color w:val="000000"/>
+                <w:sz w:val="16"/>
+                <w:szCs w:val="16"/>
+              </w:rPr>
+              <w:t>3. Los licitantes deberán presentar su propuesta económica, Conforme al Anexo que se establezca en las bases o invitación correspondi</w:t>
+            </w:r>
+            <w:r>
+              <w:rPr>
+                <w:rFonts w:ascii="Arial" w:eastAsia="Arial" w:hAnsi="Arial" w:cs="Arial"/>
+                <w:color w:val="000000"/>
+                <w:sz w:val="16"/>
+                <w:szCs w:val="16"/>
+              </w:rPr>
+              <w:t>ente para presentar su propuesta económica.</w:t>
             </w:r>
           </w:p>
           <w:p>
@@ -3672,41 +4020,42 @@
                 <w:szCs w:val="16"/>
               </w:rPr>
               <w:lastRenderedPageBreak/>
-              <w:t xml:space="preserve">5. Los pagos se realizarán </w:t>
-            </w:r>
-            <w:r>
-              <w:rPr>
-                <w:rFonts w:ascii="Arial" w:eastAsia="Arial" w:hAnsi="Arial" w:cs="Arial"/>
-                <w:color w:val="000000"/>
-                <w:sz w:val="16"/>
-                <w:szCs w:val="16"/>
-              </w:rPr>
-              <w:t>___________</w:t>
-            </w:r>
-            <w:r>
-              <w:rPr>
-                <w:rFonts w:ascii="Arial" w:eastAsia="Arial" w:hAnsi="Arial" w:cs="Arial"/>
-                <w:color w:val="000000"/>
-                <w:sz w:val="16"/>
-                <w:szCs w:val="16"/>
+              <w:t>5. Los pagos se rea</w:t>
+            </w:r>
+            <w:r>
+              <w:rPr>
+                <w:rFonts w:ascii="Arial" w:eastAsia="Arial" w:hAnsi="Arial" w:cs="Arial"/>
+                <w:color w:val="000000"/>
+                <w:sz w:val="16"/>
+                <w:szCs w:val="16"/>
+              </w:rPr>
+              <w:t xml:space="preserve">lizarán </w:t>
+            </w:r>
+            <w:r>
+              <w:rPr>
+                <w:rFonts w:ascii="Arial" w:eastAsia="Arial" w:hAnsi="Arial" w:cs="Arial"/>
+                <w:color w:val="000000"/>
+                <w:sz w:val="16"/>
+                <w:szCs w:val="16"/>
+                <w:u w:val="single"/>
               </w:rPr>
               <w:t>{</w:t>
             </w:r>
-            <w:proofErr w:type="spellStart"/>
-            <w:r>
-              <w:rPr>
-                <w:rFonts w:ascii="Arial" w:eastAsia="Arial" w:hAnsi="Arial" w:cs="Arial"/>
-                <w:sz w:val="16"/>
-                <w:szCs w:val="16"/>
+            <w:r>
+              <w:rPr>
+                <w:rFonts w:ascii="Arial" w:eastAsia="Arial" w:hAnsi="Arial" w:cs="Arial"/>
+                <w:sz w:val="16"/>
+                <w:szCs w:val="16"/>
+                <w:u w:val="single"/>
               </w:rPr>
               <w:t>pagosSeRealizaran</w:t>
             </w:r>
-            <w:proofErr w:type="spellEnd"/>
-            <w:r>
-              <w:rPr>
-                <w:rFonts w:ascii="Arial" w:eastAsia="Arial" w:hAnsi="Arial" w:cs="Arial"/>
-                <w:sz w:val="16"/>
-                <w:szCs w:val="16"/>
+            <w:r>
+              <w:rPr>
+                <w:rFonts w:ascii="Arial" w:eastAsia="Arial" w:hAnsi="Arial" w:cs="Arial"/>
+                <w:sz w:val="16"/>
+                <w:szCs w:val="16"/>
+                <w:u w:val="single"/>
               </w:rPr>
               <w:t>}</w:t>
             </w:r>
@@ -3717,16 +4066,25 @@
                 <w:sz w:val="16"/>
                 <w:szCs w:val="16"/>
               </w:rPr>
-              <w:t>________,</w:t>
-            </w:r>
-            <w:r>
-              <w:rPr>
-                <w:rFonts w:ascii="Arial" w:eastAsia="Arial" w:hAnsi="Arial" w:cs="Arial"/>
-                <w:color w:val="000000"/>
-                <w:sz w:val="16"/>
-                <w:szCs w:val="16"/>
-              </w:rPr>
-              <w:t xml:space="preserve"> durante la vigencia del contrato respectivo, mediante trasferencia electrónica, dentro de los diez días hábiles posteriores a la presentación de las facturas, mismas que deberán estar debidamente requisitadas, posterior a la entrega de los bienes a entera satisfacción de la Contratante.</w:t>
+              <w:t>,</w:t>
+            </w:r>
+            <w:r>
+              <w:rPr>
+                <w:rFonts w:ascii="Arial" w:eastAsia="Arial" w:hAnsi="Arial" w:cs="Arial"/>
+                <w:color w:val="000000"/>
+                <w:sz w:val="16"/>
+                <w:szCs w:val="16"/>
+              </w:rPr>
+              <w:t xml:space="preserve"> durante la vigencia del contrato respectivo, mediante trasferencia electrónica, dentro de los diez días hábiles posteriores a la presentación de las facturas, mismas que deberán estar debidamente requisitadas</w:t>
+            </w:r>
+            <w:r>
+              <w:rPr>
+                <w:rFonts w:ascii="Arial" w:eastAsia="Arial" w:hAnsi="Arial" w:cs="Arial"/>
+                <w:color w:val="000000"/>
+                <w:sz w:val="16"/>
+                <w:szCs w:val="16"/>
+              </w:rPr>
+              <w:t>, posterior a la entrega de los bienes a entera satisfacción de la Contratante.</w:t>
             </w:r>
           </w:p>
           <w:p>
@@ -3920,7 +4278,16 @@
                 <w:sz w:val="16"/>
                 <w:szCs w:val="16"/>
               </w:rPr>
-              <w:t xml:space="preserve">7. Los licitantes deberán presentar junto con su propuesta económica, documento vigente con una antigüedad no mayor a 30 días naturales, expedido por el Instituto Mexicano del Seguro Social (IMSS) sobre la opinión de cumplimiento de obligaciones fiscales en materia de seguridad social en sentido positivo; la cual deberá tramitar el licitante en la página </w:t>
+              <w:t>7. Los licitantes deberán presentar junto con su propuesta económica, documento vigente con una antigüedad no mayor a 30 días naturales, expedido por el Instituto Mexic</w:t>
+            </w:r>
+            <w:r>
+              <w:rPr>
+                <w:rFonts w:ascii="Arial" w:eastAsia="Arial" w:hAnsi="Arial" w:cs="Arial"/>
+                <w:color w:val="000000"/>
+                <w:sz w:val="16"/>
+                <w:szCs w:val="16"/>
+              </w:rPr>
+              <w:t xml:space="preserve">ano del Seguro Social (IMSS) sobre la opinión de cumplimiento de obligaciones fiscales en materia de seguridad social en sentido positivo; la cual deberá tramitar el licitante en la página </w:t>
             </w:r>
             <w:hyperlink r:id="rId8">
               <w:r>
@@ -3967,7 +4334,34 @@
                 <w:sz w:val="16"/>
                 <w:szCs w:val="16"/>
               </w:rPr>
-              <w:t>8.- Los licitantes deberán presentar junto con su propuesta económica documento emitido por el Instituto del Fondo Nacional de la Vivienda para los Trabajadores (INFONAVIT), con antigüedad no mayor a 30 días naturales en el que se hará constar que el licitante no tiene adeudos con el organismo, firmado por el representante legal; en términos del acuerdo del H. Consejo de Administración del Instituto del Fondo Nacional de la Vivienda para los Trabajadores (INFONAVIT) por el que se emiten las reglas para la obtención de la constancia de situación fiscal en materia de aportaciones patronales y entero de descuentos, publicado en el diario oficial de la federación de fecha 28 de junio de 2017.</w:t>
+              <w:t xml:space="preserve">8.- </w:t>
+            </w:r>
+            <w:r>
+              <w:rPr>
+                <w:rFonts w:ascii="Arial" w:eastAsia="Arial" w:hAnsi="Arial" w:cs="Arial"/>
+                <w:color w:val="000000"/>
+                <w:sz w:val="16"/>
+                <w:szCs w:val="16"/>
+              </w:rPr>
+              <w:t>Los licitantes deberán presentar junto con su propuesta económica documento emitido por el Instituto del Fondo Nacional de la Vivienda para los Trabajadores (INFONAVIT), con antigüedad no mayor a 30 días naturales en el que se hará constar que el licitante</w:t>
+            </w:r>
+            <w:r>
+              <w:rPr>
+                <w:rFonts w:ascii="Arial" w:eastAsia="Arial" w:hAnsi="Arial" w:cs="Arial"/>
+                <w:color w:val="000000"/>
+                <w:sz w:val="16"/>
+                <w:szCs w:val="16"/>
+              </w:rPr>
+              <w:t xml:space="preserve"> no tiene adeudos con el organismo, firmado por el representante legal; en términos del acuerdo del H. Consejo de Administración del Instituto del Fondo Nacional de la Vivienda para los Trabajadores (INFONAVIT) por el que se emiten las reglas para la obten</w:t>
+            </w:r>
+            <w:r>
+              <w:rPr>
+                <w:rFonts w:ascii="Arial" w:eastAsia="Arial" w:hAnsi="Arial" w:cs="Arial"/>
+                <w:color w:val="000000"/>
+                <w:sz w:val="16"/>
+                <w:szCs w:val="16"/>
+              </w:rPr>
+              <w:t>ción de la constancia de situación fiscal en materia de aportaciones patronales y entero de descuentos, publicado en el diario oficial de la federación de fecha 28 de junio de 2017.</w:t>
             </w:r>
           </w:p>
         </w:tc>
@@ -4053,7 +4447,25 @@
                 <w:sz w:val="16"/>
                 <w:szCs w:val="16"/>
               </w:rPr>
-              <w:t>1. Los licitantes interesados en participar en procedimientos de adjudicación deberán presentar Constancia de No Adeudo, expedida por el Honorable Ayuntamiento de CUAUTLANCINGO o carta compromiso de conformidad con lo establecido por el artículo 19 fracción II, inciso i) de la Ley de Ingresos del Municipio de CUAUTLANCINGO para el ejercicio fiscal 2026 (con copia simple legible).</w:t>
+              <w:t xml:space="preserve">1. Los licitantes interesados en </w:t>
+            </w:r>
+            <w:r>
+              <w:rPr>
+                <w:rFonts w:ascii="Arial" w:eastAsia="Arial" w:hAnsi="Arial" w:cs="Arial"/>
+                <w:color w:val="000000"/>
+                <w:sz w:val="16"/>
+                <w:szCs w:val="16"/>
+              </w:rPr>
+              <w:t>participar en procedimientos de adjudicación deberán presentar Constancia de No Adeudo, expedida por el Honorable Ayuntamiento de CUAUTLANCINGO o carta compromiso de conformidad con lo establecido por el artículo 19 fracción II, inciso i) de la Ley de Ingr</w:t>
+            </w:r>
+            <w:r>
+              <w:rPr>
+                <w:rFonts w:ascii="Arial" w:eastAsia="Arial" w:hAnsi="Arial" w:cs="Arial"/>
+                <w:color w:val="000000"/>
+                <w:sz w:val="16"/>
+                <w:szCs w:val="16"/>
+              </w:rPr>
+              <w:t>esos del Municipio de CUAUTLANCINGO para el ejercicio fiscal 2026 (con copia simple legible).</w:t>
             </w:r>
           </w:p>
           <w:p>
@@ -4095,24 +4507,166 @@
                 <w:rFonts w:ascii="Arial" w:eastAsia="Arial" w:hAnsi="Arial" w:cs="Arial"/>
                 <w:sz w:val="16"/>
                 <w:szCs w:val="16"/>
+                <w:u w:val="single"/>
               </w:rPr>
               <w:t>{</w:t>
             </w:r>
+            <w:r>
+              <w:rPr>
+                <w:rFonts w:ascii="Arial" w:eastAsia="Arial" w:hAnsi="Arial" w:cs="Arial"/>
+                <w:sz w:val="16"/>
+                <w:szCs w:val="16"/>
+                <w:u w:val="single"/>
+              </w:rPr>
+              <w:t>adquisicionMedianteContrato</w:t>
+            </w:r>
+            <w:r>
+              <w:rPr>
+                <w:rFonts w:ascii="Arial" w:eastAsia="Arial" w:hAnsi="Arial" w:cs="Arial"/>
+                <w:sz w:val="16"/>
+                <w:szCs w:val="16"/>
+                <w:u w:val="single"/>
+              </w:rPr>
+              <w:t>}</w:t>
+            </w:r>
+            <w:r>
+              <w:rPr>
+                <w:rFonts w:ascii="Arial" w:eastAsia="Arial" w:hAnsi="Arial" w:cs="Arial"/>
+                <w:color w:val="000000"/>
+                <w:sz w:val="16"/>
+                <w:szCs w:val="16"/>
+              </w:rPr>
+              <w:t xml:space="preserve"> de conformidad a lo establecido en el </w:t>
+            </w:r>
+            <w:proofErr w:type="gramStart"/>
+            <w:r>
+              <w:rPr>
+                <w:rFonts w:ascii="Arial" w:eastAsia="Arial" w:hAnsi="Arial" w:cs="Arial"/>
+                <w:color w:val="000000"/>
+                <w:sz w:val="16"/>
+                <w:szCs w:val="16"/>
+              </w:rPr>
+              <w:t xml:space="preserve">artículo </w:t>
+            </w:r>
+            <w:r>
+              <w:rPr>
+                <w:rFonts w:ascii="Arial" w:eastAsia="Arial" w:hAnsi="Arial" w:cs="Arial"/>
+                <w:color w:val="000000"/>
+                <w:sz w:val="16"/>
+                <w:szCs w:val="16"/>
+              </w:rPr>
+              <w:t xml:space="preserve"> </w:t>
+            </w:r>
+            <w:r>
+              <w:rPr>
+                <w:rFonts w:ascii="Arial" w:eastAsia="Arial" w:hAnsi="Arial" w:cs="Arial"/>
+                <w:sz w:val="16"/>
+                <w:szCs w:val="16"/>
+                <w:u w:val="single"/>
+              </w:rPr>
+              <w:t>{</w:t>
+            </w:r>
+            <w:proofErr w:type="gramEnd"/>
+            <w:r>
+              <w:rPr>
+                <w:rFonts w:ascii="Arial" w:eastAsia="Arial" w:hAnsi="Arial" w:cs="Arial"/>
+                <w:sz w:val="16"/>
+                <w:szCs w:val="16"/>
+                <w:u w:val="single"/>
+              </w:rPr>
+              <w:t>conformidadArticulo}</w:t>
+            </w:r>
+            <w:r>
+              <w:rPr>
+                <w:rFonts w:ascii="Arial" w:eastAsia="Arial" w:hAnsi="Arial" w:cs="Arial"/>
+                <w:color w:val="000000"/>
+                <w:sz w:val="16"/>
+                <w:szCs w:val="16"/>
+              </w:rPr>
+              <w:t xml:space="preserve"> de la Ley de Adquisiciones, Arrendamiento, y Servicios del Sector Público Estatal y Municipal, por lo que la contratante está obligada a la adquisición de las cantidades mínimas </w:t>
+            </w:r>
+            <w:r>
+              <w:rPr>
+                <w:rFonts w:ascii="Arial" w:eastAsia="Arial" w:hAnsi="Arial" w:cs="Arial"/>
+                <w:color w:val="000000"/>
+                <w:sz w:val="16"/>
+                <w:szCs w:val="16"/>
+              </w:rPr>
+              <w:t>requeridas, quedando las máximas sujetas a las necesidades de la misma y suficiencia presupuestal de la Contratante.</w:t>
+            </w:r>
+          </w:p>
+          <w:p>
+            <w:pPr>
+              <w:spacing w:after="0" w:line="276" w:lineRule="auto"/>
+              <w:ind w:left="170" w:right="170"/>
+              <w:jc w:val="both"/>
+              <w:rPr>
+                <w:rFonts w:ascii="Arial" w:eastAsia="Arial" w:hAnsi="Arial" w:cs="Arial"/>
+                <w:color w:val="000000"/>
+                <w:sz w:val="16"/>
+                <w:szCs w:val="16"/>
+              </w:rPr>
+            </w:pPr>
+          </w:p>
+          <w:p>
+            <w:pPr>
+              <w:spacing w:after="0" w:line="276" w:lineRule="auto"/>
+              <w:ind w:left="170" w:right="170"/>
+              <w:jc w:val="both"/>
+              <w:rPr>
+                <w:rFonts w:ascii="Arial" w:eastAsia="Arial" w:hAnsi="Arial" w:cs="Arial"/>
+                <w:color w:val="000000"/>
+                <w:sz w:val="16"/>
+                <w:szCs w:val="16"/>
+              </w:rPr>
+            </w:pPr>
+            <w:r>
+              <w:rPr>
+                <w:rFonts w:ascii="Arial" w:eastAsia="Arial" w:hAnsi="Arial" w:cs="Arial"/>
+                <w:color w:val="000000"/>
+                <w:sz w:val="16"/>
+                <w:szCs w:val="16"/>
+              </w:rPr>
+              <w:t>3. Los bienes adjudicados deberán entregarse en</w:t>
+            </w:r>
+            <w:r>
+              <w:rPr>
+                <w:rFonts w:ascii="Arial" w:eastAsia="Arial" w:hAnsi="Arial" w:cs="Arial"/>
+                <w:color w:val="000000"/>
+                <w:sz w:val="16"/>
+                <w:szCs w:val="16"/>
+              </w:rPr>
+              <w:t xml:space="preserve"> </w:t>
+            </w:r>
+            <w:r>
+              <w:rPr>
+                <w:rFonts w:ascii="Arial" w:eastAsia="Arial" w:hAnsi="Arial" w:cs="Arial"/>
+                <w:color w:val="000000"/>
+                <w:sz w:val="16"/>
+                <w:szCs w:val="16"/>
+                <w:u w:val="single"/>
+              </w:rPr>
+              <w:t>{</w:t>
+            </w:r>
             <w:proofErr w:type="spellStart"/>
             <w:r>
               <w:rPr>
                 <w:rFonts w:ascii="Arial" w:eastAsia="Arial" w:hAnsi="Arial" w:cs="Arial"/>
-                <w:sz w:val="16"/>
-                <w:szCs w:val="16"/>
-              </w:rPr>
-              <w:t>adquisicionMedianteContrato</w:t>
+                <w:color w:val="000000"/>
+                <w:sz w:val="16"/>
+                <w:szCs w:val="16"/>
+                <w:u w:val="single"/>
+              </w:rPr>
+              <w:t>lugarEntrega</w:t>
             </w:r>
             <w:proofErr w:type="spellEnd"/>
             <w:r>
               <w:rPr>
                 <w:rFonts w:ascii="Arial" w:eastAsia="Arial" w:hAnsi="Arial" w:cs="Arial"/>
-                <w:sz w:val="16"/>
-                <w:szCs w:val="16"/>
+                <w:color w:val="000000"/>
+                <w:sz w:val="16"/>
+                <w:szCs w:val="16"/>
+                <w:u w:val="single"/>
               </w:rPr>
               <w:t>}</w:t>
             </w:r>
@@ -4123,13 +4677,43 @@
                 <w:sz w:val="16"/>
                 <w:szCs w:val="16"/>
               </w:rPr>
-              <w:t xml:space="preserve"> de conformidad a lo establecido en el artículo 107/108 </w:t>
-            </w:r>
-            <w:r>
-              <w:rPr>
-                <w:rFonts w:ascii="Arial" w:eastAsia="Arial" w:hAnsi="Arial" w:cs="Arial"/>
-                <w:sz w:val="16"/>
-                <w:szCs w:val="16"/>
+              <w:t xml:space="preserve">, en un horario de 9:00 A 15:00 horas de lunes a viernes en días </w:t>
+            </w:r>
+            <w:r>
+              <w:rPr>
+                <w:rFonts w:ascii="Arial" w:eastAsia="Arial" w:hAnsi="Arial" w:cs="Arial"/>
+                <w:color w:val="000000"/>
+                <w:sz w:val="16"/>
+                <w:szCs w:val="16"/>
+              </w:rPr>
+              <w:t xml:space="preserve">hábiles con el </w:t>
+            </w:r>
+            <w:proofErr w:type="gramStart"/>
+            <w:r>
+              <w:rPr>
+                <w:rFonts w:ascii="Arial" w:eastAsia="Arial" w:hAnsi="Arial" w:cs="Arial"/>
+                <w:color w:val="000000"/>
+                <w:sz w:val="16"/>
+                <w:szCs w:val="16"/>
+              </w:rPr>
+              <w:t>Jefe</w:t>
+            </w:r>
+            <w:proofErr w:type="gramEnd"/>
+            <w:r>
+              <w:rPr>
+                <w:rFonts w:ascii="Arial" w:eastAsia="Arial" w:hAnsi="Arial" w:cs="Arial"/>
+                <w:color w:val="000000"/>
+                <w:sz w:val="16"/>
+                <w:szCs w:val="16"/>
+              </w:rPr>
+              <w:t xml:space="preserve"> del Departamento (Homólogo y/o Superior) de </w:t>
+            </w:r>
+            <w:r>
+              <w:rPr>
+                <w:rFonts w:ascii="Arial" w:eastAsia="Arial" w:hAnsi="Arial" w:cs="Arial"/>
+                <w:sz w:val="16"/>
+                <w:szCs w:val="16"/>
+                <w:u w:val="single"/>
               </w:rPr>
               <w:t>{</w:t>
             </w:r>
@@ -4139,8 +4723,9 @@
                 <w:rFonts w:ascii="Arial" w:eastAsia="Arial" w:hAnsi="Arial" w:cs="Arial"/>
                 <w:sz w:val="16"/>
                 <w:szCs w:val="16"/>
-              </w:rPr>
-              <w:t>conformidadArticulo</w:t>
+                <w:u w:val="single"/>
+              </w:rPr>
+              <w:t>nombreDependenciaEntrega</w:t>
             </w:r>
             <w:proofErr w:type="spellEnd"/>
             <w:r>
@@ -4148,6 +4733,7 @@
                 <w:rFonts w:ascii="Arial" w:eastAsia="Arial" w:hAnsi="Arial" w:cs="Arial"/>
                 <w:sz w:val="16"/>
                 <w:szCs w:val="16"/>
+                <w:u w:val="single"/>
               </w:rPr>
               <w:t>}</w:t>
             </w:r>
@@ -4158,42 +4744,48 @@
                 <w:sz w:val="16"/>
                 <w:szCs w:val="16"/>
               </w:rPr>
-              <w:t xml:space="preserve"> de la Ley de Adquisiciones, Arrendamiento, y Servicios del Sector Público Estatal y Municipal, por lo que la contratante está obligada a la adquisición de las cantidades mínimas requeridas, quedando las máximas sujetas a las necesidades de la misma y suficiencia presupuestal de la Contratante.</w:t>
-            </w:r>
-          </w:p>
-          <w:p>
-            <w:pPr>
-              <w:spacing w:after="0" w:line="276" w:lineRule="auto"/>
-              <w:ind w:left="170" w:right="170"/>
-              <w:jc w:val="both"/>
-              <w:rPr>
-                <w:rFonts w:ascii="Arial" w:eastAsia="Arial" w:hAnsi="Arial" w:cs="Arial"/>
-                <w:color w:val="000000"/>
-                <w:sz w:val="16"/>
-                <w:szCs w:val="16"/>
-              </w:rPr>
-            </w:pPr>
-          </w:p>
-          <w:p>
-            <w:pPr>
-              <w:spacing w:after="0" w:line="276" w:lineRule="auto"/>
-              <w:ind w:left="170" w:right="170"/>
-              <w:jc w:val="both"/>
-              <w:rPr>
-                <w:rFonts w:ascii="Arial" w:eastAsia="Arial" w:hAnsi="Arial" w:cs="Arial"/>
-                <w:color w:val="000000"/>
-                <w:sz w:val="16"/>
-                <w:szCs w:val="16"/>
-              </w:rPr>
-            </w:pPr>
-            <w:r>
-              <w:rPr>
-                <w:rFonts w:ascii="Arial" w:eastAsia="Arial" w:hAnsi="Arial" w:cs="Arial"/>
-                <w:color w:val="000000"/>
-                <w:sz w:val="16"/>
-                <w:szCs w:val="16"/>
-              </w:rPr>
-              <w:t>3. Los bienes adjudicados deberán entregarse en</w:t>
+              <w:t xml:space="preserve">, en el número </w:t>
+            </w:r>
+            <w:r>
+              <w:rPr>
+                <w:rFonts w:ascii="Arial" w:eastAsia="Arial" w:hAnsi="Arial" w:cs="Arial"/>
+                <w:color w:val="000000"/>
+                <w:sz w:val="16"/>
+                <w:szCs w:val="16"/>
+                <w:u w:val="single"/>
+              </w:rPr>
+              <w:t>{</w:t>
+            </w:r>
+            <w:proofErr w:type="spellStart"/>
+            <w:r>
+              <w:rPr>
+                <w:rFonts w:ascii="Arial" w:eastAsia="Arial" w:hAnsi="Arial" w:cs="Arial"/>
+                <w:color w:val="000000"/>
+                <w:sz w:val="16"/>
+                <w:szCs w:val="16"/>
+                <w:u w:val="single"/>
+              </w:rPr>
+              <w:t>telefonoEntrega</w:t>
+            </w:r>
+            <w:proofErr w:type="spellEnd"/>
+            <w:r>
+              <w:rPr>
+                <w:rFonts w:ascii="Arial" w:eastAsia="Arial" w:hAnsi="Arial" w:cs="Arial"/>
+                <w:color w:val="000000"/>
+                <w:sz w:val="16"/>
+                <w:szCs w:val="16"/>
+                <w:u w:val="single"/>
+              </w:rPr>
+              <w:t>}</w:t>
+            </w:r>
+            <w:r>
+              <w:rPr>
+                <w:rFonts w:ascii="Arial" w:eastAsia="Arial" w:hAnsi="Arial" w:cs="Arial"/>
+                <w:color w:val="000000"/>
+                <w:sz w:val="16"/>
+                <w:szCs w:val="16"/>
+              </w:rPr>
+              <w:t>,</w:t>
             </w:r>
             <w:r>
               <w:rPr>
@@ -4211,14 +4803,98 @@
                 <w:sz w:val="16"/>
                 <w:szCs w:val="16"/>
               </w:rPr>
-              <w:t>___</w:t>
-            </w:r>
-            <w:r>
-              <w:rPr>
-                <w:rFonts w:ascii="Arial" w:eastAsia="Arial" w:hAnsi="Arial" w:cs="Arial"/>
-                <w:color w:val="000000"/>
-                <w:sz w:val="16"/>
-                <w:szCs w:val="16"/>
+              <w:t xml:space="preserve">ext. </w:t>
+            </w:r>
+            <w:r>
+              <w:rPr>
+                <w:rFonts w:ascii="Arial" w:eastAsia="Arial" w:hAnsi="Arial" w:cs="Arial"/>
+                <w:sz w:val="16"/>
+                <w:szCs w:val="16"/>
+                <w:u w:val="single"/>
+              </w:rPr>
+              <w:t>{extencionTelefonoEntre</w:t>
+            </w:r>
+            <w:r>
+              <w:rPr>
+                <w:rFonts w:ascii="Arial" w:eastAsia="Arial" w:hAnsi="Arial" w:cs="Arial"/>
+                <w:sz w:val="16"/>
+                <w:szCs w:val="16"/>
+                <w:u w:val="single"/>
+              </w:rPr>
+              <w:t>g</w:t>
+            </w:r>
+            <w:r>
+              <w:rPr>
+                <w:rFonts w:ascii="Arial" w:eastAsia="Arial" w:hAnsi="Arial" w:cs="Arial"/>
+                <w:sz w:val="16"/>
+                <w:szCs w:val="16"/>
+                <w:u w:val="single"/>
+              </w:rPr>
+              <w:t>a}</w:t>
+            </w:r>
+            <w:r>
+              <w:rPr>
+                <w:rFonts w:ascii="Arial" w:eastAsia="Arial" w:hAnsi="Arial" w:cs="Arial"/>
+                <w:color w:val="000000"/>
+                <w:sz w:val="16"/>
+                <w:szCs w:val="16"/>
+              </w:rPr>
+              <w:t>, previa cita.</w:t>
+            </w:r>
+          </w:p>
+          <w:p>
+            <w:pPr>
+              <w:spacing w:after="0" w:line="276" w:lineRule="auto"/>
+              <w:ind w:left="170" w:right="170"/>
+              <w:jc w:val="both"/>
+              <w:rPr>
+                <w:rFonts w:ascii="Arial" w:eastAsia="Arial" w:hAnsi="Arial" w:cs="Arial"/>
+                <w:sz w:val="16"/>
+                <w:szCs w:val="16"/>
+              </w:rPr>
+            </w:pPr>
+          </w:p>
+          <w:p>
+            <w:pPr>
+              <w:spacing w:after="0" w:line="276" w:lineRule="auto"/>
+              <w:ind w:left="170" w:right="170"/>
+              <w:jc w:val="both"/>
+              <w:rPr>
+                <w:rFonts w:ascii="Arial" w:eastAsia="Arial" w:hAnsi="Arial" w:cs="Arial"/>
+                <w:color w:val="000000"/>
+                <w:sz w:val="16"/>
+                <w:szCs w:val="16"/>
+              </w:rPr>
+            </w:pPr>
+          </w:p>
+          <w:p>
+            <w:pPr>
+              <w:spacing w:after="0" w:line="276" w:lineRule="auto"/>
+              <w:ind w:left="170" w:right="170"/>
+              <w:jc w:val="both"/>
+              <w:rPr>
+                <w:rFonts w:ascii="Arial" w:eastAsia="Arial" w:hAnsi="Arial" w:cs="Arial"/>
+                <w:color w:val="000000"/>
+                <w:sz w:val="16"/>
+                <w:szCs w:val="16"/>
+              </w:rPr>
+            </w:pPr>
+            <w:r>
+              <w:rPr>
+                <w:rFonts w:ascii="Arial" w:eastAsia="Arial" w:hAnsi="Arial" w:cs="Arial"/>
+                <w:color w:val="000000"/>
+                <w:sz w:val="16"/>
+                <w:szCs w:val="16"/>
+              </w:rPr>
+              <w:t xml:space="preserve">4. La entrega de bienes solicitados deberá realizarse dentro de los </w:t>
+            </w:r>
+            <w:r>
+              <w:rPr>
+                <w:rFonts w:ascii="Arial" w:eastAsia="Arial" w:hAnsi="Arial" w:cs="Arial"/>
+                <w:color w:val="000000"/>
+                <w:sz w:val="16"/>
+                <w:szCs w:val="16"/>
+                <w:u w:val="single"/>
               </w:rPr>
               <w:t>{</w:t>
             </w:r>
@@ -4229,8 +4905,9 @@
                 <w:color w:val="000000"/>
                 <w:sz w:val="16"/>
                 <w:szCs w:val="16"/>
-              </w:rPr>
-              <w:t>lugarEntrega</w:t>
+                <w:u w:val="single"/>
+              </w:rPr>
+              <w:t>diasEntrega</w:t>
             </w:r>
             <w:proofErr w:type="spellEnd"/>
             <w:r>
@@ -4239,6 +4916,7 @@
                 <w:color w:val="000000"/>
                 <w:sz w:val="16"/>
                 <w:szCs w:val="16"/>
+                <w:u w:val="single"/>
               </w:rPr>
               <w:t>}</w:t>
             </w:r>
@@ -4249,269 +4927,51 @@
                 <w:sz w:val="16"/>
                 <w:szCs w:val="16"/>
               </w:rPr>
-              <w:t>___, en un horario de 9:00 A 15:00 horas de lunes a viernes en días hábiles con el Jefe del Departamento (Homólogo y/o Superior) de __</w:t>
-            </w:r>
-            <w:r>
-              <w:rPr>
-                <w:rFonts w:ascii="Arial" w:eastAsia="Arial" w:hAnsi="Arial" w:cs="Arial"/>
-                <w:sz w:val="16"/>
-                <w:szCs w:val="16"/>
-              </w:rPr>
-              <w:t>{</w:t>
-            </w:r>
-            <w:proofErr w:type="spellStart"/>
-            <w:r>
-              <w:rPr>
-                <w:rFonts w:ascii="Arial" w:eastAsia="Arial" w:hAnsi="Arial" w:cs="Arial"/>
-                <w:sz w:val="16"/>
-                <w:szCs w:val="16"/>
-              </w:rPr>
-              <w:t>nombreDependenciaEntrega</w:t>
-            </w:r>
-            <w:proofErr w:type="spellEnd"/>
-            <w:r>
-              <w:rPr>
-                <w:rFonts w:ascii="Arial" w:eastAsia="Arial" w:hAnsi="Arial" w:cs="Arial"/>
-                <w:sz w:val="16"/>
-                <w:szCs w:val="16"/>
-              </w:rPr>
-              <w:t>}</w:t>
-            </w:r>
-            <w:r>
-              <w:rPr>
-                <w:rFonts w:ascii="Arial" w:eastAsia="Arial" w:hAnsi="Arial" w:cs="Arial"/>
-                <w:color w:val="000000"/>
-                <w:sz w:val="16"/>
-                <w:szCs w:val="16"/>
-              </w:rPr>
-              <w:t>__, en el número _</w:t>
-            </w:r>
-            <w:r>
-              <w:rPr>
-                <w:rFonts w:ascii="Arial" w:eastAsia="Arial" w:hAnsi="Arial" w:cs="Arial"/>
-                <w:color w:val="000000"/>
-                <w:sz w:val="16"/>
-                <w:szCs w:val="16"/>
-              </w:rPr>
-              <w:t>{</w:t>
-            </w:r>
-            <w:proofErr w:type="spellStart"/>
-            <w:r>
-              <w:rPr>
-                <w:rFonts w:ascii="Arial" w:eastAsia="Arial" w:hAnsi="Arial" w:cs="Arial"/>
-                <w:color w:val="000000"/>
-                <w:sz w:val="16"/>
-                <w:szCs w:val="16"/>
-              </w:rPr>
-              <w:t>telefonoEntrega</w:t>
-            </w:r>
-            <w:proofErr w:type="spellEnd"/>
-            <w:r>
-              <w:rPr>
-                <w:rFonts w:ascii="Arial" w:eastAsia="Arial" w:hAnsi="Arial" w:cs="Arial"/>
-                <w:color w:val="000000"/>
-                <w:sz w:val="16"/>
-                <w:szCs w:val="16"/>
-              </w:rPr>
-              <w:t>},</w:t>
-            </w:r>
-            <w:r>
-              <w:rPr>
-                <w:rFonts w:ascii="Arial" w:eastAsia="Arial" w:hAnsi="Arial" w:cs="Arial"/>
-                <w:color w:val="000000"/>
-                <w:sz w:val="16"/>
-                <w:szCs w:val="16"/>
-              </w:rPr>
-              <w:t xml:space="preserve"> </w:t>
-            </w:r>
-            <w:r>
-              <w:rPr>
-                <w:rFonts w:ascii="Arial" w:eastAsia="Arial" w:hAnsi="Arial" w:cs="Arial"/>
-                <w:color w:val="000000"/>
-                <w:sz w:val="16"/>
-                <w:szCs w:val="16"/>
-              </w:rPr>
-              <w:t>___ext. _</w:t>
-            </w:r>
-            <w:r>
-              <w:rPr>
-                <w:rFonts w:ascii="Arial" w:eastAsia="Arial" w:hAnsi="Arial" w:cs="Arial"/>
-                <w:sz w:val="16"/>
-                <w:szCs w:val="16"/>
-              </w:rPr>
-              <w:t>{</w:t>
-            </w:r>
-            <w:proofErr w:type="spellStart"/>
-            <w:r>
-              <w:rPr>
-                <w:rFonts w:ascii="Arial" w:eastAsia="Arial" w:hAnsi="Arial" w:cs="Arial"/>
-                <w:sz w:val="16"/>
-                <w:szCs w:val="16"/>
-              </w:rPr>
-              <w:t>extencionTelefonoEntre</w:t>
-            </w:r>
-            <w:r>
-              <w:rPr>
-                <w:rFonts w:ascii="Arial" w:eastAsia="Arial" w:hAnsi="Arial" w:cs="Arial"/>
-                <w:sz w:val="16"/>
-                <w:szCs w:val="16"/>
-              </w:rPr>
-              <w:t>g</w:t>
-            </w:r>
-            <w:r>
-              <w:rPr>
-                <w:rFonts w:ascii="Arial" w:eastAsia="Arial" w:hAnsi="Arial" w:cs="Arial"/>
-                <w:sz w:val="16"/>
-                <w:szCs w:val="16"/>
-              </w:rPr>
-              <w:t>a</w:t>
-            </w:r>
-            <w:proofErr w:type="spellEnd"/>
-            <w:r>
-              <w:rPr>
-                <w:rFonts w:ascii="Arial" w:eastAsia="Arial" w:hAnsi="Arial" w:cs="Arial"/>
-                <w:sz w:val="16"/>
-                <w:szCs w:val="16"/>
-              </w:rPr>
-              <w:t>}</w:t>
-            </w:r>
-            <w:r>
-              <w:rPr>
-                <w:rFonts w:ascii="Arial" w:eastAsia="Arial" w:hAnsi="Arial" w:cs="Arial"/>
-                <w:color w:val="000000"/>
-                <w:sz w:val="16"/>
-                <w:szCs w:val="16"/>
-              </w:rPr>
-              <w:t xml:space="preserve"> </w:t>
-            </w:r>
-            <w:r>
-              <w:rPr>
-                <w:rFonts w:ascii="Arial" w:eastAsia="Arial" w:hAnsi="Arial" w:cs="Arial"/>
-                <w:color w:val="000000"/>
-                <w:sz w:val="16"/>
-                <w:szCs w:val="16"/>
-              </w:rPr>
-              <w:t>_, previa cita.</w:t>
-            </w:r>
-          </w:p>
-          <w:p>
-            <w:pPr>
-              <w:spacing w:after="0" w:line="276" w:lineRule="auto"/>
-              <w:ind w:left="170" w:right="170"/>
-              <w:jc w:val="both"/>
-              <w:rPr>
-                <w:rFonts w:ascii="Arial" w:eastAsia="Arial" w:hAnsi="Arial" w:cs="Arial"/>
-                <w:sz w:val="16"/>
-                <w:szCs w:val="16"/>
-              </w:rPr>
-            </w:pPr>
-          </w:p>
-          <w:p>
-            <w:pPr>
-              <w:spacing w:after="0" w:line="276" w:lineRule="auto"/>
-              <w:ind w:left="170" w:right="170"/>
-              <w:jc w:val="both"/>
-              <w:rPr>
-                <w:rFonts w:ascii="Arial" w:eastAsia="Arial" w:hAnsi="Arial" w:cs="Arial"/>
-                <w:color w:val="000000"/>
-                <w:sz w:val="16"/>
-                <w:szCs w:val="16"/>
-              </w:rPr>
-            </w:pPr>
-          </w:p>
-          <w:p>
-            <w:pPr>
-              <w:spacing w:after="0" w:line="276" w:lineRule="auto"/>
-              <w:ind w:left="170" w:right="170"/>
-              <w:jc w:val="both"/>
-              <w:rPr>
-                <w:rFonts w:ascii="Arial" w:eastAsia="Arial" w:hAnsi="Arial" w:cs="Arial"/>
-                <w:color w:val="000000"/>
-                <w:sz w:val="16"/>
-                <w:szCs w:val="16"/>
-              </w:rPr>
-            </w:pPr>
-            <w:r>
-              <w:rPr>
-                <w:rFonts w:ascii="Arial" w:eastAsia="Arial" w:hAnsi="Arial" w:cs="Arial"/>
-                <w:color w:val="000000"/>
-                <w:sz w:val="16"/>
-                <w:szCs w:val="16"/>
-              </w:rPr>
-              <w:t>4. La entrega de bienes solicitados deberá realizarse dentro de los _________</w:t>
-            </w:r>
-            <w:r>
-              <w:rPr>
-                <w:rFonts w:ascii="Arial" w:eastAsia="Arial" w:hAnsi="Arial" w:cs="Arial"/>
-                <w:color w:val="000000"/>
-                <w:sz w:val="16"/>
-                <w:szCs w:val="16"/>
-              </w:rPr>
-              <w:t>{</w:t>
-            </w:r>
-            <w:proofErr w:type="spellStart"/>
-            <w:r>
-              <w:rPr>
-                <w:rFonts w:ascii="Arial" w:eastAsia="Arial" w:hAnsi="Arial" w:cs="Arial"/>
-                <w:color w:val="000000"/>
-                <w:sz w:val="16"/>
-                <w:szCs w:val="16"/>
-              </w:rPr>
-              <w:t>diasEntrega</w:t>
-            </w:r>
-            <w:proofErr w:type="spellEnd"/>
-            <w:r>
-              <w:rPr>
-                <w:rFonts w:ascii="Arial" w:eastAsia="Arial" w:hAnsi="Arial" w:cs="Arial"/>
-                <w:color w:val="000000"/>
-                <w:sz w:val="16"/>
-                <w:szCs w:val="16"/>
-              </w:rPr>
-              <w:t>}</w:t>
-            </w:r>
-            <w:r>
-              <w:rPr>
-                <w:rFonts w:ascii="Arial" w:eastAsia="Arial" w:hAnsi="Arial" w:cs="Arial"/>
-                <w:color w:val="000000"/>
-                <w:sz w:val="16"/>
-                <w:szCs w:val="16"/>
-              </w:rPr>
-              <w:t>________ días naturales, posteriores a cada solicitud remitida por correo electrónico al Proveedor, durante la vigencia del contrato y será en el domicilio señalado.</w:t>
-            </w:r>
-          </w:p>
-          <w:p>
-            <w:pPr>
-              <w:spacing w:after="0" w:line="276" w:lineRule="auto"/>
-              <w:ind w:left="170" w:right="170"/>
-              <w:jc w:val="both"/>
-              <w:rPr>
-                <w:rFonts w:ascii="Arial" w:eastAsia="Arial" w:hAnsi="Arial" w:cs="Arial"/>
-                <w:color w:val="000000"/>
-                <w:sz w:val="16"/>
-                <w:szCs w:val="16"/>
-              </w:rPr>
-            </w:pPr>
-          </w:p>
-          <w:p>
-            <w:pPr>
-              <w:spacing w:after="0" w:line="276" w:lineRule="auto"/>
-              <w:ind w:left="170" w:right="170"/>
-              <w:jc w:val="both"/>
-              <w:rPr>
-                <w:rFonts w:ascii="Arial" w:eastAsia="Arial" w:hAnsi="Arial" w:cs="Arial"/>
-                <w:color w:val="000000"/>
-                <w:sz w:val="16"/>
-                <w:szCs w:val="16"/>
-              </w:rPr>
-            </w:pPr>
-            <w:r>
-              <w:rPr>
-                <w:rFonts w:ascii="Arial" w:eastAsia="Arial" w:hAnsi="Arial" w:cs="Arial"/>
-                <w:color w:val="000000"/>
-                <w:sz w:val="16"/>
-                <w:szCs w:val="16"/>
-              </w:rPr>
-              <w:t>Para efectos de la entrega correspondiente en caso sea en día inhábil o festivo la entrega se efectuará al siguiente día hábil.</w:t>
+              <w:t xml:space="preserve"> días naturales, posteriores a cada solicitud remitida por correo electrónico al Proveedor, durante la vigencia del contrato y será en el domicilio señalado.</w:t>
+            </w:r>
+          </w:p>
+          <w:p>
+            <w:pPr>
+              <w:spacing w:after="0" w:line="276" w:lineRule="auto"/>
+              <w:ind w:left="170" w:right="170"/>
+              <w:jc w:val="both"/>
+              <w:rPr>
+                <w:rFonts w:ascii="Arial" w:eastAsia="Arial" w:hAnsi="Arial" w:cs="Arial"/>
+                <w:color w:val="000000"/>
+                <w:sz w:val="16"/>
+                <w:szCs w:val="16"/>
+              </w:rPr>
+            </w:pPr>
+          </w:p>
+          <w:p>
+            <w:pPr>
+              <w:spacing w:after="0" w:line="276" w:lineRule="auto"/>
+              <w:ind w:left="170" w:right="170"/>
+              <w:jc w:val="both"/>
+              <w:rPr>
+                <w:rFonts w:ascii="Arial" w:eastAsia="Arial" w:hAnsi="Arial" w:cs="Arial"/>
+                <w:color w:val="000000"/>
+                <w:sz w:val="16"/>
+                <w:szCs w:val="16"/>
+              </w:rPr>
+            </w:pPr>
+            <w:r>
+              <w:rPr>
+                <w:rFonts w:ascii="Arial" w:eastAsia="Arial" w:hAnsi="Arial" w:cs="Arial"/>
+                <w:color w:val="000000"/>
+                <w:sz w:val="16"/>
+                <w:szCs w:val="16"/>
+              </w:rPr>
+              <w:t xml:space="preserve">Para efectos de la entrega correspondiente en caso sea en día inhábil o </w:t>
+            </w:r>
+            <w:r>
+              <w:rPr>
+                <w:rFonts w:ascii="Arial" w:eastAsia="Arial" w:hAnsi="Arial" w:cs="Arial"/>
+                <w:color w:val="000000"/>
+                <w:sz w:val="16"/>
+                <w:szCs w:val="16"/>
+              </w:rPr>
+              <w:t>festivo la entrega se efectuará al siguiente día hábil.</w:t>
             </w:r>
           </w:p>
           <w:p>
@@ -4651,7 +5111,16 @@
                 <w:sz w:val="16"/>
                 <w:szCs w:val="16"/>
               </w:rPr>
-              <w:t>C) Acta constitutiva de la persona jurídica o acta de nacimiento en caso de ser persona física. Para el caso de que la persona moral haya tenido modificaciones a su acta constitutiva, deberá presentar las últimas modificaciones correspondientes.</w:t>
+              <w:t>C) Acta constitutiva de la persona jurídica o acta de nacimiento en caso de ser persona física. Para el c</w:t>
+            </w:r>
+            <w:r>
+              <w:rPr>
+                <w:rFonts w:ascii="Arial" w:eastAsia="Arial" w:hAnsi="Arial" w:cs="Arial"/>
+                <w:color w:val="000000"/>
+                <w:sz w:val="16"/>
+                <w:szCs w:val="16"/>
+              </w:rPr>
+              <w:t>aso de que la persona moral haya tenido modificaciones a su acta constitutiva, deberá presentar las últimas modificaciones correspondientes.</w:t>
             </w:r>
           </w:p>
           <w:p>
@@ -4721,7 +5190,16 @@
                 <w:sz w:val="16"/>
                 <w:szCs w:val="16"/>
               </w:rPr>
-              <w:t xml:space="preserve">E) Identificación oficial vigente con fotografía del licitante; o bien, tratándose de personas morales, identificación oficial vigente con fotografía del apoderado o representante legal. </w:t>
+              <w:t>E) Identificación oficial vi</w:t>
+            </w:r>
+            <w:r>
+              <w:rPr>
+                <w:rFonts w:ascii="Arial" w:eastAsia="Arial" w:hAnsi="Arial" w:cs="Arial"/>
+                <w:color w:val="000000"/>
+                <w:sz w:val="16"/>
+                <w:szCs w:val="16"/>
+              </w:rPr>
+              <w:t xml:space="preserve">gente con fotografía del licitante; o bien, tratándose de personas morales, identificación oficial vigente con fotografía del apoderado o representante legal. </w:t>
             </w:r>
           </w:p>
           <w:p>
@@ -4792,147 +5270,219 @@
                 <w:sz w:val="16"/>
                 <w:szCs w:val="16"/>
               </w:rPr>
-              <w:t>G) Constancia de Inscripción al Padrón de Proveedores del Municipio de CUAUTLANCINGO, Puebla, vigente; en caso de no contar con registro en el Padrón, el licitante que resulte adjudicado deberá presentar carta bajo protesta de decir verdad que, en caso de resultar adjudicado se compromete a inscribirse en dicho Padrón durante la vigencia del contrato.</w:t>
-            </w:r>
-          </w:p>
-          <w:p>
-            <w:pPr>
-              <w:spacing w:after="0" w:line="276" w:lineRule="auto"/>
-              <w:ind w:left="170" w:right="170"/>
-              <w:jc w:val="both"/>
-              <w:rPr>
-                <w:rFonts w:ascii="Arial" w:eastAsia="Arial" w:hAnsi="Arial" w:cs="Arial"/>
-                <w:color w:val="000000"/>
-                <w:sz w:val="16"/>
-                <w:szCs w:val="16"/>
-              </w:rPr>
-            </w:pPr>
-          </w:p>
-          <w:p>
-            <w:pPr>
-              <w:spacing w:after="0" w:line="276" w:lineRule="auto"/>
-              <w:ind w:left="170" w:right="170"/>
-              <w:jc w:val="both"/>
-              <w:rPr>
-                <w:rFonts w:ascii="Arial" w:eastAsia="Arial" w:hAnsi="Arial" w:cs="Arial"/>
-                <w:color w:val="000000"/>
-                <w:sz w:val="16"/>
-                <w:szCs w:val="16"/>
-              </w:rPr>
-            </w:pPr>
-            <w:r>
-              <w:rPr>
-                <w:rFonts w:ascii="Arial" w:eastAsia="Arial" w:hAnsi="Arial" w:cs="Arial"/>
-                <w:color w:val="000000"/>
-                <w:sz w:val="16"/>
-                <w:szCs w:val="16"/>
-              </w:rPr>
-              <w:t>H) Constancia de No Adeudo, expedida por el Honorable Ayuntamiento de CUAUTLANCINGO de conformidad con lo establecido por el artículo 19 fracción II, inciso i) de la Ley de Ingresos del Municipio de CUAUTLANCINGO para el ejercicio fiscal 2026.</w:t>
-            </w:r>
-          </w:p>
-          <w:p>
-            <w:pPr>
-              <w:spacing w:after="0" w:line="276" w:lineRule="auto"/>
-              <w:ind w:left="170" w:right="170"/>
-              <w:jc w:val="both"/>
-              <w:rPr>
-                <w:rFonts w:ascii="Arial" w:eastAsia="Arial" w:hAnsi="Arial" w:cs="Arial"/>
-                <w:color w:val="000000"/>
-                <w:sz w:val="16"/>
-                <w:szCs w:val="16"/>
-              </w:rPr>
-            </w:pPr>
-          </w:p>
-          <w:p>
-            <w:pPr>
-              <w:spacing w:after="0" w:line="276" w:lineRule="auto"/>
-              <w:ind w:left="170" w:right="170"/>
-              <w:jc w:val="both"/>
-              <w:rPr>
-                <w:rFonts w:ascii="Arial" w:eastAsia="Arial" w:hAnsi="Arial" w:cs="Arial"/>
-                <w:color w:val="000000"/>
-                <w:sz w:val="16"/>
-                <w:szCs w:val="16"/>
-              </w:rPr>
-            </w:pPr>
-            <w:r>
-              <w:rPr>
-                <w:rFonts w:ascii="Arial" w:eastAsia="Arial" w:hAnsi="Arial" w:cs="Arial"/>
-                <w:color w:val="000000"/>
-                <w:sz w:val="16"/>
-                <w:szCs w:val="16"/>
-              </w:rPr>
-              <w:t>I) Documento vigente con una antigüedad no mayor a 30 días naturales, expedido por el Instituto Mexicano del Seguro Social (IMSS) sobre la opinión de cumplimiento de obligaciones fiscales en materia de seguridad social en sentido positivo; la cual deberá tramitar el licitante en la página www.imss.gob.mx</w:t>
-            </w:r>
-          </w:p>
-          <w:p>
-            <w:pPr>
-              <w:spacing w:after="0" w:line="276" w:lineRule="auto"/>
-              <w:ind w:left="170" w:right="170"/>
-              <w:jc w:val="both"/>
-              <w:rPr>
-                <w:rFonts w:ascii="Arial" w:eastAsia="Arial" w:hAnsi="Arial" w:cs="Arial"/>
-                <w:color w:val="000000"/>
-                <w:sz w:val="16"/>
-                <w:szCs w:val="16"/>
-              </w:rPr>
-            </w:pPr>
-          </w:p>
-          <w:p>
-            <w:pPr>
-              <w:spacing w:after="0" w:line="276" w:lineRule="auto"/>
-              <w:ind w:left="170" w:right="170"/>
-              <w:jc w:val="both"/>
-              <w:rPr>
-                <w:rFonts w:ascii="Arial" w:eastAsia="Arial" w:hAnsi="Arial" w:cs="Arial"/>
-                <w:color w:val="000000"/>
-                <w:sz w:val="16"/>
-                <w:szCs w:val="16"/>
-              </w:rPr>
-            </w:pPr>
-            <w:r>
-              <w:rPr>
-                <w:rFonts w:ascii="Arial" w:eastAsia="Arial" w:hAnsi="Arial" w:cs="Arial"/>
-                <w:color w:val="000000"/>
-                <w:sz w:val="16"/>
-                <w:szCs w:val="16"/>
-              </w:rPr>
-              <w:t xml:space="preserve">J) Documento emitido por el Instituto del Fondo Nacional de la Vivienda para los Trabajadores (INFONAVIT), con antigüedad no mayor a 30 días naturales en el que se hará constar que el licitante adjudicado no tiene adeudos con el organismo, firmado por el representante legal; en términos del acuerdo del H. Consejo de administración del Instituto del Fondo Nacional de la Vivienda para los Trabajadores (INFONAVIT) por el que se emiten las reglas para la obtención de la constancia de situación fiscal en materia de aportaciones patronales y entero de descuentos, publicado en el Diario Oficial de la Federación de fecha 28 de junio de 2017. </w:t>
-            </w:r>
-          </w:p>
-          <w:p>
-            <w:pPr>
-              <w:spacing w:after="0" w:line="276" w:lineRule="auto"/>
-              <w:ind w:left="170" w:right="170"/>
-              <w:jc w:val="both"/>
-              <w:rPr>
-                <w:rFonts w:ascii="Arial" w:eastAsia="Arial" w:hAnsi="Arial" w:cs="Arial"/>
-                <w:color w:val="000000"/>
-                <w:sz w:val="16"/>
-                <w:szCs w:val="16"/>
-              </w:rPr>
-            </w:pPr>
-          </w:p>
-          <w:p>
-            <w:pPr>
-              <w:spacing w:after="0" w:line="276" w:lineRule="auto"/>
-              <w:ind w:left="170" w:right="170"/>
-              <w:jc w:val="both"/>
-              <w:rPr>
-                <w:rFonts w:ascii="Arial" w:eastAsia="Arial" w:hAnsi="Arial" w:cs="Arial"/>
-                <w:color w:val="000000"/>
-                <w:sz w:val="16"/>
-                <w:szCs w:val="16"/>
-              </w:rPr>
-            </w:pPr>
-            <w:r>
-              <w:rPr>
-                <w:rFonts w:ascii="Arial" w:eastAsia="Arial" w:hAnsi="Arial" w:cs="Arial"/>
-                <w:color w:val="000000"/>
-                <w:sz w:val="16"/>
-                <w:szCs w:val="16"/>
-              </w:rPr>
-              <w:t>K) Opinión de cumplimiento de obligaciones fiscales en sentido positivo, emitida por el Servicio de administración Tributaria (SAT), con el sello o liga digital correspondiente, dicho documento deberá haber sido expedido dentro de los 30 días naturales previos a la presentación de la propuesta.</w:t>
+              <w:t>G) Constancia de Inscri</w:t>
+            </w:r>
+            <w:r>
+              <w:rPr>
+                <w:rFonts w:ascii="Arial" w:eastAsia="Arial" w:hAnsi="Arial" w:cs="Arial"/>
+                <w:color w:val="000000"/>
+                <w:sz w:val="16"/>
+                <w:szCs w:val="16"/>
+              </w:rPr>
+              <w:t xml:space="preserve">pción al Padrón de Proveedores del Municipio de CUAUTLANCINGO, Puebla, vigente; en caso de no contar con registro en el Padrón, el licitante que resulte adjudicado deberá presentar carta bajo protesta de decir verdad que, en caso de resultar adjudicado se </w:t>
+            </w:r>
+            <w:r>
+              <w:rPr>
+                <w:rFonts w:ascii="Arial" w:eastAsia="Arial" w:hAnsi="Arial" w:cs="Arial"/>
+                <w:color w:val="000000"/>
+                <w:sz w:val="16"/>
+                <w:szCs w:val="16"/>
+              </w:rPr>
+              <w:t>compromete a inscribirse en dicho Padrón durante la vigencia del contrato.</w:t>
+            </w:r>
+          </w:p>
+          <w:p>
+            <w:pPr>
+              <w:spacing w:after="0" w:line="276" w:lineRule="auto"/>
+              <w:ind w:left="170" w:right="170"/>
+              <w:jc w:val="both"/>
+              <w:rPr>
+                <w:rFonts w:ascii="Arial" w:eastAsia="Arial" w:hAnsi="Arial" w:cs="Arial"/>
+                <w:color w:val="000000"/>
+                <w:sz w:val="16"/>
+                <w:szCs w:val="16"/>
+              </w:rPr>
+            </w:pPr>
+          </w:p>
+          <w:p>
+            <w:pPr>
+              <w:spacing w:after="0" w:line="276" w:lineRule="auto"/>
+              <w:ind w:left="170" w:right="170"/>
+              <w:jc w:val="both"/>
+              <w:rPr>
+                <w:rFonts w:ascii="Arial" w:eastAsia="Arial" w:hAnsi="Arial" w:cs="Arial"/>
+                <w:color w:val="000000"/>
+                <w:sz w:val="16"/>
+                <w:szCs w:val="16"/>
+              </w:rPr>
+            </w:pPr>
+            <w:r>
+              <w:rPr>
+                <w:rFonts w:ascii="Arial" w:eastAsia="Arial" w:hAnsi="Arial" w:cs="Arial"/>
+                <w:color w:val="000000"/>
+                <w:sz w:val="16"/>
+                <w:szCs w:val="16"/>
+              </w:rPr>
+              <w:t xml:space="preserve">H) Constancia de No Adeudo, expedida por el Honorable Ayuntamiento de CUAUTLANCINGO de conformidad con lo establecido por el artículo 19 fracción II, inciso i) de la Ley de </w:t>
+            </w:r>
+            <w:r>
+              <w:rPr>
+                <w:rFonts w:ascii="Arial" w:eastAsia="Arial" w:hAnsi="Arial" w:cs="Arial"/>
+                <w:color w:val="000000"/>
+                <w:sz w:val="16"/>
+                <w:szCs w:val="16"/>
+              </w:rPr>
+              <w:t>Ingresos del Municipio de CUAUTLANCINGO para el ejercicio fiscal 2026.</w:t>
+            </w:r>
+          </w:p>
+          <w:p>
+            <w:pPr>
+              <w:spacing w:after="0" w:line="276" w:lineRule="auto"/>
+              <w:ind w:left="170" w:right="170"/>
+              <w:jc w:val="both"/>
+              <w:rPr>
+                <w:rFonts w:ascii="Arial" w:eastAsia="Arial" w:hAnsi="Arial" w:cs="Arial"/>
+                <w:color w:val="000000"/>
+                <w:sz w:val="16"/>
+                <w:szCs w:val="16"/>
+              </w:rPr>
+            </w:pPr>
+          </w:p>
+          <w:p>
+            <w:pPr>
+              <w:spacing w:after="0" w:line="276" w:lineRule="auto"/>
+              <w:ind w:left="170" w:right="170"/>
+              <w:jc w:val="both"/>
+              <w:rPr>
+                <w:rFonts w:ascii="Arial" w:eastAsia="Arial" w:hAnsi="Arial" w:cs="Arial"/>
+                <w:color w:val="000000"/>
+                <w:sz w:val="16"/>
+                <w:szCs w:val="16"/>
+              </w:rPr>
+            </w:pPr>
+            <w:r>
+              <w:rPr>
+                <w:rFonts w:ascii="Arial" w:eastAsia="Arial" w:hAnsi="Arial" w:cs="Arial"/>
+                <w:color w:val="000000"/>
+                <w:sz w:val="16"/>
+                <w:szCs w:val="16"/>
+              </w:rPr>
+              <w:t>I) Documento vigente con una antigüedad no mayor a 30 días naturales, expedido por el Instituto Mexicano del Seguro Social (IMSS) sobre la opinión de cumplimiento de obligaciones fisca</w:t>
+            </w:r>
+            <w:r>
+              <w:rPr>
+                <w:rFonts w:ascii="Arial" w:eastAsia="Arial" w:hAnsi="Arial" w:cs="Arial"/>
+                <w:color w:val="000000"/>
+                <w:sz w:val="16"/>
+                <w:szCs w:val="16"/>
+              </w:rPr>
+              <w:t>les en materia de seguridad social en sentido positivo; la cual deberá tramitar el licitante en la página www.imss.gob.mx</w:t>
+            </w:r>
+          </w:p>
+          <w:p>
+            <w:pPr>
+              <w:spacing w:after="0" w:line="276" w:lineRule="auto"/>
+              <w:ind w:left="170" w:right="170"/>
+              <w:jc w:val="both"/>
+              <w:rPr>
+                <w:rFonts w:ascii="Arial" w:eastAsia="Arial" w:hAnsi="Arial" w:cs="Arial"/>
+                <w:color w:val="000000"/>
+                <w:sz w:val="16"/>
+                <w:szCs w:val="16"/>
+              </w:rPr>
+            </w:pPr>
+          </w:p>
+          <w:p>
+            <w:pPr>
+              <w:spacing w:after="0" w:line="276" w:lineRule="auto"/>
+              <w:ind w:left="170" w:right="170"/>
+              <w:jc w:val="both"/>
+              <w:rPr>
+                <w:rFonts w:ascii="Arial" w:eastAsia="Arial" w:hAnsi="Arial" w:cs="Arial"/>
+                <w:color w:val="000000"/>
+                <w:sz w:val="16"/>
+                <w:szCs w:val="16"/>
+              </w:rPr>
+            </w:pPr>
+            <w:r>
+              <w:rPr>
+                <w:rFonts w:ascii="Arial" w:eastAsia="Arial" w:hAnsi="Arial" w:cs="Arial"/>
+                <w:color w:val="000000"/>
+                <w:sz w:val="16"/>
+                <w:szCs w:val="16"/>
+              </w:rPr>
+              <w:t xml:space="preserve">J) Documento emitido por el Instituto del Fondo Nacional de la Vivienda para los Trabajadores (INFONAVIT), con antigüedad no mayor a </w:t>
+            </w:r>
+            <w:r>
+              <w:rPr>
+                <w:rFonts w:ascii="Arial" w:eastAsia="Arial" w:hAnsi="Arial" w:cs="Arial"/>
+                <w:color w:val="000000"/>
+                <w:sz w:val="16"/>
+                <w:szCs w:val="16"/>
+              </w:rPr>
+              <w:t>30 días naturales en el que se hará constar que el licitante adjudicado no tiene adeudos con el organismo, firmado por el representante legal; en términos del acuerdo del H. Consejo de administración del Instituto del Fondo Nacional de la Vivienda para los</w:t>
+            </w:r>
+            <w:r>
+              <w:rPr>
+                <w:rFonts w:ascii="Arial" w:eastAsia="Arial" w:hAnsi="Arial" w:cs="Arial"/>
+                <w:color w:val="000000"/>
+                <w:sz w:val="16"/>
+                <w:szCs w:val="16"/>
+              </w:rPr>
+              <w:t xml:space="preserve"> Trabajadores (INFONAVIT) por el que se emiten las reglas para la obtención de la constancia de situación fiscal en materia de aportaciones patronales y entero de descuentos, publicado en el Diario Oficial de la Federación de fecha 28 de junio de 2017. </w:t>
+            </w:r>
+          </w:p>
+          <w:p>
+            <w:pPr>
+              <w:spacing w:after="0" w:line="276" w:lineRule="auto"/>
+              <w:ind w:left="170" w:right="170"/>
+              <w:jc w:val="both"/>
+              <w:rPr>
+                <w:rFonts w:ascii="Arial" w:eastAsia="Arial" w:hAnsi="Arial" w:cs="Arial"/>
+                <w:color w:val="000000"/>
+                <w:sz w:val="16"/>
+                <w:szCs w:val="16"/>
+              </w:rPr>
+            </w:pPr>
+          </w:p>
+          <w:p>
+            <w:pPr>
+              <w:spacing w:after="0" w:line="276" w:lineRule="auto"/>
+              <w:ind w:left="170" w:right="170"/>
+              <w:jc w:val="both"/>
+              <w:rPr>
+                <w:rFonts w:ascii="Arial" w:eastAsia="Arial" w:hAnsi="Arial" w:cs="Arial"/>
+                <w:color w:val="000000"/>
+                <w:sz w:val="16"/>
+                <w:szCs w:val="16"/>
+              </w:rPr>
+            </w:pPr>
+            <w:r>
+              <w:rPr>
+                <w:rFonts w:ascii="Arial" w:eastAsia="Arial" w:hAnsi="Arial" w:cs="Arial"/>
+                <w:color w:val="000000"/>
+                <w:sz w:val="16"/>
+                <w:szCs w:val="16"/>
+              </w:rPr>
+              <w:t>K</w:t>
+            </w:r>
+            <w:r>
+              <w:rPr>
+                <w:rFonts w:ascii="Arial" w:eastAsia="Arial" w:hAnsi="Arial" w:cs="Arial"/>
+                <w:color w:val="000000"/>
+                <w:sz w:val="16"/>
+                <w:szCs w:val="16"/>
+              </w:rPr>
+              <w:t>) Opinión de cumplimiento de obligaciones fiscales en sentido positivo, emitida por el Servicio de administración Tributaria (SAT), con el sello o liga digital correspondiente, dicho documento deberá haber sido expedido dentro de los 30 días naturales prev</w:t>
+            </w:r>
+            <w:r>
+              <w:rPr>
+                <w:rFonts w:ascii="Arial" w:eastAsia="Arial" w:hAnsi="Arial" w:cs="Arial"/>
+                <w:color w:val="000000"/>
+                <w:sz w:val="16"/>
+                <w:szCs w:val="16"/>
+              </w:rPr>
+              <w:t>ios a la presentación de la propuesta.</w:t>
             </w:r>
           </w:p>
           <w:p>
@@ -5037,7 +5587,16 @@
                 <w:sz w:val="16"/>
                 <w:szCs w:val="16"/>
               </w:rPr>
-              <w:t>7. La descripción y requisitos que se plasman en la presente requisición derivan de la solicitud efectuada por la contratante, por lo que el Representante para esta requisición y para efectos del procedimiento de contratación, así como los actos que resulten del mismo, serán:</w:t>
+              <w:t>7. La descripción y requisitos que se plasman en</w:t>
+            </w:r>
+            <w:r>
+              <w:rPr>
+                <w:rFonts w:ascii="Arial" w:eastAsia="Arial" w:hAnsi="Arial" w:cs="Arial"/>
+                <w:color w:val="000000"/>
+                <w:sz w:val="16"/>
+                <w:szCs w:val="16"/>
+              </w:rPr>
+              <w:t xml:space="preserve"> la presente requisición derivan de la solicitud efectuada por la contratante, por lo que el Representante para esta requisición y para efectos del procedimiento de contratación, así como los actos que resulten del mismo, serán:</w:t>
             </w:r>
           </w:p>
           <w:p>
@@ -5112,24 +5671,88 @@
                 <w:sz w:val="16"/>
                 <w:szCs w:val="16"/>
               </w:rPr>
-              <w:t>Nombre: ________</w:t>
-            </w:r>
-            <w:r>
-              <w:rPr>
-                <w:rFonts w:ascii="Arial" w:eastAsia="Arial" w:hAnsi="Arial" w:cs="Arial"/>
-                <w:sz w:val="16"/>
-                <w:szCs w:val="16"/>
+              <w:t xml:space="preserve">Nombre: </w:t>
+            </w:r>
+            <w:r>
+              <w:rPr>
+                <w:rFonts w:ascii="Arial" w:eastAsia="Arial" w:hAnsi="Arial" w:cs="Arial"/>
+                <w:sz w:val="16"/>
+                <w:szCs w:val="16"/>
+                <w:u w:val="single"/>
               </w:rPr>
               <w:t>{</w:t>
             </w:r>
+            <w:r>
+              <w:rPr>
+                <w:rFonts w:ascii="Arial" w:eastAsia="Arial" w:hAnsi="Arial" w:cs="Arial"/>
+                <w:sz w:val="16"/>
+                <w:szCs w:val="16"/>
+                <w:u w:val="single"/>
+              </w:rPr>
+              <w:t>nombreRepresentante</w:t>
+            </w:r>
+            <w:r>
+              <w:rPr>
+                <w:rFonts w:ascii="Arial" w:eastAsia="Arial" w:hAnsi="Arial" w:cs="Arial"/>
+                <w:sz w:val="16"/>
+                <w:szCs w:val="16"/>
+                <w:u w:val="single"/>
+              </w:rPr>
+              <w:t>}</w:t>
+            </w:r>
+          </w:p>
+          <w:p>
+            <w:pPr>
+              <w:spacing w:after="0" w:line="276" w:lineRule="auto"/>
+              <w:ind w:left="170" w:right="170"/>
+              <w:jc w:val="both"/>
+              <w:rPr>
+                <w:rFonts w:ascii="Arial" w:eastAsia="Arial" w:hAnsi="Arial" w:cs="Arial"/>
+                <w:sz w:val="16"/>
+                <w:szCs w:val="16"/>
+                <w:shd w:val="clear" w:color="auto" w:fill="92D050"/>
+              </w:rPr>
+            </w:pPr>
+          </w:p>
+          <w:p>
+            <w:pPr>
+              <w:spacing w:after="0" w:line="276" w:lineRule="auto"/>
+              <w:ind w:left="170" w:right="170"/>
+              <w:jc w:val="both"/>
+              <w:rPr>
+                <w:rFonts w:ascii="Arial" w:eastAsia="Arial" w:hAnsi="Arial" w:cs="Arial"/>
+                <w:sz w:val="16"/>
+                <w:szCs w:val="16"/>
+                <w:u w:val="single"/>
+                <w:shd w:val="clear" w:color="auto" w:fill="92D050"/>
+              </w:rPr>
+            </w:pPr>
+            <w:r>
+              <w:rPr>
+                <w:rFonts w:ascii="Arial" w:eastAsia="Arial" w:hAnsi="Arial" w:cs="Arial"/>
+                <w:sz w:val="16"/>
+                <w:szCs w:val="16"/>
+              </w:rPr>
+              <w:t xml:space="preserve">Cargo: </w:t>
+            </w:r>
+            <w:r>
+              <w:rPr>
+                <w:rFonts w:ascii="Arial" w:eastAsia="Arial" w:hAnsi="Arial" w:cs="Arial"/>
+                <w:sz w:val="16"/>
+                <w:szCs w:val="16"/>
+                <w:u w:val="single"/>
+              </w:rPr>
+              <w:t>{</w:t>
+            </w:r>
             <w:proofErr w:type="spellStart"/>
             <w:r>
               <w:rPr>
                 <w:rFonts w:ascii="Arial" w:eastAsia="Arial" w:hAnsi="Arial" w:cs="Arial"/>
                 <w:sz w:val="16"/>
                 <w:szCs w:val="16"/>
-              </w:rPr>
-              <w:t>nombreRepresentante</w:t>
+                <w:u w:val="single"/>
+              </w:rPr>
+              <w:t>cargoRepresentante</w:t>
             </w:r>
             <w:proofErr w:type="spellEnd"/>
             <w:r>
@@ -5137,17 +5760,10 @@
                 <w:rFonts w:ascii="Arial" w:eastAsia="Arial" w:hAnsi="Arial" w:cs="Arial"/>
                 <w:sz w:val="16"/>
                 <w:szCs w:val="16"/>
+                <w:u w:val="single"/>
               </w:rPr>
               <w:t>}</w:t>
             </w:r>
-            <w:r>
-              <w:rPr>
-                <w:rFonts w:ascii="Arial" w:eastAsia="Arial" w:hAnsi="Arial" w:cs="Arial"/>
-                <w:sz w:val="16"/>
-                <w:szCs w:val="16"/>
-              </w:rPr>
-              <w:t>________________</w:t>
-            </w:r>
           </w:p>
           <w:p>
             <w:pPr>
@@ -5180,24 +5796,88 @@
                 <w:sz w:val="16"/>
                 <w:szCs w:val="16"/>
               </w:rPr>
-              <w:t>Cargo: ________</w:t>
-            </w:r>
-            <w:r>
-              <w:rPr>
-                <w:rFonts w:ascii="Arial" w:eastAsia="Arial" w:hAnsi="Arial" w:cs="Arial"/>
-                <w:sz w:val="16"/>
-                <w:szCs w:val="16"/>
+              <w:t xml:space="preserve">Correo electrónico: </w:t>
+            </w:r>
+            <w:r>
+              <w:rPr>
+                <w:rFonts w:ascii="Arial" w:eastAsia="Arial" w:hAnsi="Arial" w:cs="Arial"/>
+                <w:sz w:val="16"/>
+                <w:szCs w:val="16"/>
+                <w:u w:val="single"/>
               </w:rPr>
               <w:t>{</w:t>
             </w:r>
+            <w:r>
+              <w:rPr>
+                <w:rFonts w:ascii="Arial" w:eastAsia="Arial" w:hAnsi="Arial" w:cs="Arial"/>
+                <w:sz w:val="16"/>
+                <w:szCs w:val="16"/>
+                <w:u w:val="single"/>
+              </w:rPr>
+              <w:t>correoRepresentante</w:t>
+            </w:r>
+            <w:r>
+              <w:rPr>
+                <w:rFonts w:ascii="Arial" w:eastAsia="Arial" w:hAnsi="Arial" w:cs="Arial"/>
+                <w:sz w:val="16"/>
+                <w:szCs w:val="16"/>
+                <w:u w:val="single"/>
+              </w:rPr>
+              <w:t>}</w:t>
+            </w:r>
+          </w:p>
+          <w:p>
+            <w:pPr>
+              <w:spacing w:after="0" w:line="276" w:lineRule="auto"/>
+              <w:ind w:left="170" w:right="170"/>
+              <w:jc w:val="both"/>
+              <w:rPr>
+                <w:rFonts w:ascii="Arial" w:eastAsia="Arial" w:hAnsi="Arial" w:cs="Arial"/>
+                <w:sz w:val="16"/>
+                <w:szCs w:val="16"/>
+                <w:shd w:val="clear" w:color="auto" w:fill="92D050"/>
+              </w:rPr>
+            </w:pPr>
+          </w:p>
+          <w:p>
+            <w:pPr>
+              <w:spacing w:after="0" w:line="276" w:lineRule="auto"/>
+              <w:ind w:left="170" w:right="170"/>
+              <w:jc w:val="both"/>
+              <w:rPr>
+                <w:rFonts w:ascii="Arial" w:eastAsia="Arial" w:hAnsi="Arial" w:cs="Arial"/>
+                <w:sz w:val="16"/>
+                <w:szCs w:val="16"/>
+                <w:u w:val="single"/>
+                <w:shd w:val="clear" w:color="auto" w:fill="92D050"/>
+              </w:rPr>
+            </w:pPr>
+            <w:r>
+              <w:rPr>
+                <w:rFonts w:ascii="Arial" w:eastAsia="Arial" w:hAnsi="Arial" w:cs="Arial"/>
+                <w:sz w:val="16"/>
+                <w:szCs w:val="16"/>
+              </w:rPr>
+              <w:t xml:space="preserve">Teléfono: </w:t>
+            </w:r>
+            <w:r>
+              <w:rPr>
+                <w:rFonts w:ascii="Arial" w:eastAsia="Arial" w:hAnsi="Arial" w:cs="Arial"/>
+                <w:sz w:val="16"/>
+                <w:szCs w:val="16"/>
+                <w:u w:val="single"/>
+              </w:rPr>
+              <w:t>{</w:t>
+            </w:r>
             <w:proofErr w:type="spellStart"/>
             <w:r>
               <w:rPr>
                 <w:rFonts w:ascii="Arial" w:eastAsia="Arial" w:hAnsi="Arial" w:cs="Arial"/>
                 <w:sz w:val="16"/>
                 <w:szCs w:val="16"/>
-              </w:rPr>
-              <w:t>cargoRepresentante</w:t>
+                <w:u w:val="single"/>
+              </w:rPr>
+              <w:t>telefonoRepresentante</w:t>
             </w:r>
             <w:proofErr w:type="spellEnd"/>
             <w:r>
@@ -5205,16 +5885,94 @@
                 <w:rFonts w:ascii="Arial" w:eastAsia="Arial" w:hAnsi="Arial" w:cs="Arial"/>
                 <w:sz w:val="16"/>
                 <w:szCs w:val="16"/>
+                <w:u w:val="single"/>
               </w:rPr>
               <w:t>}</w:t>
             </w:r>
-            <w:r>
-              <w:rPr>
-                <w:rFonts w:ascii="Arial" w:eastAsia="Arial" w:hAnsi="Arial" w:cs="Arial"/>
-                <w:sz w:val="16"/>
-                <w:szCs w:val="16"/>
-              </w:rPr>
-              <w:t>__________________</w:t>
+          </w:p>
+          <w:p>
+            <w:pPr>
+              <w:spacing w:after="0" w:line="276" w:lineRule="auto"/>
+              <w:ind w:left="170" w:right="170"/>
+              <w:jc w:val="both"/>
+              <w:rPr>
+                <w:rFonts w:ascii="Arial" w:eastAsia="Arial" w:hAnsi="Arial" w:cs="Arial"/>
+                <w:b/>
+                <w:bCs/>
+                <w:color w:val="000000"/>
+                <w:sz w:val="16"/>
+                <w:szCs w:val="16"/>
+              </w:rPr>
+            </w:pPr>
+          </w:p>
+          <w:p>
+            <w:pPr>
+              <w:spacing w:after="0" w:line="276" w:lineRule="auto"/>
+              <w:ind w:left="170" w:right="170"/>
+              <w:jc w:val="both"/>
+              <w:rPr>
+                <w:rFonts w:ascii="Arial" w:eastAsia="Arial" w:hAnsi="Arial" w:cs="Arial"/>
+                <w:color w:val="000000"/>
+                <w:sz w:val="16"/>
+                <w:szCs w:val="16"/>
+              </w:rPr>
+            </w:pPr>
+            <w:r>
+              <w:rPr>
+                <w:rFonts w:ascii="Arial" w:eastAsia="Arial" w:hAnsi="Arial" w:cs="Arial"/>
+                <w:color w:val="000000"/>
+                <w:sz w:val="16"/>
+                <w:szCs w:val="16"/>
+              </w:rPr>
+              <w:t xml:space="preserve">8. La contratante nombra para </w:t>
+            </w:r>
+            <w:r>
+              <w:rPr>
+                <w:rFonts w:ascii="Arial" w:eastAsia="Arial" w:hAnsi="Arial" w:cs="Arial"/>
+                <w:color w:val="000000"/>
+                <w:sz w:val="16"/>
+                <w:szCs w:val="16"/>
+              </w:rPr>
+              <w:t>efectos de la contratación y suscripción del contrato al Administrador y Verificador, siendo los siguientes:</w:t>
+            </w:r>
+          </w:p>
+          <w:p>
+            <w:pPr>
+              <w:spacing w:after="0" w:line="276" w:lineRule="auto"/>
+              <w:ind w:left="170" w:right="170"/>
+              <w:jc w:val="both"/>
+              <w:rPr>
+                <w:rFonts w:ascii="Arial" w:eastAsia="Arial" w:hAnsi="Arial" w:cs="Arial"/>
+                <w:color w:val="000000"/>
+                <w:sz w:val="16"/>
+                <w:szCs w:val="16"/>
+              </w:rPr>
+            </w:pPr>
+          </w:p>
+          <w:p>
+            <w:pPr>
+              <w:spacing w:after="0" w:line="276" w:lineRule="auto"/>
+              <w:ind w:left="170" w:right="170"/>
+              <w:jc w:val="both"/>
+              <w:rPr>
+                <w:rFonts w:ascii="Arial" w:eastAsia="Arial" w:hAnsi="Arial" w:cs="Arial"/>
+                <w:b/>
+                <w:bCs/>
+                <w:color w:val="000000"/>
+                <w:sz w:val="16"/>
+                <w:szCs w:val="16"/>
+              </w:rPr>
+            </w:pPr>
+            <w:r>
+              <w:rPr>
+                <w:rFonts w:ascii="Arial" w:eastAsia="Arial" w:hAnsi="Arial" w:cs="Arial"/>
+                <w:b/>
+                <w:bCs/>
+                <w:color w:val="000000"/>
+                <w:sz w:val="16"/>
+                <w:szCs w:val="16"/>
+              </w:rPr>
+              <w:t xml:space="preserve">ADMINISTRADOR DEL CONTRATO: </w:t>
             </w:r>
           </w:p>
           <w:p>
@@ -5248,13 +6006,14 @@
                 <w:sz w:val="16"/>
                 <w:szCs w:val="16"/>
               </w:rPr>
-              <w:t>Correo electrónico: _________</w:t>
-            </w:r>
-            <w:r>
-              <w:rPr>
-                <w:rFonts w:ascii="Arial" w:eastAsia="Arial" w:hAnsi="Arial" w:cs="Arial"/>
-                <w:sz w:val="16"/>
-                <w:szCs w:val="16"/>
+              <w:t xml:space="preserve">Nombre: </w:t>
+            </w:r>
+            <w:r>
+              <w:rPr>
+                <w:rFonts w:ascii="Arial" w:eastAsia="Arial" w:hAnsi="Arial" w:cs="Arial"/>
+                <w:sz w:val="16"/>
+                <w:szCs w:val="16"/>
+                <w:u w:val="single"/>
               </w:rPr>
               <w:t>{</w:t>
             </w:r>
@@ -5264,8 +6023,9 @@
                 <w:rFonts w:ascii="Arial" w:eastAsia="Arial" w:hAnsi="Arial" w:cs="Arial"/>
                 <w:sz w:val="16"/>
                 <w:szCs w:val="16"/>
-              </w:rPr>
-              <w:t>correoRepresentante</w:t>
+                <w:u w:val="single"/>
+              </w:rPr>
+              <w:t>nombreAdministradorContrato</w:t>
             </w:r>
             <w:proofErr w:type="spellEnd"/>
             <w:r>
@@ -5273,17 +6033,10 @@
                 <w:rFonts w:ascii="Arial" w:eastAsia="Arial" w:hAnsi="Arial" w:cs="Arial"/>
                 <w:sz w:val="16"/>
                 <w:szCs w:val="16"/>
+                <w:u w:val="single"/>
               </w:rPr>
               <w:t>}</w:t>
             </w:r>
-            <w:r>
-              <w:rPr>
-                <w:rFonts w:ascii="Arial" w:eastAsia="Arial" w:hAnsi="Arial" w:cs="Arial"/>
-                <w:sz w:val="16"/>
-                <w:szCs w:val="16"/>
-              </w:rPr>
-              <w:t>________</w:t>
-            </w:r>
           </w:p>
           <w:p>
             <w:pPr>
@@ -5307,6 +6060,7 @@
                 <w:rFonts w:ascii="Arial" w:eastAsia="Arial" w:hAnsi="Arial" w:cs="Arial"/>
                 <w:sz w:val="16"/>
                 <w:szCs w:val="16"/>
+                <w:u w:val="single"/>
                 <w:shd w:val="clear" w:color="auto" w:fill="92D050"/>
               </w:rPr>
             </w:pPr>
@@ -5316,13 +6070,14 @@
                 <w:sz w:val="16"/>
                 <w:szCs w:val="16"/>
               </w:rPr>
-              <w:t>Teléfono: __________</w:t>
-            </w:r>
-            <w:r>
-              <w:rPr>
-                <w:rFonts w:ascii="Arial" w:eastAsia="Arial" w:hAnsi="Arial" w:cs="Arial"/>
-                <w:sz w:val="16"/>
-                <w:szCs w:val="16"/>
+              <w:t xml:space="preserve">Cargo: </w:t>
+            </w:r>
+            <w:r>
+              <w:rPr>
+                <w:rFonts w:ascii="Arial" w:eastAsia="Arial" w:hAnsi="Arial" w:cs="Arial"/>
+                <w:sz w:val="16"/>
+                <w:szCs w:val="16"/>
+                <w:u w:val="single"/>
               </w:rPr>
               <w:t>{</w:t>
             </w:r>
@@ -5332,8 +6087,9 @@
                 <w:rFonts w:ascii="Arial" w:eastAsia="Arial" w:hAnsi="Arial" w:cs="Arial"/>
                 <w:sz w:val="16"/>
                 <w:szCs w:val="16"/>
-              </w:rPr>
-              <w:t>telefonoRepresentante</w:t>
+                <w:u w:val="single"/>
+              </w:rPr>
+              <w:t>cargoAdministradorContrato</w:t>
             </w:r>
             <w:proofErr w:type="spellEnd"/>
             <w:r>
@@ -5341,93 +6097,10 @@
                 <w:rFonts w:ascii="Arial" w:eastAsia="Arial" w:hAnsi="Arial" w:cs="Arial"/>
                 <w:sz w:val="16"/>
                 <w:szCs w:val="16"/>
+                <w:u w:val="single"/>
               </w:rPr>
               <w:t>}</w:t>
             </w:r>
-            <w:r>
-              <w:rPr>
-                <w:rFonts w:ascii="Arial" w:eastAsia="Arial" w:hAnsi="Arial" w:cs="Arial"/>
-                <w:sz w:val="16"/>
-                <w:szCs w:val="16"/>
-              </w:rPr>
-              <w:t>_______________</w:t>
-            </w:r>
-          </w:p>
-          <w:p>
-            <w:pPr>
-              <w:spacing w:after="0" w:line="276" w:lineRule="auto"/>
-              <w:ind w:left="170" w:right="170"/>
-              <w:jc w:val="both"/>
-              <w:rPr>
-                <w:rFonts w:ascii="Arial" w:eastAsia="Arial" w:hAnsi="Arial" w:cs="Arial"/>
-                <w:b/>
-                <w:bCs/>
-                <w:color w:val="000000"/>
-                <w:sz w:val="16"/>
-                <w:szCs w:val="16"/>
-              </w:rPr>
-            </w:pPr>
-          </w:p>
-          <w:p>
-            <w:pPr>
-              <w:spacing w:after="0" w:line="276" w:lineRule="auto"/>
-              <w:ind w:left="170" w:right="170"/>
-              <w:jc w:val="both"/>
-              <w:rPr>
-                <w:rFonts w:ascii="Arial" w:eastAsia="Arial" w:hAnsi="Arial" w:cs="Arial"/>
-                <w:color w:val="000000"/>
-                <w:sz w:val="16"/>
-                <w:szCs w:val="16"/>
-              </w:rPr>
-            </w:pPr>
-            <w:r>
-              <w:rPr>
-                <w:rFonts w:ascii="Arial" w:eastAsia="Arial" w:hAnsi="Arial" w:cs="Arial"/>
-                <w:color w:val="000000"/>
-                <w:sz w:val="16"/>
-                <w:szCs w:val="16"/>
-              </w:rPr>
-              <w:t>8. La contratante nombra para efectos de la contratación y suscripción del contrato al Administrador y Verificador, siendo los siguientes:</w:t>
-            </w:r>
-          </w:p>
-          <w:p>
-            <w:pPr>
-              <w:spacing w:after="0" w:line="276" w:lineRule="auto"/>
-              <w:ind w:left="170" w:right="170"/>
-              <w:jc w:val="both"/>
-              <w:rPr>
-                <w:rFonts w:ascii="Arial" w:eastAsia="Arial" w:hAnsi="Arial" w:cs="Arial"/>
-                <w:color w:val="000000"/>
-                <w:sz w:val="16"/>
-                <w:szCs w:val="16"/>
-              </w:rPr>
-            </w:pPr>
-          </w:p>
-          <w:p>
-            <w:pPr>
-              <w:spacing w:after="0" w:line="276" w:lineRule="auto"/>
-              <w:ind w:left="170" w:right="170"/>
-              <w:jc w:val="both"/>
-              <w:rPr>
-                <w:rFonts w:ascii="Arial" w:eastAsia="Arial" w:hAnsi="Arial" w:cs="Arial"/>
-                <w:b/>
-                <w:bCs/>
-                <w:color w:val="000000"/>
-                <w:sz w:val="16"/>
-                <w:szCs w:val="16"/>
-              </w:rPr>
-            </w:pPr>
-            <w:r>
-              <w:rPr>
-                <w:rFonts w:ascii="Arial" w:eastAsia="Arial" w:hAnsi="Arial" w:cs="Arial"/>
-                <w:b/>
-                <w:bCs/>
-                <w:color w:val="000000"/>
-                <w:sz w:val="16"/>
-                <w:szCs w:val="16"/>
-              </w:rPr>
-              <w:t xml:space="preserve">ADMINISTRADOR DEL CONTRATO: </w:t>
-            </w:r>
           </w:p>
           <w:p>
             <w:pPr>
@@ -5451,6 +6124,7 @@
                 <w:rFonts w:ascii="Arial" w:eastAsia="Arial" w:hAnsi="Arial" w:cs="Arial"/>
                 <w:sz w:val="16"/>
                 <w:szCs w:val="16"/>
+                <w:u w:val="single"/>
                 <w:shd w:val="clear" w:color="auto" w:fill="92D050"/>
               </w:rPr>
             </w:pPr>
@@ -5460,13 +6134,14 @@
                 <w:sz w:val="16"/>
                 <w:szCs w:val="16"/>
               </w:rPr>
-              <w:t>Nombre: ______</w:t>
-            </w:r>
-            <w:r>
-              <w:rPr>
-                <w:rFonts w:ascii="Arial" w:eastAsia="Arial" w:hAnsi="Arial" w:cs="Arial"/>
-                <w:sz w:val="16"/>
-                <w:szCs w:val="16"/>
+              <w:t xml:space="preserve">Correo electrónico: </w:t>
+            </w:r>
+            <w:r>
+              <w:rPr>
+                <w:rFonts w:ascii="Arial" w:eastAsia="Arial" w:hAnsi="Arial" w:cs="Arial"/>
+                <w:sz w:val="16"/>
+                <w:szCs w:val="16"/>
+                <w:u w:val="single"/>
               </w:rPr>
               <w:t>{</w:t>
             </w:r>
@@ -5476,8 +6151,9 @@
                 <w:rFonts w:ascii="Arial" w:eastAsia="Arial" w:hAnsi="Arial" w:cs="Arial"/>
                 <w:sz w:val="16"/>
                 <w:szCs w:val="16"/>
-              </w:rPr>
-              <w:t>nombreAdministradorContrato</w:t>
+                <w:u w:val="single"/>
+              </w:rPr>
+              <w:t>correoAdministradorContrato</w:t>
             </w:r>
             <w:proofErr w:type="spellEnd"/>
             <w:r>
@@ -5485,17 +6161,10 @@
                 <w:rFonts w:ascii="Arial" w:eastAsia="Arial" w:hAnsi="Arial" w:cs="Arial"/>
                 <w:sz w:val="16"/>
                 <w:szCs w:val="16"/>
+                <w:u w:val="single"/>
               </w:rPr>
               <w:t>}</w:t>
             </w:r>
-            <w:r>
-              <w:rPr>
-                <w:rFonts w:ascii="Arial" w:eastAsia="Arial" w:hAnsi="Arial" w:cs="Arial"/>
-                <w:sz w:val="16"/>
-                <w:szCs w:val="16"/>
-              </w:rPr>
-              <w:t>__________________</w:t>
-            </w:r>
           </w:p>
           <w:p>
             <w:pPr>
@@ -5519,6 +6188,7 @@
                 <w:rFonts w:ascii="Arial" w:eastAsia="Arial" w:hAnsi="Arial" w:cs="Arial"/>
                 <w:sz w:val="16"/>
                 <w:szCs w:val="16"/>
+                <w:u w:val="single"/>
                 <w:shd w:val="clear" w:color="auto" w:fill="92D050"/>
               </w:rPr>
             </w:pPr>
@@ -5528,13 +6198,14 @@
                 <w:sz w:val="16"/>
                 <w:szCs w:val="16"/>
               </w:rPr>
-              <w:t>Cargo: __________</w:t>
-            </w:r>
-            <w:r>
-              <w:rPr>
-                <w:rFonts w:ascii="Arial" w:eastAsia="Arial" w:hAnsi="Arial" w:cs="Arial"/>
-                <w:sz w:val="16"/>
-                <w:szCs w:val="16"/>
+              <w:t xml:space="preserve">Teléfono: </w:t>
+            </w:r>
+            <w:r>
+              <w:rPr>
+                <w:rFonts w:ascii="Arial" w:eastAsia="Arial" w:hAnsi="Arial" w:cs="Arial"/>
+                <w:sz w:val="16"/>
+                <w:szCs w:val="16"/>
+                <w:u w:val="single"/>
               </w:rPr>
               <w:t>{</w:t>
             </w:r>
@@ -5544,8 +6215,9 @@
                 <w:rFonts w:ascii="Arial" w:eastAsia="Arial" w:hAnsi="Arial" w:cs="Arial"/>
                 <w:sz w:val="16"/>
                 <w:szCs w:val="16"/>
-              </w:rPr>
-              <w:t>cargoAdministradorContrato</w:t>
+                <w:u w:val="single"/>
+              </w:rPr>
+              <w:t>telefonoAdministradorContrato</w:t>
             </w:r>
             <w:proofErr w:type="spellEnd"/>
             <w:r>
@@ -5553,187 +6225,53 @@
                 <w:rFonts w:ascii="Arial" w:eastAsia="Arial" w:hAnsi="Arial" w:cs="Arial"/>
                 <w:sz w:val="16"/>
                 <w:szCs w:val="16"/>
+                <w:u w:val="single"/>
               </w:rPr>
               <w:t>}</w:t>
             </w:r>
-            <w:r>
-              <w:rPr>
-                <w:rFonts w:ascii="Arial" w:eastAsia="Arial" w:hAnsi="Arial" w:cs="Arial"/>
-                <w:sz w:val="16"/>
-                <w:szCs w:val="16"/>
-              </w:rPr>
-              <w:t>________________</w:t>
-            </w:r>
-          </w:p>
-          <w:p>
-            <w:pPr>
-              <w:spacing w:after="0" w:line="276" w:lineRule="auto"/>
-              <w:ind w:left="170" w:right="170"/>
-              <w:jc w:val="both"/>
-              <w:rPr>
-                <w:rFonts w:ascii="Arial" w:eastAsia="Arial" w:hAnsi="Arial" w:cs="Arial"/>
-                <w:sz w:val="16"/>
-                <w:szCs w:val="16"/>
-                <w:shd w:val="clear" w:color="auto" w:fill="92D050"/>
-              </w:rPr>
-            </w:pPr>
-          </w:p>
-          <w:p>
-            <w:pPr>
-              <w:spacing w:after="0" w:line="276" w:lineRule="auto"/>
-              <w:ind w:left="170" w:right="170"/>
-              <w:jc w:val="both"/>
-              <w:rPr>
-                <w:rFonts w:ascii="Arial" w:eastAsia="Arial" w:hAnsi="Arial" w:cs="Arial"/>
-                <w:sz w:val="16"/>
-                <w:szCs w:val="16"/>
-                <w:shd w:val="clear" w:color="auto" w:fill="92D050"/>
-              </w:rPr>
-            </w:pPr>
-            <w:r>
-              <w:rPr>
-                <w:rFonts w:ascii="Arial" w:eastAsia="Arial" w:hAnsi="Arial" w:cs="Arial"/>
-                <w:sz w:val="16"/>
-                <w:szCs w:val="16"/>
-              </w:rPr>
-              <w:t>Correo electrónico: ___</w:t>
-            </w:r>
-            <w:r>
-              <w:rPr>
-                <w:rFonts w:ascii="Arial" w:eastAsia="Arial" w:hAnsi="Arial" w:cs="Arial"/>
-                <w:sz w:val="16"/>
-                <w:szCs w:val="16"/>
-              </w:rPr>
-              <w:t>{</w:t>
-            </w:r>
-            <w:proofErr w:type="spellStart"/>
-            <w:r>
-              <w:rPr>
-                <w:rFonts w:ascii="Arial" w:eastAsia="Arial" w:hAnsi="Arial" w:cs="Arial"/>
-                <w:sz w:val="16"/>
-                <w:szCs w:val="16"/>
-              </w:rPr>
-              <w:t>correoAdministradorContrato</w:t>
-            </w:r>
-            <w:proofErr w:type="spellEnd"/>
-            <w:r>
-              <w:rPr>
-                <w:rFonts w:ascii="Arial" w:eastAsia="Arial" w:hAnsi="Arial" w:cs="Arial"/>
-                <w:sz w:val="16"/>
-                <w:szCs w:val="16"/>
-              </w:rPr>
-              <w:t>}</w:t>
-            </w:r>
-            <w:r>
-              <w:rPr>
-                <w:rFonts w:ascii="Arial" w:eastAsia="Arial" w:hAnsi="Arial" w:cs="Arial"/>
-                <w:sz w:val="16"/>
-                <w:szCs w:val="16"/>
-              </w:rPr>
-              <w:t>______________</w:t>
-            </w:r>
-          </w:p>
-          <w:p>
-            <w:pPr>
-              <w:spacing w:after="0" w:line="276" w:lineRule="auto"/>
-              <w:ind w:left="170" w:right="170"/>
-              <w:jc w:val="both"/>
-              <w:rPr>
-                <w:rFonts w:ascii="Arial" w:eastAsia="Arial" w:hAnsi="Arial" w:cs="Arial"/>
-                <w:sz w:val="16"/>
-                <w:szCs w:val="16"/>
-                <w:shd w:val="clear" w:color="auto" w:fill="92D050"/>
-              </w:rPr>
-            </w:pPr>
-          </w:p>
-          <w:p>
-            <w:pPr>
-              <w:spacing w:after="0" w:line="276" w:lineRule="auto"/>
-              <w:ind w:left="170" w:right="170"/>
-              <w:jc w:val="both"/>
-              <w:rPr>
-                <w:rFonts w:ascii="Arial" w:eastAsia="Arial" w:hAnsi="Arial" w:cs="Arial"/>
-                <w:sz w:val="16"/>
-                <w:szCs w:val="16"/>
-                <w:shd w:val="clear" w:color="auto" w:fill="92D050"/>
-              </w:rPr>
-            </w:pPr>
-            <w:r>
-              <w:rPr>
-                <w:rFonts w:ascii="Arial" w:eastAsia="Arial" w:hAnsi="Arial" w:cs="Arial"/>
-                <w:sz w:val="16"/>
-                <w:szCs w:val="16"/>
-              </w:rPr>
-              <w:t>Teléfono: ____________</w:t>
-            </w:r>
-            <w:r>
-              <w:rPr>
-                <w:rFonts w:ascii="Arial" w:eastAsia="Arial" w:hAnsi="Arial" w:cs="Arial"/>
-                <w:sz w:val="16"/>
-                <w:szCs w:val="16"/>
-              </w:rPr>
-              <w:t>{</w:t>
-            </w:r>
-            <w:proofErr w:type="spellStart"/>
-            <w:r>
-              <w:rPr>
-                <w:rFonts w:ascii="Arial" w:eastAsia="Arial" w:hAnsi="Arial" w:cs="Arial"/>
-                <w:sz w:val="16"/>
-                <w:szCs w:val="16"/>
-              </w:rPr>
-              <w:t>telefonoAdministradorContrato</w:t>
-            </w:r>
-            <w:proofErr w:type="spellEnd"/>
-            <w:r>
-              <w:rPr>
-                <w:rFonts w:ascii="Arial" w:eastAsia="Arial" w:hAnsi="Arial" w:cs="Arial"/>
-                <w:sz w:val="16"/>
-                <w:szCs w:val="16"/>
-              </w:rPr>
-              <w:t>}</w:t>
-            </w:r>
-            <w:r>
-              <w:rPr>
-                <w:rFonts w:ascii="Arial" w:eastAsia="Arial" w:hAnsi="Arial" w:cs="Arial"/>
-                <w:sz w:val="16"/>
-                <w:szCs w:val="16"/>
-              </w:rPr>
-              <w:t>_____________</w:t>
-            </w:r>
-          </w:p>
-          <w:p>
-            <w:pPr>
-              <w:spacing w:after="0" w:line="276" w:lineRule="auto"/>
-              <w:ind w:left="170" w:right="170"/>
-              <w:jc w:val="both"/>
-              <w:rPr>
-                <w:rFonts w:ascii="Arial" w:eastAsia="Arial" w:hAnsi="Arial" w:cs="Arial"/>
-                <w:color w:val="000000"/>
-                <w:sz w:val="16"/>
-                <w:szCs w:val="16"/>
-              </w:rPr>
-            </w:pPr>
-          </w:p>
-          <w:p>
-            <w:pPr>
-              <w:spacing w:after="0" w:line="276" w:lineRule="auto"/>
-              <w:ind w:left="170" w:right="170"/>
-              <w:jc w:val="both"/>
-              <w:rPr>
-                <w:rFonts w:ascii="Arial" w:eastAsia="Arial" w:hAnsi="Arial" w:cs="Arial"/>
-                <w:color w:val="000000"/>
-                <w:sz w:val="16"/>
-                <w:szCs w:val="16"/>
-              </w:rPr>
-            </w:pPr>
-            <w:r>
-              <w:rPr>
-                <w:rFonts w:ascii="Arial" w:eastAsia="Arial" w:hAnsi="Arial" w:cs="Arial"/>
-                <w:color w:val="000000"/>
-                <w:sz w:val="16"/>
-                <w:szCs w:val="16"/>
-              </w:rPr>
-              <w:t xml:space="preserve">El Administrador del contrato deberá supervisar la entrega de los bienes, así mismo realizar las visitas e inspecciones que estime pertinentes, igualmente podrá solicitar al proveedor, todos los datos e informes relacionados con los actos de que se trate, la Contratante estará obligada a permitir el acceso a los almacenes bodegas o lugares en los que se encuentren los bienes. </w:t>
+          </w:p>
+          <w:p>
+            <w:pPr>
+              <w:spacing w:after="0" w:line="276" w:lineRule="auto"/>
+              <w:ind w:left="170" w:right="170"/>
+              <w:jc w:val="both"/>
+              <w:rPr>
+                <w:rFonts w:ascii="Arial" w:eastAsia="Arial" w:hAnsi="Arial" w:cs="Arial"/>
+                <w:color w:val="000000"/>
+                <w:sz w:val="16"/>
+                <w:szCs w:val="16"/>
+              </w:rPr>
+            </w:pPr>
+          </w:p>
+          <w:p>
+            <w:pPr>
+              <w:spacing w:after="0" w:line="276" w:lineRule="auto"/>
+              <w:ind w:left="170" w:right="170"/>
+              <w:jc w:val="both"/>
+              <w:rPr>
+                <w:rFonts w:ascii="Arial" w:eastAsia="Arial" w:hAnsi="Arial" w:cs="Arial"/>
+                <w:color w:val="000000"/>
+                <w:sz w:val="16"/>
+                <w:szCs w:val="16"/>
+              </w:rPr>
+            </w:pPr>
+            <w:r>
+              <w:rPr>
+                <w:rFonts w:ascii="Arial" w:eastAsia="Arial" w:hAnsi="Arial" w:cs="Arial"/>
+                <w:color w:val="000000"/>
+                <w:sz w:val="16"/>
+                <w:szCs w:val="16"/>
+              </w:rPr>
+              <w:t xml:space="preserve">El Administrador del contrato deberá supervisar la entrega de los bienes, así mismo realizar las visitas e inspecciones que estime pertinentes, igualmente podrá solicitar al proveedor, todos los datos e informes relacionados con los actos de que se trate, </w:t>
+            </w:r>
+            <w:r>
+              <w:rPr>
+                <w:rFonts w:ascii="Arial" w:eastAsia="Arial" w:hAnsi="Arial" w:cs="Arial"/>
+                <w:color w:val="000000"/>
+                <w:sz w:val="16"/>
+                <w:szCs w:val="16"/>
+              </w:rPr>
+              <w:t xml:space="preserve">la Contratante estará obligada a permitir el acceso a los almacenes bodegas o lugares en los que se encuentren los bienes. </w:t>
             </w:r>
           </w:p>
           <w:p>
@@ -5769,42 +6307,78 @@
                 <w:szCs w:val="16"/>
               </w:rPr>
               <w:lastRenderedPageBreak/>
-              <w:t>El administrador del contrato, podrá solicitar la suspensión o cancelación del registro del licitante o proveedor en el padrón respectivo e inhabilitarlo temporalmente para participar en procedimientos de adjudicación o celebrara contratos regulados por la Ley de Adquisiciones, Arrendamientos y Servicios del Sector Público Estatal y Municipal, en los casos de incumplimiento de las obligaciones contractuales y que, como consecuencia, causen daños o perjuicios graves a la entidad contratante, así como aquellos que entreguen bienes con especificaciones distintas de las convenidas de conformidad con el artículo 136 de la Ley en la materia; asimismo, supervisará que los bienes se hayan entregado en tiempo y forma y cumplan con la calidad y especificaciones estipuladas en la descripción de las partidas.</w:t>
-            </w:r>
-          </w:p>
-          <w:p>
-            <w:pPr>
-              <w:spacing w:after="0" w:line="276" w:lineRule="auto"/>
-              <w:ind w:left="170" w:right="170"/>
-              <w:jc w:val="both"/>
-              <w:rPr>
-                <w:rFonts w:ascii="Arial" w:eastAsia="Arial" w:hAnsi="Arial" w:cs="Arial"/>
-                <w:color w:val="000000"/>
-                <w:sz w:val="16"/>
-                <w:szCs w:val="16"/>
-              </w:rPr>
-            </w:pPr>
-          </w:p>
-          <w:p>
-            <w:pPr>
-              <w:spacing w:after="0" w:line="276" w:lineRule="auto"/>
-              <w:ind w:left="170" w:right="170"/>
-              <w:jc w:val="both"/>
-              <w:rPr>
-                <w:rFonts w:ascii="Arial" w:eastAsia="Arial" w:hAnsi="Arial" w:cs="Arial"/>
-                <w:color w:val="000000"/>
-                <w:sz w:val="16"/>
-                <w:szCs w:val="16"/>
-              </w:rPr>
-            </w:pPr>
-            <w:r>
-              <w:rPr>
-                <w:rFonts w:ascii="Arial" w:eastAsia="Arial" w:hAnsi="Arial" w:cs="Arial"/>
-                <w:color w:val="000000"/>
-                <w:sz w:val="16"/>
-                <w:szCs w:val="16"/>
-              </w:rPr>
-              <w:t>En caso de que la persona designada como Administrador ya no se encuentre en el cargo, deberá firmar el jefe inmediato o el que para la fecha de suscripción del contrato ocupe el cargo.</w:t>
+              <w:t>El administrador del contrato, podrá solicitar la suspensión o cancelación del registro del licitante o proveedor en el padrón resp</w:t>
+            </w:r>
+            <w:r>
+              <w:rPr>
+                <w:rFonts w:ascii="Arial" w:eastAsia="Arial" w:hAnsi="Arial" w:cs="Arial"/>
+                <w:color w:val="000000"/>
+                <w:sz w:val="16"/>
+                <w:szCs w:val="16"/>
+              </w:rPr>
+              <w:t>ectivo e inhabilitarlo temporalmente para participar en procedimientos de adjudicación o celebrara contratos regulados por la Ley de Adquisiciones, Arrendamientos y Servicios del Sector Público Estatal y Municipal, en los casos de incumplimiento de las obl</w:t>
+            </w:r>
+            <w:r>
+              <w:rPr>
+                <w:rFonts w:ascii="Arial" w:eastAsia="Arial" w:hAnsi="Arial" w:cs="Arial"/>
+                <w:color w:val="000000"/>
+                <w:sz w:val="16"/>
+                <w:szCs w:val="16"/>
+              </w:rPr>
+              <w:t>igaciones contractuales y que, como consecuencia, causen daños o perjuicios graves a la entidad contratante, así como aquellos que entreguen bienes con especificaciones distintas de las convenidas de conformidad con el artículo 136 de la Ley en la materia;</w:t>
+            </w:r>
+            <w:r>
+              <w:rPr>
+                <w:rFonts w:ascii="Arial" w:eastAsia="Arial" w:hAnsi="Arial" w:cs="Arial"/>
+                <w:color w:val="000000"/>
+                <w:sz w:val="16"/>
+                <w:szCs w:val="16"/>
+              </w:rPr>
+              <w:t xml:space="preserve"> asimismo, supervisará que los bienes se hayan entregado en tiempo y forma y cumplan con la calidad y especificaciones estipuladas en la descripción de las partidas.</w:t>
+            </w:r>
+          </w:p>
+          <w:p>
+            <w:pPr>
+              <w:spacing w:after="0" w:line="276" w:lineRule="auto"/>
+              <w:ind w:left="170" w:right="170"/>
+              <w:jc w:val="both"/>
+              <w:rPr>
+                <w:rFonts w:ascii="Arial" w:eastAsia="Arial" w:hAnsi="Arial" w:cs="Arial"/>
+                <w:color w:val="000000"/>
+                <w:sz w:val="16"/>
+                <w:szCs w:val="16"/>
+              </w:rPr>
+            </w:pPr>
+          </w:p>
+          <w:p>
+            <w:pPr>
+              <w:spacing w:after="0" w:line="276" w:lineRule="auto"/>
+              <w:ind w:left="170" w:right="170"/>
+              <w:jc w:val="both"/>
+              <w:rPr>
+                <w:rFonts w:ascii="Arial" w:eastAsia="Arial" w:hAnsi="Arial" w:cs="Arial"/>
+                <w:color w:val="000000"/>
+                <w:sz w:val="16"/>
+                <w:szCs w:val="16"/>
+              </w:rPr>
+            </w:pPr>
+            <w:r>
+              <w:rPr>
+                <w:rFonts w:ascii="Arial" w:eastAsia="Arial" w:hAnsi="Arial" w:cs="Arial"/>
+                <w:color w:val="000000"/>
+                <w:sz w:val="16"/>
+                <w:szCs w:val="16"/>
+              </w:rPr>
+              <w:t>En caso de que la persona designada como Administrador ya no se encuentre en el cargo, de</w:t>
+            </w:r>
+            <w:r>
+              <w:rPr>
+                <w:rFonts w:ascii="Arial" w:eastAsia="Arial" w:hAnsi="Arial" w:cs="Arial"/>
+                <w:color w:val="000000"/>
+                <w:sz w:val="16"/>
+                <w:szCs w:val="16"/>
+              </w:rPr>
+              <w:t>berá firmar el jefe inmediato o el que para la fecha de suscripción del contrato ocupe el cargo.</w:t>
             </w:r>
           </w:p>
           <w:p>
@@ -5874,7 +6448,25 @@
                 <w:sz w:val="16"/>
                 <w:szCs w:val="16"/>
               </w:rPr>
-              <w:t xml:space="preserve">El 0.5% por el monto total correspondiente a los bienes no entregados (sin incluir I.V.A.) y por cada día natural de retraso, a partir del día siguiente, posterior a la fecha pactada para la entrega; mismo que será deducido a través de cheque certificado, de caja o nota de Crédito. Dicho documento deberá estar a nombre de: </w:t>
+              <w:t>El 0.</w:t>
+            </w:r>
+            <w:r>
+              <w:rPr>
+                <w:rFonts w:ascii="Arial" w:eastAsia="Arial" w:hAnsi="Arial" w:cs="Arial"/>
+                <w:color w:val="000000"/>
+                <w:sz w:val="16"/>
+                <w:szCs w:val="16"/>
+              </w:rPr>
+              <w:t>5% por el monto total correspondiente a los bienes no entregados (sin incluir I.V.A.) y por cada día natural de retraso, a partir del día siguiente, posterior a la fecha pactada para la entrega; mismo que será deducido a través de cheque certificado, de ca</w:t>
+            </w:r>
+            <w:r>
+              <w:rPr>
+                <w:rFonts w:ascii="Arial" w:eastAsia="Arial" w:hAnsi="Arial" w:cs="Arial"/>
+                <w:color w:val="000000"/>
+                <w:sz w:val="16"/>
+                <w:szCs w:val="16"/>
+              </w:rPr>
+              <w:t xml:space="preserve">ja o nota de Crédito. Dicho documento deberá estar a nombre de: </w:t>
             </w:r>
             <w:r>
               <w:rPr>
@@ -5914,7 +6506,25 @@
                 <w:sz w:val="16"/>
                 <w:szCs w:val="16"/>
               </w:rPr>
-              <w:t xml:space="preserve"> y deberá ser presentado previamente a la entrega de la facturación. No pudiendo rebasar la suma de la aplicación de las penas convencionales el diez por ciento del monto total del contrato; ya que, en caso de rebasar tal porcentaje, la contratante podrá rescindir el contrato, total o parcialmente, según sea el caso, haciendo efectiva la póliza de garantía y podrá adjudicar el contrato al segundo lugar.</w:t>
+              <w:t xml:space="preserve"> y deberá ser presentado previamente a la entrega de la facturación. No pudiendo rebasar la suma de la a</w:t>
+            </w:r>
+            <w:r>
+              <w:rPr>
+                <w:rFonts w:ascii="Arial" w:eastAsia="Arial" w:hAnsi="Arial" w:cs="Arial"/>
+                <w:color w:val="000000"/>
+                <w:sz w:val="16"/>
+                <w:szCs w:val="16"/>
+              </w:rPr>
+              <w:t>plicación de las penas convencionales el diez por ciento del monto total del contrato; ya que, en caso de rebasar tal porcentaje, la contratante podrá rescindir el contrato, total o parcialmente, según sea el caso, haciendo efectiva la póliza de garantía y</w:t>
+            </w:r>
+            <w:r>
+              <w:rPr>
+                <w:rFonts w:ascii="Arial" w:eastAsia="Arial" w:hAnsi="Arial" w:cs="Arial"/>
+                <w:color w:val="000000"/>
+                <w:sz w:val="16"/>
+                <w:szCs w:val="16"/>
+              </w:rPr>
+              <w:t xml:space="preserve"> podrá adjudicar el contrato al segundo lugar.</w:t>
             </w:r>
           </w:p>
           <w:p>
@@ -5984,7 +6594,16 @@
                 <w:sz w:val="16"/>
                 <w:szCs w:val="16"/>
               </w:rPr>
-              <w:t>En ningún caso el monto de las penas convencionales será superior, en su conjunto, al monto de la garantía de cumplimiento del contrato.</w:t>
+              <w:t>En ningún caso</w:t>
+            </w:r>
+            <w:r>
+              <w:rPr>
+                <w:rFonts w:ascii="Arial" w:eastAsia="Arial" w:hAnsi="Arial" w:cs="Arial"/>
+                <w:color w:val="000000"/>
+                <w:sz w:val="16"/>
+                <w:szCs w:val="16"/>
+              </w:rPr>
+              <w:t xml:space="preserve"> el monto de las penas convencionales será superior, en su conjunto, al monto de la garantía de cumplimiento del contrato.</w:t>
             </w:r>
             <w:r>
               <w:rPr>
@@ -6216,26 +6835,49 @@
           </w:tcPr>
           <w:p>
             <w:pPr>
-              <w:spacing w:after="0" w:line="276" w:lineRule="auto"/>
-              <w:ind w:left="170" w:right="170"/>
-              <w:jc w:val="both"/>
-              <w:rPr>
-                <w:rFonts w:ascii="Arial" w:eastAsia="Arial" w:hAnsi="Arial" w:cs="Arial"/>
-                <w:b/>
-                <w:bCs/>
-                <w:color w:val="000000"/>
-                <w:sz w:val="16"/>
-                <w:szCs w:val="16"/>
-              </w:rPr>
-            </w:pPr>
-            <w:r>
-              <w:rPr>
-                <w:rFonts w:ascii="Arial" w:eastAsia="Arial" w:hAnsi="Arial" w:cs="Arial"/>
-                <w:sz w:val="16"/>
-                <w:szCs w:val="16"/>
-                <w:shd w:val="clear" w:color="auto" w:fill="92D050"/>
-              </w:rPr>
-              <w:t>(DIRECTOR RESPONSABLE DE LA CONTRATACIÓN)</w:t>
+              <w:spacing w:after="0" w:line="240" w:lineRule="auto"/>
+              <w:jc w:val="center"/>
+              <w:rPr>
+                <w:rFonts w:ascii="Arial" w:eastAsia="Arial" w:hAnsi="Arial" w:cs="Arial"/>
+                <w:b/>
+                <w:bCs/>
+                <w:color w:val="000000"/>
+                <w:sz w:val="16"/>
+                <w:szCs w:val="16"/>
+              </w:rPr>
+            </w:pPr>
+            <w:r>
+              <w:rPr>
+                <w:rFonts w:ascii="Arial" w:hAnsi="Arial" w:cs="Arial"/>
+                <w:sz w:val="16"/>
+                <w:szCs w:val="16"/>
+              </w:rPr>
+              <w:t>{nombreSolicitante}</w:t>
+            </w:r>
+          </w:p>
+          <w:p>
+            <w:pPr>
+              <w:spacing w:after="0" w:line="240" w:lineRule="auto"/>
+              <w:jc w:val="center"/>
+              <w:rPr>
+                <w:rFonts w:ascii="Arial" w:eastAsia="Arial" w:hAnsi="Arial" w:cs="Arial"/>
+                <w:b/>
+                <w:bCs/>
+                <w:color w:val="000000"/>
+                <w:sz w:val="16"/>
+                <w:szCs w:val="16"/>
+              </w:rPr>
+            </w:pPr>
+            <w:r>
+              <w:rPr>
+                <w:rFonts w:ascii="Arial" w:eastAsia="Arial" w:hAnsi="Arial" w:cs="Arial"/>
+                <w:b/>
+                <w:bCs/>
+                <w:color w:val="000000"/>
+                <w:sz w:val="16"/>
+                <w:szCs w:val="16"/>
+              </w:rPr>
+              <w:t>DIRECTOR RESPONSABLE DE LA CONTRATACIÓN</w:t>
             </w:r>
           </w:p>
         </w:tc>
@@ -6591,7 +7233,18 @@
                 <w:sz w:val="16"/>
                 <w:szCs w:val="16"/>
               </w:rPr>
-              <w:t>LAURA BEATRIZ OLVERA POPOCA</w:t>
+              <w:t xml:space="preserve">LAURA </w:t>
+            </w:r>
+            <w:r>
+              <w:rPr>
+                <w:rFonts w:ascii="Arial" w:eastAsia="Arial" w:hAnsi="Arial" w:cs="Arial"/>
+                <w:b/>
+                <w:bCs/>
+                <w:color w:val="000000"/>
+                <w:sz w:val="16"/>
+                <w:szCs w:val="16"/>
+              </w:rPr>
+              <w:t>BEATRIZ OLVERA POPOCA</w:t>
             </w:r>
           </w:p>
           <w:p>
@@ -6649,7 +7302,18 @@
                 <w:sz w:val="16"/>
                 <w:szCs w:val="16"/>
               </w:rPr>
-              <w:t>NOTA: Los elementos resaltados deberán ser requisitados de conformidad con las necesidades de la unidad requirente misma que deberá ser validada por la Dirección de Recursos Materiales</w:t>
+              <w:t xml:space="preserve">NOTA: Los elementos resaltados deberán ser requisitados de conformidad con las necesidades de la unidad requirente misma que deberá ser </w:t>
+            </w:r>
+            <w:r>
+              <w:rPr>
+                <w:rFonts w:ascii="Arial" w:eastAsia="Arial" w:hAnsi="Arial" w:cs="Arial"/>
+                <w:b/>
+                <w:bCs/>
+                <w:color w:val="000000"/>
+                <w:sz w:val="16"/>
+                <w:szCs w:val="16"/>
+              </w:rPr>
+              <w:t>validada por la Dirección de Recursos Materiales</w:t>
             </w:r>
           </w:p>
         </w:tc>
@@ -6676,7 +7340,7 @@
 </file>
 
 <file path=word/endnotes.xml><?xml version="1.0" encoding="utf-8"?>
-<w:endnotes xmlns:wpc="http://schemas.microsoft.com/office/word/2010/wordprocessingCanvas" xmlns:cx="http://schemas.microsoft.com/office/drawing/2014/chartex" xmlns:cx1="http://schemas.microsoft.com/office/drawing/2015/9/8/chartex" xmlns:cx2="http://schemas.microsoft.com/office/drawing/2015/10/21/chartex" xmlns:cx3="http://schemas.microsoft.com/office/drawing/2016/5/9/chartex" xmlns:cx4="http://schemas.microsoft.com/office/drawing/2016/5/10/chartex" xmlns:cx5="http://schemas.microsoft.com/office/drawing/2016/5/11/chartex" xmlns:cx6="http://schemas.microsoft.com/office/drawing/2016/5/12/chartex" xmlns:cx7="http://schemas.microsoft.com/office/drawing/2016/5/13/chartex" xmlns:cx8="http://schemas.microsoft.com/office/drawing/2016/5/14/chartex" xmlns:mc="http://schemas.openxmlformats.org/markup-compatibility/2006" xmlns:aink="http://schemas.microsoft.com/office/drawing/2016/ink" xmlns:am3d="http://schemas.microsoft.com/office/drawing/2017/model3d" xmlns:o="urn:schemas-microsoft-com:office:office" xmlns:oel="http://schemas.microsoft.com/office/2019/extlst" xmlns:r="http://schemas.openxmlformats.org/officeDocument/2006/relationships" xmlns:m="http://schemas.openxmlformats.org/officeDocument/2006/math" xmlns:v="urn:schemas-microsoft-com:vml" xmlns:wp14="http://schemas.microsoft.com/office/word/2010/wordprocessingDrawing" xmlns:wp="http://schemas.openxmlformats.org/drawingml/2006/wordprocessingDrawing" xmlns:w10="urn:schemas-microsoft-com:office:word" xmlns:w="http://schemas.openxmlformats.org/wordprocessingml/2006/main" xmlns:w14="http://schemas.microsoft.com/office/word/2010/wordml" xmlns:w15="http://schemas.microsoft.com/office/word/2012/wordml" xmlns:w16cex="http://schemas.microsoft.com/office/word/2018/wordml/cex" xmlns:w16cid="http://schemas.microsoft.com/office/word/2016/wordml/cid" xmlns:w16="http://schemas.microsoft.com/office/word/2018/wordml" xmlns:w16sdtdh="http://schemas.microsoft.com/office/word/2020/wordml/sdtdatahash" xmlns:w16se="http://schemas.microsoft.com/office/word/2015/wordml/symex" xmlns:wpg="http://schemas.microsoft.com/office/word/2010/wordprocessingGroup" xmlns:wpi="http://schemas.microsoft.com/office/word/2010/wordprocessingInk" xmlns:wne="http://schemas.microsoft.com/office/word/2006/wordml" xmlns:wps="http://schemas.microsoft.com/office/word/2010/wordprocessingShape" mc:Ignorable="w14 w15 w16se w16cid w16 w16cex w16sdtdh wp14">
+<w:endnotes xmlns:wpc="http://schemas.microsoft.com/office/word/2010/wordprocessingCanvas" xmlns:cx="http://schemas.microsoft.com/office/drawing/2014/chartex" xmlns:cx1="http://schemas.microsoft.com/office/drawing/2015/9/8/chartex" xmlns:cx2="http://schemas.microsoft.com/office/drawing/2015/10/21/chartex" xmlns:cx3="http://schemas.microsoft.com/office/drawing/2016/5/9/chartex" xmlns:cx4="http://schemas.microsoft.com/office/drawing/2016/5/10/chartex" xmlns:cx5="http://schemas.microsoft.com/office/drawing/2016/5/11/chartex" xmlns:cx6="http://schemas.microsoft.com/office/drawing/2016/5/12/chartex" xmlns:cx7="http://schemas.microsoft.com/office/drawing/2016/5/13/chartex" xmlns:cx8="http://schemas.microsoft.com/office/drawing/2016/5/14/chartex" xmlns:mc="http://schemas.openxmlformats.org/markup-compatibility/2006" xmlns:aink="http://schemas.microsoft.com/office/drawing/2016/ink" xmlns:am3d="http://schemas.microsoft.com/office/drawing/2017/model3d" xmlns:o="urn:schemas-microsoft-com:office:office" xmlns:r="http://schemas.openxmlformats.org/officeDocument/2006/relationships" xmlns:m="http://schemas.openxmlformats.org/officeDocument/2006/math" xmlns:v="urn:schemas-microsoft-com:vml" xmlns:wp14="http://schemas.microsoft.com/office/word/2010/wordprocessingDrawing" xmlns:wp="http://schemas.openxmlformats.org/drawingml/2006/wordprocessingDrawing" xmlns:w10="urn:schemas-microsoft-com:office:word" xmlns:w="http://schemas.openxmlformats.org/wordprocessingml/2006/main" xmlns:w14="http://schemas.microsoft.com/office/word/2010/wordml" xmlns:w15="http://schemas.microsoft.com/office/word/2012/wordml" xmlns:w16cex="http://schemas.microsoft.com/office/word/2018/wordml/cex" xmlns:w16cid="http://schemas.microsoft.com/office/word/2016/wordml/cid" xmlns:w16="http://schemas.microsoft.com/office/word/2018/wordml" xmlns:w16se="http://schemas.microsoft.com/office/word/2015/wordml/symex" xmlns:wpg="http://schemas.microsoft.com/office/word/2010/wordprocessingGroup" xmlns:wpi="http://schemas.microsoft.com/office/word/2010/wordprocessingInk" xmlns:wne="http://schemas.microsoft.com/office/word/2006/wordml" xmlns:wps="http://schemas.microsoft.com/office/word/2010/wordprocessingShape" mc:Ignorable="w14 w15 w16se w16cid w16 w16cex wp14">
   <w:endnote w:type="separator" w:id="-1">
     <w:p>
       <w:pPr>
@@ -6701,7 +7365,7 @@
 </file>
 
 <file path=word/footer1.xml><?xml version="1.0" encoding="utf-8"?>
-<w:ftr xmlns:wpc="http://schemas.microsoft.com/office/word/2010/wordprocessingCanvas" xmlns:cx="http://schemas.microsoft.com/office/drawing/2014/chartex" xmlns:cx1="http://schemas.microsoft.com/office/drawing/2015/9/8/chartex" xmlns:cx2="http://schemas.microsoft.com/office/drawing/2015/10/21/chartex" xmlns:cx3="http://schemas.microsoft.com/office/drawing/2016/5/9/chartex" xmlns:cx4="http://schemas.microsoft.com/office/drawing/2016/5/10/chartex" xmlns:cx5="http://schemas.microsoft.com/office/drawing/2016/5/11/chartex" xmlns:cx6="http://schemas.microsoft.com/office/drawing/2016/5/12/chartex" xmlns:cx7="http://schemas.microsoft.com/office/drawing/2016/5/13/chartex" xmlns:cx8="http://schemas.microsoft.com/office/drawing/2016/5/14/chartex" xmlns:mc="http://schemas.openxmlformats.org/markup-compatibility/2006" xmlns:aink="http://schemas.microsoft.com/office/drawing/2016/ink" xmlns:am3d="http://schemas.microsoft.com/office/drawing/2017/model3d" xmlns:o="urn:schemas-microsoft-com:office:office" xmlns:oel="http://schemas.microsoft.com/office/2019/extlst" xmlns:r="http://schemas.openxmlformats.org/officeDocument/2006/relationships" xmlns:m="http://schemas.openxmlformats.org/officeDocument/2006/math" xmlns:v="urn:schemas-microsoft-com:vml" xmlns:wp14="http://schemas.microsoft.com/office/word/2010/wordprocessingDrawing" xmlns:wp="http://schemas.openxmlformats.org/drawingml/2006/wordprocessingDrawing" xmlns:w10="urn:schemas-microsoft-com:office:word" xmlns:w="http://schemas.openxmlformats.org/wordprocessingml/2006/main" xmlns:w14="http://schemas.microsoft.com/office/word/2010/wordml" xmlns:w15="http://schemas.microsoft.com/office/word/2012/wordml" xmlns:w16cex="http://schemas.microsoft.com/office/word/2018/wordml/cex" xmlns:w16cid="http://schemas.microsoft.com/office/word/2016/wordml/cid" xmlns:w16="http://schemas.microsoft.com/office/word/2018/wordml" xmlns:w16sdtdh="http://schemas.microsoft.com/office/word/2020/wordml/sdtdatahash" xmlns:w16se="http://schemas.microsoft.com/office/word/2015/wordml/symex" xmlns:wpg="http://schemas.microsoft.com/office/word/2010/wordprocessingGroup" xmlns:wpi="http://schemas.microsoft.com/office/word/2010/wordprocessingInk" xmlns:wne="http://schemas.microsoft.com/office/word/2006/wordml" xmlns:wps="http://schemas.microsoft.com/office/word/2010/wordprocessingShape" mc:Ignorable="w14 w15 w16se w16cid w16 w16cex w16sdtdh wp14">
+<w:ftr xmlns:wpc="http://schemas.microsoft.com/office/word/2010/wordprocessingCanvas" xmlns:cx="http://schemas.microsoft.com/office/drawing/2014/chartex" xmlns:cx1="http://schemas.microsoft.com/office/drawing/2015/9/8/chartex" xmlns:cx2="http://schemas.microsoft.com/office/drawing/2015/10/21/chartex" xmlns:cx3="http://schemas.microsoft.com/office/drawing/2016/5/9/chartex" xmlns:cx4="http://schemas.microsoft.com/office/drawing/2016/5/10/chartex" xmlns:cx5="http://schemas.microsoft.com/office/drawing/2016/5/11/chartex" xmlns:cx6="http://schemas.microsoft.com/office/drawing/2016/5/12/chartex" xmlns:cx7="http://schemas.microsoft.com/office/drawing/2016/5/13/chartex" xmlns:cx8="http://schemas.microsoft.com/office/drawing/2016/5/14/chartex" xmlns:mc="http://schemas.openxmlformats.org/markup-compatibility/2006" xmlns:aink="http://schemas.microsoft.com/office/drawing/2016/ink" xmlns:am3d="http://schemas.microsoft.com/office/drawing/2017/model3d" xmlns:o="urn:schemas-microsoft-com:office:office" xmlns:r="http://schemas.openxmlformats.org/officeDocument/2006/relationships" xmlns:m="http://schemas.openxmlformats.org/officeDocument/2006/math" xmlns:v="urn:schemas-microsoft-com:vml" xmlns:wp14="http://schemas.microsoft.com/office/word/2010/wordprocessingDrawing" xmlns:wp="http://schemas.openxmlformats.org/drawingml/2006/wordprocessingDrawing" xmlns:w10="urn:schemas-microsoft-com:office:word" xmlns:w="http://schemas.openxmlformats.org/wordprocessingml/2006/main" xmlns:w14="http://schemas.microsoft.com/office/word/2010/wordml" xmlns:w15="http://schemas.microsoft.com/office/word/2012/wordml" xmlns:w16cex="http://schemas.microsoft.com/office/word/2018/wordml/cex" xmlns:w16cid="http://schemas.microsoft.com/office/word/2016/wordml/cid" xmlns:w16="http://schemas.microsoft.com/office/word/2018/wordml" xmlns:w16se="http://schemas.microsoft.com/office/word/2015/wordml/symex" xmlns:wpg="http://schemas.microsoft.com/office/word/2010/wordprocessingGroup" xmlns:wpi="http://schemas.microsoft.com/office/word/2010/wordprocessingInk" xmlns:wne="http://schemas.microsoft.com/office/word/2006/wordml" xmlns:wps="http://schemas.microsoft.com/office/word/2010/wordprocessingShape" mc:Ignorable="w14 w15 w16se w16cid w16 w16cex wp14">
   <w:p>
     <w:pPr>
       <w:tabs>
@@ -6838,7 +7502,7 @@
 </file>
 
 <file path=word/footnotes.xml><?xml version="1.0" encoding="utf-8"?>
-<w:footnotes xmlns:wpc="http://schemas.microsoft.com/office/word/2010/wordprocessingCanvas" xmlns:cx="http://schemas.microsoft.com/office/drawing/2014/chartex" xmlns:cx1="http://schemas.microsoft.com/office/drawing/2015/9/8/chartex" xmlns:cx2="http://schemas.microsoft.com/office/drawing/2015/10/21/chartex" xmlns:cx3="http://schemas.microsoft.com/office/drawing/2016/5/9/chartex" xmlns:cx4="http://schemas.microsoft.com/office/drawing/2016/5/10/chartex" xmlns:cx5="http://schemas.microsoft.com/office/drawing/2016/5/11/chartex" xmlns:cx6="http://schemas.microsoft.com/office/drawing/2016/5/12/chartex" xmlns:cx7="http://schemas.microsoft.com/office/drawing/2016/5/13/chartex" xmlns:cx8="http://schemas.microsoft.com/office/drawing/2016/5/14/chartex" xmlns:mc="http://schemas.openxmlformats.org/markup-compatibility/2006" xmlns:aink="http://schemas.microsoft.com/office/drawing/2016/ink" xmlns:am3d="http://schemas.microsoft.com/office/drawing/2017/model3d" xmlns:o="urn:schemas-microsoft-com:office:office" xmlns:oel="http://schemas.microsoft.com/office/2019/extlst" xmlns:r="http://schemas.openxmlformats.org/officeDocument/2006/relationships" xmlns:m="http://schemas.openxmlformats.org/officeDocument/2006/math" xmlns:v="urn:schemas-microsoft-com:vml" xmlns:wp14="http://schemas.microsoft.com/office/word/2010/wordprocessingDrawing" xmlns:wp="http://schemas.openxmlformats.org/drawingml/2006/wordprocessingDrawing" xmlns:w10="urn:schemas-microsoft-com:office:word" xmlns:w="http://schemas.openxmlformats.org/wordprocessingml/2006/main" xmlns:w14="http://schemas.microsoft.com/office/word/2010/wordml" xmlns:w15="http://schemas.microsoft.com/office/word/2012/wordml" xmlns:w16cex="http://schemas.microsoft.com/office/word/2018/wordml/cex" xmlns:w16cid="http://schemas.microsoft.com/office/word/2016/wordml/cid" xmlns:w16="http://schemas.microsoft.com/office/word/2018/wordml" xmlns:w16sdtdh="http://schemas.microsoft.com/office/word/2020/wordml/sdtdatahash" xmlns:w16se="http://schemas.microsoft.com/office/word/2015/wordml/symex" xmlns:wpg="http://schemas.microsoft.com/office/word/2010/wordprocessingGroup" xmlns:wpi="http://schemas.microsoft.com/office/word/2010/wordprocessingInk" xmlns:wne="http://schemas.microsoft.com/office/word/2006/wordml" xmlns:wps="http://schemas.microsoft.com/office/word/2010/wordprocessingShape" mc:Ignorable="w14 w15 w16se w16cid w16 w16cex w16sdtdh wp14">
+<w:footnotes xmlns:wpc="http://schemas.microsoft.com/office/word/2010/wordprocessingCanvas" xmlns:cx="http://schemas.microsoft.com/office/drawing/2014/chartex" xmlns:cx1="http://schemas.microsoft.com/office/drawing/2015/9/8/chartex" xmlns:cx2="http://schemas.microsoft.com/office/drawing/2015/10/21/chartex" xmlns:cx3="http://schemas.microsoft.com/office/drawing/2016/5/9/chartex" xmlns:cx4="http://schemas.microsoft.com/office/drawing/2016/5/10/chartex" xmlns:cx5="http://schemas.microsoft.com/office/drawing/2016/5/11/chartex" xmlns:cx6="http://schemas.microsoft.com/office/drawing/2016/5/12/chartex" xmlns:cx7="http://schemas.microsoft.com/office/drawing/2016/5/13/chartex" xmlns:cx8="http://schemas.microsoft.com/office/drawing/2016/5/14/chartex" xmlns:mc="http://schemas.openxmlformats.org/markup-compatibility/2006" xmlns:aink="http://schemas.microsoft.com/office/drawing/2016/ink" xmlns:am3d="http://schemas.microsoft.com/office/drawing/2017/model3d" xmlns:o="urn:schemas-microsoft-com:office:office" xmlns:r="http://schemas.openxmlformats.org/officeDocument/2006/relationships" xmlns:m="http://schemas.openxmlformats.org/officeDocument/2006/math" xmlns:v="urn:schemas-microsoft-com:vml" xmlns:wp14="http://schemas.microsoft.com/office/word/2010/wordprocessingDrawing" xmlns:wp="http://schemas.openxmlformats.org/drawingml/2006/wordprocessingDrawing" xmlns:w10="urn:schemas-microsoft-com:office:word" xmlns:w="http://schemas.openxmlformats.org/wordprocessingml/2006/main" xmlns:w14="http://schemas.microsoft.com/office/word/2010/wordml" xmlns:w15="http://schemas.microsoft.com/office/word/2012/wordml" xmlns:w16cex="http://schemas.microsoft.com/office/word/2018/wordml/cex" xmlns:w16cid="http://schemas.microsoft.com/office/word/2016/wordml/cid" xmlns:w16="http://schemas.microsoft.com/office/word/2018/wordml" xmlns:w16se="http://schemas.microsoft.com/office/word/2015/wordml/symex" xmlns:wpg="http://schemas.microsoft.com/office/word/2010/wordprocessingGroup" xmlns:wpi="http://schemas.microsoft.com/office/word/2010/wordprocessingInk" xmlns:wne="http://schemas.microsoft.com/office/word/2006/wordml" xmlns:wps="http://schemas.microsoft.com/office/word/2010/wordprocessingShape" mc:Ignorable="w14 w15 w16se w16cid w16 w16cex wp14">
   <w:footnote w:type="separator" w:id="-1">
     <w:p>
       <w:pPr>
@@ -6863,7 +7527,7 @@
 </file>
 
 <file path=word/header1.xml><?xml version="1.0" encoding="utf-8"?>
-<w:hdr xmlns:wpc="http://schemas.microsoft.com/office/word/2010/wordprocessingCanvas" xmlns:cx="http://schemas.microsoft.com/office/drawing/2014/chartex" xmlns:cx1="http://schemas.microsoft.com/office/drawing/2015/9/8/chartex" xmlns:cx2="http://schemas.microsoft.com/office/drawing/2015/10/21/chartex" xmlns:cx3="http://schemas.microsoft.com/office/drawing/2016/5/9/chartex" xmlns:cx4="http://schemas.microsoft.com/office/drawing/2016/5/10/chartex" xmlns:cx5="http://schemas.microsoft.com/office/drawing/2016/5/11/chartex" xmlns:cx6="http://schemas.microsoft.com/office/drawing/2016/5/12/chartex" xmlns:cx7="http://schemas.microsoft.com/office/drawing/2016/5/13/chartex" xmlns:cx8="http://schemas.microsoft.com/office/drawing/2016/5/14/chartex" xmlns:mc="http://schemas.openxmlformats.org/markup-compatibility/2006" xmlns:aink="http://schemas.microsoft.com/office/drawing/2016/ink" xmlns:am3d="http://schemas.microsoft.com/office/drawing/2017/model3d" xmlns:o="urn:schemas-microsoft-com:office:office" xmlns:oel="http://schemas.microsoft.com/office/2019/extlst" xmlns:r="http://schemas.openxmlformats.org/officeDocument/2006/relationships" xmlns:m="http://schemas.openxmlformats.org/officeDocument/2006/math" xmlns:v="urn:schemas-microsoft-com:vml" xmlns:wp14="http://schemas.microsoft.com/office/word/2010/wordprocessingDrawing" xmlns:wp="http://schemas.openxmlformats.org/drawingml/2006/wordprocessingDrawing" xmlns:w10="urn:schemas-microsoft-com:office:word" xmlns:w="http://schemas.openxmlformats.org/wordprocessingml/2006/main" xmlns:w14="http://schemas.microsoft.com/office/word/2010/wordml" xmlns:w15="http://schemas.microsoft.com/office/word/2012/wordml" xmlns:w16cex="http://schemas.microsoft.com/office/word/2018/wordml/cex" xmlns:w16cid="http://schemas.microsoft.com/office/word/2016/wordml/cid" xmlns:w16="http://schemas.microsoft.com/office/word/2018/wordml" xmlns:w16sdtdh="http://schemas.microsoft.com/office/word/2020/wordml/sdtdatahash" xmlns:w16se="http://schemas.microsoft.com/office/word/2015/wordml/symex" xmlns:wpg="http://schemas.microsoft.com/office/word/2010/wordprocessingGroup" xmlns:wpi="http://schemas.microsoft.com/office/word/2010/wordprocessingInk" xmlns:wne="http://schemas.microsoft.com/office/word/2006/wordml" xmlns:wps="http://schemas.microsoft.com/office/word/2010/wordprocessingShape" mc:Ignorable="w14 w15 w16se w16cid w16 w16cex w16sdtdh wp14">
+<w:hdr xmlns:wpc="http://schemas.microsoft.com/office/word/2010/wordprocessingCanvas" xmlns:cx="http://schemas.microsoft.com/office/drawing/2014/chartex" xmlns:cx1="http://schemas.microsoft.com/office/drawing/2015/9/8/chartex" xmlns:cx2="http://schemas.microsoft.com/office/drawing/2015/10/21/chartex" xmlns:cx3="http://schemas.microsoft.com/office/drawing/2016/5/9/chartex" xmlns:cx4="http://schemas.microsoft.com/office/drawing/2016/5/10/chartex" xmlns:cx5="http://schemas.microsoft.com/office/drawing/2016/5/11/chartex" xmlns:cx6="http://schemas.microsoft.com/office/drawing/2016/5/12/chartex" xmlns:cx7="http://schemas.microsoft.com/office/drawing/2016/5/13/chartex" xmlns:cx8="http://schemas.microsoft.com/office/drawing/2016/5/14/chartex" xmlns:mc="http://schemas.openxmlformats.org/markup-compatibility/2006" xmlns:aink="http://schemas.microsoft.com/office/drawing/2016/ink" xmlns:am3d="http://schemas.microsoft.com/office/drawing/2017/model3d" xmlns:o="urn:schemas-microsoft-com:office:office" xmlns:r="http://schemas.openxmlformats.org/officeDocument/2006/relationships" xmlns:m="http://schemas.openxmlformats.org/officeDocument/2006/math" xmlns:v="urn:schemas-microsoft-com:vml" xmlns:wp14="http://schemas.microsoft.com/office/word/2010/wordprocessingDrawing" xmlns:wp="http://schemas.openxmlformats.org/drawingml/2006/wordprocessingDrawing" xmlns:w10="urn:schemas-microsoft-com:office:word" xmlns:w="http://schemas.openxmlformats.org/wordprocessingml/2006/main" xmlns:w14="http://schemas.microsoft.com/office/word/2010/wordml" xmlns:w15="http://schemas.microsoft.com/office/word/2012/wordml" xmlns:w16cex="http://schemas.microsoft.com/office/word/2018/wordml/cex" xmlns:w16cid="http://schemas.microsoft.com/office/word/2016/wordml/cid" xmlns:w16="http://schemas.microsoft.com/office/word/2018/wordml" xmlns:w16se="http://schemas.microsoft.com/office/word/2015/wordml/symex" xmlns:wpg="http://schemas.microsoft.com/office/word/2010/wordprocessingGroup" xmlns:wpi="http://schemas.microsoft.com/office/word/2010/wordprocessingInk" xmlns:wne="http://schemas.microsoft.com/office/word/2006/wordml" xmlns:wps="http://schemas.microsoft.com/office/word/2010/wordprocessingShape" mc:Ignorable="w14 w15 w16se w16cid w16 w16cex wp14">
   <w:p>
     <w:pPr>
       <w:pBdr>
@@ -7066,7 +7730,7 @@
             </wp:anchor>
           </w:drawing>
         </mc:Choice>
-        <mc:Fallback>
+        <mc:Fallback xmlns:w16sdtdh="http://schemas.microsoft.com/office/word/2020/wordml/sdtdatahash" xmlns:oel="http://schemas.microsoft.com/office/2019/extlst">
           <w:pict>
             <v:rect w14:anchorId="4693B46A" id="Rectángulo 1" o:spid="_x0000_s1026" style="position:absolute;left:0;text-align:left;margin-left:130.15pt;margin-top:-2.6pt;width:256.2pt;height:56.3pt;z-index:251659264;visibility:visible;mso-wrap-style:square;mso-wrap-distance-left:9pt;mso-wrap-distance-top:0;mso-wrap-distance-right:9pt;mso-wrap-distance-bottom:0;mso-position-horizontal:absolute;mso-position-horizontal-relative:text;mso-position-vertical:absolute;mso-position-vertical-relative:text;v-text-anchor:top" o:gfxdata="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" filled="f" stroked="f">
               <v:textbox inset="2.53958mm,1.2694mm,2.53958mm,1.2694mm">
@@ -7147,7 +7811,7 @@
 </file>
 
 <file path=word/numbering.xml><?xml version="1.0" encoding="utf-8"?>
-<w:numbering xmlns:wpc="http://schemas.microsoft.com/office/word/2010/wordprocessingCanvas" xmlns:cx="http://schemas.microsoft.com/office/drawing/2014/chartex" xmlns:cx1="http://schemas.microsoft.com/office/drawing/2015/9/8/chartex" xmlns:cx2="http://schemas.microsoft.com/office/drawing/2015/10/21/chartex" xmlns:cx3="http://schemas.microsoft.com/office/drawing/2016/5/9/chartex" xmlns:cx4="http://schemas.microsoft.com/office/drawing/2016/5/10/chartex" xmlns:cx5="http://schemas.microsoft.com/office/drawing/2016/5/11/chartex" xmlns:cx6="http://schemas.microsoft.com/office/drawing/2016/5/12/chartex" xmlns:cx7="http://schemas.microsoft.com/office/drawing/2016/5/13/chartex" xmlns:cx8="http://schemas.microsoft.com/office/drawing/2016/5/14/chartex" xmlns:mc="http://schemas.openxmlformats.org/markup-compatibility/2006" xmlns:aink="http://schemas.microsoft.com/office/drawing/2016/ink" xmlns:am3d="http://schemas.microsoft.com/office/drawing/2017/model3d" xmlns:o="urn:schemas-microsoft-com:office:office" xmlns:oel="http://schemas.microsoft.com/office/2019/extlst" xmlns:r="http://schemas.openxmlformats.org/officeDocument/2006/relationships" xmlns:m="http://schemas.openxmlformats.org/officeDocument/2006/math" xmlns:v="urn:schemas-microsoft-com:vml" xmlns:wp14="http://schemas.microsoft.com/office/word/2010/wordprocessingDrawing" xmlns:wp="http://schemas.openxmlformats.org/drawingml/2006/wordprocessingDrawing" xmlns:w10="urn:schemas-microsoft-com:office:word" xmlns:w="http://schemas.openxmlformats.org/wordprocessingml/2006/main" xmlns:w14="http://schemas.microsoft.com/office/word/2010/wordml" xmlns:w15="http://schemas.microsoft.com/office/word/2012/wordml" xmlns:w16cex="http://schemas.microsoft.com/office/word/2018/wordml/cex" xmlns:w16cid="http://schemas.microsoft.com/office/word/2016/wordml/cid" xmlns:w16="http://schemas.microsoft.com/office/word/2018/wordml" xmlns:w16sdtdh="http://schemas.microsoft.com/office/word/2020/wordml/sdtdatahash" xmlns:w16se="http://schemas.microsoft.com/office/word/2015/wordml/symex" xmlns:wpg="http://schemas.microsoft.com/office/word/2010/wordprocessingGroup" xmlns:wpi="http://schemas.microsoft.com/office/word/2010/wordprocessingInk" xmlns:wne="http://schemas.microsoft.com/office/word/2006/wordml" xmlns:wps="http://schemas.microsoft.com/office/word/2010/wordprocessingShape" mc:Ignorable="w14 w15 w16se w16cid w16 w16cex w16sdtdh wp14">
+<w:numbering xmlns:wpc="http://schemas.microsoft.com/office/word/2010/wordprocessingCanvas" xmlns:cx="http://schemas.microsoft.com/office/drawing/2014/chartex" xmlns:cx1="http://schemas.microsoft.com/office/drawing/2015/9/8/chartex" xmlns:cx2="http://schemas.microsoft.com/office/drawing/2015/10/21/chartex" xmlns:cx3="http://schemas.microsoft.com/office/drawing/2016/5/9/chartex" xmlns:cx4="http://schemas.microsoft.com/office/drawing/2016/5/10/chartex" xmlns:cx5="http://schemas.microsoft.com/office/drawing/2016/5/11/chartex" xmlns:cx6="http://schemas.microsoft.com/office/drawing/2016/5/12/chartex" xmlns:cx7="http://schemas.microsoft.com/office/drawing/2016/5/13/chartex" xmlns:cx8="http://schemas.microsoft.com/office/drawing/2016/5/14/chartex" xmlns:mc="http://schemas.openxmlformats.org/markup-compatibility/2006" xmlns:aink="http://schemas.microsoft.com/office/drawing/2016/ink" xmlns:am3d="http://schemas.microsoft.com/office/drawing/2017/model3d" xmlns:o="urn:schemas-microsoft-com:office:office" xmlns:r="http://schemas.openxmlformats.org/officeDocument/2006/relationships" xmlns:m="http://schemas.openxmlformats.org/officeDocument/2006/math" xmlns:v="urn:schemas-microsoft-com:vml" xmlns:wp14="http://schemas.microsoft.com/office/word/2010/wordprocessingDrawing" xmlns:wp="http://schemas.openxmlformats.org/drawingml/2006/wordprocessingDrawing" xmlns:w10="urn:schemas-microsoft-com:office:word" xmlns:w="http://schemas.openxmlformats.org/wordprocessingml/2006/main" xmlns:w14="http://schemas.microsoft.com/office/word/2010/wordml" xmlns:w15="http://schemas.microsoft.com/office/word/2012/wordml" xmlns:w16cex="http://schemas.microsoft.com/office/word/2018/wordml/cex" xmlns:w16cid="http://schemas.microsoft.com/office/word/2016/wordml/cid" xmlns:w16="http://schemas.microsoft.com/office/word/2018/wordml" xmlns:w16se="http://schemas.microsoft.com/office/word/2015/wordml/symex" xmlns:wpg="http://schemas.microsoft.com/office/word/2010/wordprocessingGroup" xmlns:wpi="http://schemas.microsoft.com/office/word/2010/wordprocessingInk" xmlns:wne="http://schemas.microsoft.com/office/word/2006/wordml" xmlns:wps="http://schemas.microsoft.com/office/word/2010/wordprocessingShape" mc:Ignorable="w14 w15 w16se w16cid w16 w16cex wp14">
   <w:abstractNum w:abstractNumId="0" w15:restartNumberingAfterBreak="0">
     <w:nsid w:val="2B116941"/>
     <w:multiLevelType w:val="multilevel"/>
@@ -7406,20 +8070,20 @@
       </w:pPr>
     </w:lvl>
   </w:abstractNum>
-  <w:num w:numId="1" w16cid:durableId="885600740">
+  <w:num w:numId="1">
     <w:abstractNumId w:val="0"/>
   </w:num>
-  <w:num w:numId="2" w16cid:durableId="2109504501">
+  <w:num w:numId="2">
     <w:abstractNumId w:val="2"/>
   </w:num>
-  <w:num w:numId="3" w16cid:durableId="1492679125">
+  <w:num w:numId="3">
     <w:abstractNumId w:val="1"/>
   </w:num>
 </w:numbering>
 </file>
 
 <file path=word/styles.xml><?xml version="1.0" encoding="utf-8"?>
-<w:styles xmlns:mc="http://schemas.openxmlformats.org/markup-compatibility/2006" xmlns:r="http://schemas.openxmlformats.org/officeDocument/2006/relationships" xmlns:w="http://schemas.openxmlformats.org/wordprocessingml/2006/main" xmlns:w14="http://schemas.microsoft.com/office/word/2010/wordml" xmlns:w15="http://schemas.microsoft.com/office/word/2012/wordml" xmlns:w16cex="http://schemas.microsoft.com/office/word/2018/wordml/cex" xmlns:w16cid="http://schemas.microsoft.com/office/word/2016/wordml/cid" xmlns:w16="http://schemas.microsoft.com/office/word/2018/wordml" xmlns:w16sdtdh="http://schemas.microsoft.com/office/word/2020/wordml/sdtdatahash" xmlns:w16se="http://schemas.microsoft.com/office/word/2015/wordml/symex" mc:Ignorable="w14 w15 w16se w16cid w16 w16cex w16sdtdh">
+<w:styles xmlns:mc="http://schemas.openxmlformats.org/markup-compatibility/2006" xmlns:r="http://schemas.openxmlformats.org/officeDocument/2006/relationships" xmlns:w="http://schemas.openxmlformats.org/wordprocessingml/2006/main" xmlns:w14="http://schemas.microsoft.com/office/word/2010/wordml" xmlns:w15="http://schemas.microsoft.com/office/word/2012/wordml" xmlns:w16cex="http://schemas.microsoft.com/office/word/2018/wordml/cex" xmlns:w16cid="http://schemas.microsoft.com/office/word/2016/wordml/cid" xmlns:w16="http://schemas.microsoft.com/office/word/2018/wordml" xmlns:w16se="http://schemas.microsoft.com/office/word/2015/wordml/symex" mc:Ignorable="w14 w15 w16se w16cid w16 w16cex">
   <w:docDefaults>
     <w:rPrDefault>
       <w:rPr>
@@ -7816,6 +8480,7 @@
   <w:style w:type="paragraph" w:default="1" w:styleId="Normal">
     <w:name w:val="Normal"/>
     <w:qFormat/>
+    <w:rsid w:val="00013E70"/>
   </w:style>
   <w:style w:type="paragraph" w:styleId="Ttulo1">
     <w:name w:val="heading 1"/>

</xml_diff>